<commit_message>
Changed the freshmart dashboard based on brd
</commit_message>
<xml_diff>
--- a/SQL/Project/HealthPlus_Care/Health Plus documentation.docx
+++ b/SQL/Project/HealthPlus_Care/Health Plus documentation.docx
@@ -586,6 +586,9 @@
     </w:p>
     <w:p>
       <w:r>
+        <w:rPr>
+          <w:noProof/>
+        </w:rPr>
         <w:drawing>
           <wp:inline distT="0" distB="0" distL="0" distR="0" wp14:anchorId="7D97BAC3" wp14:editId="40E4B790">
             <wp:extent cx="2257740" cy="1247949"/>
@@ -602,7 +605,7 @@
                     <pic:cNvPicPr/>
                   </pic:nvPicPr>
                   <pic:blipFill>
-                    <a:blip r:embed="rId4"/>
+                    <a:blip r:embed="rId5"/>
                     <a:stretch>
                       <a:fillRect/>
                     </a:stretch>
@@ -676,6 +679,9 @@
     </w:p>
     <w:p>
       <w:r>
+        <w:rPr>
+          <w:noProof/>
+        </w:rPr>
         <w:drawing>
           <wp:inline distT="0" distB="0" distL="0" distR="0" wp14:anchorId="28F50815" wp14:editId="5B43CB12">
             <wp:extent cx="1771897" cy="1495634"/>
@@ -692,7 +698,7 @@
                     <pic:cNvPicPr/>
                   </pic:nvPicPr>
                   <pic:blipFill>
-                    <a:blip r:embed="rId5"/>
+                    <a:blip r:embed="rId6"/>
                     <a:stretch>
                       <a:fillRect/>
                     </a:stretch>
@@ -883,6 +889,9 @@
     </w:p>
     <w:p>
       <w:r>
+        <w:rPr>
+          <w:noProof/>
+        </w:rPr>
         <w:lastRenderedPageBreak/>
         <w:drawing>
           <wp:inline distT="0" distB="0" distL="0" distR="0" wp14:anchorId="5C98CDDB" wp14:editId="6D1E2691">
@@ -900,7 +909,7 @@
                     <pic:cNvPicPr/>
                   </pic:nvPicPr>
                   <pic:blipFill>
-                    <a:blip r:embed="rId6"/>
+                    <a:blip r:embed="rId7"/>
                     <a:stretch>
                       <a:fillRect/>
                     </a:stretch>
@@ -928,19 +937,1364 @@
           <w:b/>
           <w:bCs/>
         </w:rPr>
-        <w:t>4. How many specialists are there?</w:t>
+        <w:t>6. What is the highest and lowest billing amount?</w:t>
       </w:r>
     </w:p>
     <w:p>
       <w:r>
         <w:t xml:space="preserve">SELECT </w:t>
       </w:r>
+    </w:p>
+    <w:p>
+      <w:r>
+        <w:t xml:space="preserve">    </w:t>
+      </w:r>
       <w:proofErr w:type="gramStart"/>
       <w:r>
+        <w:t>MAX(</w:t>
+      </w:r>
+      <w:proofErr w:type="spellStart"/>
+      <w:proofErr w:type="gramEnd"/>
+      <w:r>
+        <w:t>total_amount</w:t>
+      </w:r>
+      <w:proofErr w:type="spellEnd"/>
+      <w:r>
+        <w:t xml:space="preserve">) AS </w:t>
+      </w:r>
+      <w:proofErr w:type="spellStart"/>
+      <w:r>
+        <w:t>Highest_Bill</w:t>
+      </w:r>
+      <w:proofErr w:type="spellEnd"/>
+      <w:r>
+        <w:t>,</w:t>
+      </w:r>
+    </w:p>
+    <w:p>
+      <w:r>
+        <w:t xml:space="preserve">    </w:t>
+      </w:r>
+      <w:proofErr w:type="gramStart"/>
+      <w:r>
+        <w:t>MIN(</w:t>
+      </w:r>
+      <w:proofErr w:type="spellStart"/>
+      <w:proofErr w:type="gramEnd"/>
+      <w:r>
+        <w:t>total_amount</w:t>
+      </w:r>
+      <w:proofErr w:type="spellEnd"/>
+      <w:r>
+        <w:t xml:space="preserve">) AS </w:t>
+      </w:r>
+      <w:proofErr w:type="spellStart"/>
+      <w:r>
+        <w:t>Lowest_Bill</w:t>
+      </w:r>
+      <w:proofErr w:type="spellEnd"/>
+    </w:p>
+    <w:p>
+      <w:r>
+        <w:t>FROM Billing;</w:t>
+      </w:r>
+    </w:p>
+    <w:p>
+      <w:r>
+        <w:rPr>
+          <w:noProof/>
+        </w:rPr>
+        <w:drawing>
+          <wp:inline distT="0" distB="0" distL="0" distR="0" wp14:anchorId="5560F137" wp14:editId="0312BDED">
+            <wp:extent cx="1609950" cy="495369"/>
+            <wp:effectExtent l="0" t="0" r="9525" b="0"/>
+            <wp:docPr id="599362883" name="Picture 1"/>
+            <wp:cNvGraphicFramePr>
+              <a:graphicFrameLocks xmlns:a="http://schemas.openxmlformats.org/drawingml/2006/main" noChangeAspect="1"/>
+            </wp:cNvGraphicFramePr>
+            <a:graphic xmlns:a="http://schemas.openxmlformats.org/drawingml/2006/main">
+              <a:graphicData uri="http://schemas.openxmlformats.org/drawingml/2006/picture">
+                <pic:pic xmlns:pic="http://schemas.openxmlformats.org/drawingml/2006/picture">
+                  <pic:nvPicPr>
+                    <pic:cNvPr id="599362883" name=""/>
+                    <pic:cNvPicPr/>
+                  </pic:nvPicPr>
+                  <pic:blipFill>
+                    <a:blip r:embed="rId8"/>
+                    <a:stretch>
+                      <a:fillRect/>
+                    </a:stretch>
+                  </pic:blipFill>
+                  <pic:spPr>
+                    <a:xfrm>
+                      <a:off x="0" y="0"/>
+                      <a:ext cx="1609950" cy="495369"/>
+                    </a:xfrm>
+                    <a:prstGeom prst="rect">
+                      <a:avLst/>
+                    </a:prstGeom>
+                  </pic:spPr>
+                </pic:pic>
+              </a:graphicData>
+            </a:graphic>
+          </wp:inline>
+        </w:drawing>
+      </w:r>
+    </w:p>
+    <w:p/>
+    <w:p>
+      <w:r>
+        <w:rPr>
+          <w:b/>
+          <w:bCs/>
+        </w:rPr>
+        <w:t>7. How many members are there in each membership type?</w:t>
+      </w:r>
+    </w:p>
+    <w:p>
+      <w:r>
+        <w:t xml:space="preserve">SELECT </w:t>
+      </w:r>
+      <w:proofErr w:type="spellStart"/>
+      <w:r>
+        <w:t>membership_type</w:t>
+      </w:r>
+      <w:proofErr w:type="spellEnd"/>
+      <w:r>
+        <w:t xml:space="preserve">, </w:t>
+      </w:r>
+      <w:proofErr w:type="gramStart"/>
+      <w:r>
         <w:t>COUNT(</w:t>
       </w:r>
+      <w:proofErr w:type="spellStart"/>
       <w:proofErr w:type="gramEnd"/>
       <w:r>
+        <w:t>member_id</w:t>
+      </w:r>
+      <w:proofErr w:type="spellEnd"/>
+      <w:r>
+        <w:t xml:space="preserve">) AS </w:t>
+      </w:r>
+      <w:proofErr w:type="spellStart"/>
+      <w:r>
+        <w:t>Total_Members</w:t>
+      </w:r>
+      <w:proofErr w:type="spellEnd"/>
+    </w:p>
+    <w:p>
+      <w:r>
+        <w:t>FROM Members</w:t>
+      </w:r>
+    </w:p>
+    <w:p>
+      <w:r>
+        <w:t xml:space="preserve">GROUP BY </w:t>
+      </w:r>
+      <w:proofErr w:type="spellStart"/>
+      <w:r>
+        <w:t>membership_type</w:t>
+      </w:r>
+      <w:proofErr w:type="spellEnd"/>
+      <w:r>
+        <w:t>;</w:t>
+      </w:r>
+    </w:p>
+    <w:p/>
+    <w:p>
+      <w:r>
+        <w:rPr>
+          <w:noProof/>
+        </w:rPr>
+        <w:drawing>
+          <wp:inline distT="0" distB="0" distL="0" distR="0" wp14:anchorId="16234E03" wp14:editId="63747632">
+            <wp:extent cx="2143424" cy="733527"/>
+            <wp:effectExtent l="0" t="0" r="9525" b="9525"/>
+            <wp:docPr id="576495716" name="Picture 1"/>
+            <wp:cNvGraphicFramePr>
+              <a:graphicFrameLocks xmlns:a="http://schemas.openxmlformats.org/drawingml/2006/main" noChangeAspect="1"/>
+            </wp:cNvGraphicFramePr>
+            <a:graphic xmlns:a="http://schemas.openxmlformats.org/drawingml/2006/main">
+              <a:graphicData uri="http://schemas.openxmlformats.org/drawingml/2006/picture">
+                <pic:pic xmlns:pic="http://schemas.openxmlformats.org/drawingml/2006/picture">
+                  <pic:nvPicPr>
+                    <pic:cNvPr id="576495716" name=""/>
+                    <pic:cNvPicPr/>
+                  </pic:nvPicPr>
+                  <pic:blipFill>
+                    <a:blip r:embed="rId9"/>
+                    <a:stretch>
+                      <a:fillRect/>
+                    </a:stretch>
+                  </pic:blipFill>
+                  <pic:spPr>
+                    <a:xfrm>
+                      <a:off x="0" y="0"/>
+                      <a:ext cx="2143424" cy="733527"/>
+                    </a:xfrm>
+                    <a:prstGeom prst="rect">
+                      <a:avLst/>
+                    </a:prstGeom>
+                  </pic:spPr>
+                </pic:pic>
+              </a:graphicData>
+            </a:graphic>
+          </wp:inline>
+        </w:drawing>
+      </w:r>
+    </w:p>
+    <w:p/>
+    <w:p>
+      <w:r>
+        <w:rPr>
+          <w:b/>
+          <w:bCs/>
+        </w:rPr>
+        <w:t>8. How many consultations are there for each consultation mode?</w:t>
+      </w:r>
+    </w:p>
+    <w:p>
+      <w:r>
+        <w:t xml:space="preserve">SELECT </w:t>
+      </w:r>
+      <w:proofErr w:type="spellStart"/>
+      <w:r>
+        <w:t>consultation_mode</w:t>
+      </w:r>
+      <w:proofErr w:type="spellEnd"/>
+      <w:r>
+        <w:t xml:space="preserve">, </w:t>
+      </w:r>
+      <w:proofErr w:type="gramStart"/>
+      <w:r>
+        <w:t>COUNT(</w:t>
+      </w:r>
+      <w:proofErr w:type="spellStart"/>
+      <w:proofErr w:type="gramEnd"/>
+      <w:r>
+        <w:t>consultation_id</w:t>
+      </w:r>
+      <w:proofErr w:type="spellEnd"/>
+      <w:r>
+        <w:t xml:space="preserve">) AS </w:t>
+      </w:r>
+      <w:proofErr w:type="spellStart"/>
+      <w:r>
+        <w:t>Total_Consultations</w:t>
+      </w:r>
+      <w:proofErr w:type="spellEnd"/>
+    </w:p>
+    <w:p>
+      <w:r>
+        <w:t>FROM Consultations</w:t>
+      </w:r>
+    </w:p>
+    <w:p>
+      <w:r>
+        <w:t xml:space="preserve">GROUP BY </w:t>
+      </w:r>
+      <w:proofErr w:type="spellStart"/>
+      <w:r>
+        <w:t>consultation_mode</w:t>
+      </w:r>
+      <w:proofErr w:type="spellEnd"/>
+      <w:r>
+        <w:t>;</w:t>
+      </w:r>
+    </w:p>
+    <w:p>
+      <w:r>
+        <w:rPr>
+          <w:noProof/>
+        </w:rPr>
+        <w:drawing>
+          <wp:inline distT="0" distB="0" distL="0" distR="0" wp14:anchorId="53AFB860" wp14:editId="17412FC4">
+            <wp:extent cx="2381582" cy="619211"/>
+            <wp:effectExtent l="0" t="0" r="0" b="9525"/>
+            <wp:docPr id="27742824" name="Picture 1"/>
+            <wp:cNvGraphicFramePr>
+              <a:graphicFrameLocks xmlns:a="http://schemas.openxmlformats.org/drawingml/2006/main" noChangeAspect="1"/>
+            </wp:cNvGraphicFramePr>
+            <a:graphic xmlns:a="http://schemas.openxmlformats.org/drawingml/2006/main">
+              <a:graphicData uri="http://schemas.openxmlformats.org/drawingml/2006/picture">
+                <pic:pic xmlns:pic="http://schemas.openxmlformats.org/drawingml/2006/picture">
+                  <pic:nvPicPr>
+                    <pic:cNvPr id="27742824" name=""/>
+                    <pic:cNvPicPr/>
+                  </pic:nvPicPr>
+                  <pic:blipFill>
+                    <a:blip r:embed="rId10"/>
+                    <a:stretch>
+                      <a:fillRect/>
+                    </a:stretch>
+                  </pic:blipFill>
+                  <pic:spPr>
+                    <a:xfrm>
+                      <a:off x="0" y="0"/>
+                      <a:ext cx="2381582" cy="619211"/>
+                    </a:xfrm>
+                    <a:prstGeom prst="rect">
+                      <a:avLst/>
+                    </a:prstGeom>
+                  </pic:spPr>
+                </pic:pic>
+              </a:graphicData>
+            </a:graphic>
+          </wp:inline>
+        </w:drawing>
+      </w:r>
+    </w:p>
+    <w:p/>
+    <w:p>
+      <w:r>
+        <w:rPr>
+          <w:b/>
+          <w:bCs/>
+        </w:rPr>
+        <w:t>9. How many consultations are there for each consultation status?</w:t>
+      </w:r>
+    </w:p>
+    <w:p>
+      <w:r>
+        <w:lastRenderedPageBreak/>
+        <w:t xml:space="preserve">SELECT status, </w:t>
+      </w:r>
+      <w:proofErr w:type="gramStart"/>
+      <w:r>
+        <w:t>COUNT(</w:t>
+      </w:r>
+      <w:proofErr w:type="spellStart"/>
+      <w:proofErr w:type="gramEnd"/>
+      <w:r>
+        <w:t>consultation_id</w:t>
+      </w:r>
+      <w:proofErr w:type="spellEnd"/>
+      <w:r>
+        <w:t xml:space="preserve">) AS </w:t>
+      </w:r>
+      <w:proofErr w:type="spellStart"/>
+      <w:r>
+        <w:t>Total_Consultations</w:t>
+      </w:r>
+      <w:proofErr w:type="spellEnd"/>
+    </w:p>
+    <w:p>
+      <w:r>
+        <w:t>FROM Consultations</w:t>
+      </w:r>
+    </w:p>
+    <w:p>
+      <w:r>
+        <w:t>GROUP BY status;</w:t>
+      </w:r>
+    </w:p>
+    <w:p>
+      <w:r>
+        <w:rPr>
+          <w:noProof/>
+        </w:rPr>
+        <w:drawing>
+          <wp:inline distT="0" distB="0" distL="0" distR="0" wp14:anchorId="078BE832" wp14:editId="1D5785A1">
+            <wp:extent cx="2029108" cy="933580"/>
+            <wp:effectExtent l="0" t="0" r="9525" b="0"/>
+            <wp:docPr id="2131567757" name="Picture 1"/>
+            <wp:cNvGraphicFramePr>
+              <a:graphicFrameLocks xmlns:a="http://schemas.openxmlformats.org/drawingml/2006/main" noChangeAspect="1"/>
+            </wp:cNvGraphicFramePr>
+            <a:graphic xmlns:a="http://schemas.openxmlformats.org/drawingml/2006/main">
+              <a:graphicData uri="http://schemas.openxmlformats.org/drawingml/2006/picture">
+                <pic:pic xmlns:pic="http://schemas.openxmlformats.org/drawingml/2006/picture">
+                  <pic:nvPicPr>
+                    <pic:cNvPr id="2131567757" name=""/>
+                    <pic:cNvPicPr/>
+                  </pic:nvPicPr>
+                  <pic:blipFill>
+                    <a:blip r:embed="rId11"/>
+                    <a:stretch>
+                      <a:fillRect/>
+                    </a:stretch>
+                  </pic:blipFill>
+                  <pic:spPr>
+                    <a:xfrm>
+                      <a:off x="0" y="0"/>
+                      <a:ext cx="2029108" cy="933580"/>
+                    </a:xfrm>
+                    <a:prstGeom prst="rect">
+                      <a:avLst/>
+                    </a:prstGeom>
+                  </pic:spPr>
+                </pic:pic>
+              </a:graphicData>
+            </a:graphic>
+          </wp:inline>
+        </w:drawing>
+      </w:r>
+    </w:p>
+    <w:p/>
+    <w:p>
+      <w:r>
+        <w:rPr>
+          <w:b/>
+          <w:bCs/>
+        </w:rPr>
+        <w:t>10. Which specializations have more than 100 consultations?</w:t>
+      </w:r>
+    </w:p>
+    <w:p>
+      <w:r>
+        <w:t xml:space="preserve">SELECT </w:t>
+      </w:r>
+      <w:proofErr w:type="spellStart"/>
+      <w:proofErr w:type="gramStart"/>
+      <w:r>
+        <w:t>s.specialization</w:t>
+      </w:r>
+      <w:proofErr w:type="spellEnd"/>
+      <w:proofErr w:type="gramEnd"/>
+      <w:r>
+        <w:t>, COUNT(</w:t>
+      </w:r>
+      <w:proofErr w:type="spellStart"/>
+      <w:proofErr w:type="gramStart"/>
+      <w:r>
+        <w:t>c.consultation</w:t>
+      </w:r>
+      <w:proofErr w:type="gramEnd"/>
+      <w:r>
+        <w:t>_id</w:t>
+      </w:r>
+      <w:proofErr w:type="spellEnd"/>
+      <w:r>
+        <w:t xml:space="preserve">) AS </w:t>
+      </w:r>
+      <w:proofErr w:type="spellStart"/>
+      <w:r>
+        <w:t>Total_Consultations</w:t>
+      </w:r>
+      <w:proofErr w:type="spellEnd"/>
+    </w:p>
+    <w:p>
+      <w:r>
+        <w:t>FROM Specialists s</w:t>
+      </w:r>
+    </w:p>
+    <w:p>
+      <w:r>
+        <w:t>INNER JOIN Consultations c</w:t>
+      </w:r>
+    </w:p>
+    <w:p>
+      <w:r>
+        <w:t xml:space="preserve">    ON </w:t>
+      </w:r>
+      <w:proofErr w:type="spellStart"/>
+      <w:proofErr w:type="gramStart"/>
+      <w:r>
+        <w:t>s.specialist</w:t>
+      </w:r>
+      <w:proofErr w:type="gramEnd"/>
+      <w:r>
+        <w:t>_id</w:t>
+      </w:r>
+      <w:proofErr w:type="spellEnd"/>
+      <w:r>
+        <w:t xml:space="preserve"> = </w:t>
+      </w:r>
+      <w:proofErr w:type="spellStart"/>
+      <w:proofErr w:type="gramStart"/>
+      <w:r>
+        <w:t>c.specialist</w:t>
+      </w:r>
+      <w:proofErr w:type="gramEnd"/>
+      <w:r>
+        <w:t>_id</w:t>
+      </w:r>
+      <w:proofErr w:type="spellEnd"/>
+    </w:p>
+    <w:p>
+      <w:r>
+        <w:t xml:space="preserve">GROUP BY </w:t>
+      </w:r>
+      <w:proofErr w:type="spellStart"/>
+      <w:proofErr w:type="gramStart"/>
+      <w:r>
+        <w:t>s.specialization</w:t>
+      </w:r>
+      <w:proofErr w:type="spellEnd"/>
+      <w:proofErr w:type="gramEnd"/>
+    </w:p>
+    <w:p>
+      <w:r>
+        <w:t>HAVING COUNT(</w:t>
+      </w:r>
+      <w:proofErr w:type="spellStart"/>
+      <w:proofErr w:type="gramStart"/>
+      <w:r>
+        <w:t>c.consultation</w:t>
+      </w:r>
+      <w:proofErr w:type="gramEnd"/>
+      <w:r>
+        <w:t>_id</w:t>
+      </w:r>
+      <w:proofErr w:type="spellEnd"/>
+      <w:r>
+        <w:t>) &gt; 100</w:t>
+      </w:r>
+    </w:p>
+    <w:p>
+      <w:r>
+        <w:t xml:space="preserve">ORDER BY </w:t>
+      </w:r>
+      <w:proofErr w:type="spellStart"/>
+      <w:r>
+        <w:t>Total_Consultations</w:t>
+      </w:r>
+      <w:proofErr w:type="spellEnd"/>
+      <w:r>
+        <w:t xml:space="preserve"> DESC;</w:t>
+      </w:r>
+    </w:p>
+    <w:p>
+      <w:r>
+        <w:rPr>
+          <w:noProof/>
+        </w:rPr>
+        <w:drawing>
+          <wp:inline distT="0" distB="0" distL="0" distR="0" wp14:anchorId="7250FD0F" wp14:editId="28092030">
+            <wp:extent cx="2229161" cy="1524213"/>
+            <wp:effectExtent l="0" t="0" r="0" b="0"/>
+            <wp:docPr id="1165023968" name="Picture 1"/>
+            <wp:cNvGraphicFramePr>
+              <a:graphicFrameLocks xmlns:a="http://schemas.openxmlformats.org/drawingml/2006/main" noChangeAspect="1"/>
+            </wp:cNvGraphicFramePr>
+            <a:graphic xmlns:a="http://schemas.openxmlformats.org/drawingml/2006/main">
+              <a:graphicData uri="http://schemas.openxmlformats.org/drawingml/2006/picture">
+                <pic:pic xmlns:pic="http://schemas.openxmlformats.org/drawingml/2006/picture">
+                  <pic:nvPicPr>
+                    <pic:cNvPr id="1165023968" name=""/>
+                    <pic:cNvPicPr/>
+                  </pic:nvPicPr>
+                  <pic:blipFill>
+                    <a:blip r:embed="rId12"/>
+                    <a:stretch>
+                      <a:fillRect/>
+                    </a:stretch>
+                  </pic:blipFill>
+                  <pic:spPr>
+                    <a:xfrm>
+                      <a:off x="0" y="0"/>
+                      <a:ext cx="2229161" cy="1524213"/>
+                    </a:xfrm>
+                    <a:prstGeom prst="rect">
+                      <a:avLst/>
+                    </a:prstGeom>
+                  </pic:spPr>
+                </pic:pic>
+              </a:graphicData>
+            </a:graphic>
+          </wp:inline>
+        </w:drawing>
+      </w:r>
+    </w:p>
+    <w:p/>
+    <w:p>
+      <w:r>
+        <w:rPr>
+          <w:b/>
+          <w:bCs/>
+        </w:rPr>
+        <w:t>11. Which are the top 5 clinics based on the number of consultations?</w:t>
+      </w:r>
+    </w:p>
+    <w:p>
+      <w:r>
+        <w:t xml:space="preserve">SELECT </w:t>
+      </w:r>
+      <w:proofErr w:type="spellStart"/>
+      <w:proofErr w:type="gramStart"/>
+      <w:r>
+        <w:t>cl.clinic</w:t>
+      </w:r>
+      <w:proofErr w:type="gramEnd"/>
+      <w:r>
+        <w:t>_name</w:t>
+      </w:r>
+      <w:proofErr w:type="spellEnd"/>
+      <w:r>
+        <w:t>, COUNT(</w:t>
+      </w:r>
+      <w:proofErr w:type="spellStart"/>
+      <w:proofErr w:type="gramStart"/>
+      <w:r>
+        <w:t>c.consultation</w:t>
+      </w:r>
+      <w:proofErr w:type="gramEnd"/>
+      <w:r>
+        <w:t>_id</w:t>
+      </w:r>
+      <w:proofErr w:type="spellEnd"/>
+      <w:r>
+        <w:t xml:space="preserve">) AS </w:t>
+      </w:r>
+      <w:proofErr w:type="spellStart"/>
+      <w:r>
+        <w:t>Total_Consultations</w:t>
+      </w:r>
+      <w:proofErr w:type="spellEnd"/>
+    </w:p>
+    <w:p>
+      <w:r>
+        <w:t>FROM Clinics cl</w:t>
+      </w:r>
+    </w:p>
+    <w:p>
+      <w:r>
+        <w:t xml:space="preserve">INNER JOIN Consultations c </w:t>
+      </w:r>
+    </w:p>
+    <w:p>
+      <w:r>
+        <w:t xml:space="preserve">    ON </w:t>
+      </w:r>
+      <w:proofErr w:type="spellStart"/>
+      <w:proofErr w:type="gramStart"/>
+      <w:r>
+        <w:t>cl.clinic</w:t>
+      </w:r>
+      <w:proofErr w:type="gramEnd"/>
+      <w:r>
+        <w:t>_id</w:t>
+      </w:r>
+      <w:proofErr w:type="spellEnd"/>
+      <w:r>
+        <w:t xml:space="preserve"> = </w:t>
+      </w:r>
+      <w:proofErr w:type="spellStart"/>
+      <w:proofErr w:type="gramStart"/>
+      <w:r>
+        <w:t>c.clinic</w:t>
+      </w:r>
+      <w:proofErr w:type="gramEnd"/>
+      <w:r>
+        <w:t>_id</w:t>
+      </w:r>
+      <w:proofErr w:type="spellEnd"/>
+    </w:p>
+    <w:p>
+      <w:r>
+        <w:t xml:space="preserve">GROUP BY </w:t>
+      </w:r>
+      <w:proofErr w:type="spellStart"/>
+      <w:proofErr w:type="gramStart"/>
+      <w:r>
+        <w:t>cl.clinic</w:t>
+      </w:r>
+      <w:proofErr w:type="gramEnd"/>
+      <w:r>
+        <w:t>_name</w:t>
+      </w:r>
+      <w:proofErr w:type="spellEnd"/>
+    </w:p>
+    <w:p>
+      <w:r>
+        <w:lastRenderedPageBreak/>
+        <w:t xml:space="preserve">ORDER BY </w:t>
+      </w:r>
+      <w:proofErr w:type="spellStart"/>
+      <w:r>
+        <w:t>Total_Consultations</w:t>
+      </w:r>
+      <w:proofErr w:type="spellEnd"/>
+      <w:r>
+        <w:t xml:space="preserve"> DESC</w:t>
+      </w:r>
+    </w:p>
+    <w:p>
+      <w:r>
+        <w:t>LIMIT 5;</w:t>
+      </w:r>
+    </w:p>
+    <w:p>
+      <w:r>
+        <w:rPr>
+          <w:noProof/>
+        </w:rPr>
+        <w:drawing>
+          <wp:inline distT="0" distB="0" distL="0" distR="0" wp14:anchorId="16D9BB4D" wp14:editId="39F344F3">
+            <wp:extent cx="3724795" cy="1076475"/>
+            <wp:effectExtent l="0" t="0" r="9525" b="9525"/>
+            <wp:docPr id="1824371586" name="Picture 1"/>
+            <wp:cNvGraphicFramePr>
+              <a:graphicFrameLocks xmlns:a="http://schemas.openxmlformats.org/drawingml/2006/main" noChangeAspect="1"/>
+            </wp:cNvGraphicFramePr>
+            <a:graphic xmlns:a="http://schemas.openxmlformats.org/drawingml/2006/main">
+              <a:graphicData uri="http://schemas.openxmlformats.org/drawingml/2006/picture">
+                <pic:pic xmlns:pic="http://schemas.openxmlformats.org/drawingml/2006/picture">
+                  <pic:nvPicPr>
+                    <pic:cNvPr id="1824371586" name=""/>
+                    <pic:cNvPicPr/>
+                  </pic:nvPicPr>
+                  <pic:blipFill>
+                    <a:blip r:embed="rId13"/>
+                    <a:stretch>
+                      <a:fillRect/>
+                    </a:stretch>
+                  </pic:blipFill>
+                  <pic:spPr>
+                    <a:xfrm>
+                      <a:off x="0" y="0"/>
+                      <a:ext cx="3724795" cy="1076475"/>
+                    </a:xfrm>
+                    <a:prstGeom prst="rect">
+                      <a:avLst/>
+                    </a:prstGeom>
+                  </pic:spPr>
+                </pic:pic>
+              </a:graphicData>
+            </a:graphic>
+          </wp:inline>
+        </w:drawing>
+      </w:r>
+    </w:p>
+    <w:p/>
+    <w:p>
+      <w:r>
+        <w:rPr>
+          <w:b/>
+          <w:bCs/>
+        </w:rPr>
+        <w:t>12. Rank specialists based on consultation fee from highest to lowest.</w:t>
+      </w:r>
+    </w:p>
+    <w:p>
+      <w:r>
+        <w:t xml:space="preserve">SELECT </w:t>
+      </w:r>
+      <w:proofErr w:type="spellStart"/>
+      <w:r>
+        <w:t>first_name</w:t>
+      </w:r>
+      <w:proofErr w:type="spellEnd"/>
+      <w:r>
+        <w:t xml:space="preserve">, </w:t>
+      </w:r>
+      <w:proofErr w:type="spellStart"/>
+      <w:r>
+        <w:t>last_name</w:t>
+      </w:r>
+      <w:proofErr w:type="spellEnd"/>
+      <w:r>
+        <w:t xml:space="preserve">, specialization, </w:t>
+      </w:r>
+      <w:proofErr w:type="spellStart"/>
+      <w:r>
+        <w:t>consultation_fee</w:t>
+      </w:r>
+      <w:proofErr w:type="spellEnd"/>
+      <w:r>
+        <w:t>,</w:t>
+      </w:r>
+    </w:p>
+    <w:p>
+      <w:r>
+        <w:t xml:space="preserve">       ROW_</w:t>
+      </w:r>
+      <w:proofErr w:type="gramStart"/>
+      <w:r>
+        <w:t>NUMBER(</w:t>
+      </w:r>
+      <w:proofErr w:type="gramEnd"/>
+      <w:r>
+        <w:t>) OVER (</w:t>
+      </w:r>
+    </w:p>
+    <w:p>
+      <w:r>
+        <w:t xml:space="preserve">           ORDER BY </w:t>
+      </w:r>
+      <w:proofErr w:type="spellStart"/>
+      <w:r>
+        <w:t>consultation_fee</w:t>
+      </w:r>
+      <w:proofErr w:type="spellEnd"/>
+      <w:r>
+        <w:t xml:space="preserve"> DESC</w:t>
+      </w:r>
+    </w:p>
+    <w:p>
+      <w:r>
+        <w:t xml:space="preserve">       ) AS </w:t>
+      </w:r>
+      <w:proofErr w:type="spellStart"/>
+      <w:r>
+        <w:t>rnk</w:t>
+      </w:r>
+      <w:proofErr w:type="spellEnd"/>
+    </w:p>
+    <w:p>
+      <w:r>
+        <w:t>FROM Specialists;</w:t>
+      </w:r>
+    </w:p>
+    <w:p>
+      <w:r>
+        <w:rPr>
+          <w:noProof/>
+        </w:rPr>
+        <w:drawing>
+          <wp:inline distT="0" distB="0" distL="0" distR="0" wp14:anchorId="79066582" wp14:editId="05711A00">
+            <wp:extent cx="3848637" cy="1600423"/>
+            <wp:effectExtent l="0" t="0" r="0" b="0"/>
+            <wp:docPr id="472014944" name="Picture 1"/>
+            <wp:cNvGraphicFramePr>
+              <a:graphicFrameLocks xmlns:a="http://schemas.openxmlformats.org/drawingml/2006/main" noChangeAspect="1"/>
+            </wp:cNvGraphicFramePr>
+            <a:graphic xmlns:a="http://schemas.openxmlformats.org/drawingml/2006/main">
+              <a:graphicData uri="http://schemas.openxmlformats.org/drawingml/2006/picture">
+                <pic:pic xmlns:pic="http://schemas.openxmlformats.org/drawingml/2006/picture">
+                  <pic:nvPicPr>
+                    <pic:cNvPr id="472014944" name=""/>
+                    <pic:cNvPicPr/>
+                  </pic:nvPicPr>
+                  <pic:blipFill>
+                    <a:blip r:embed="rId14"/>
+                    <a:stretch>
+                      <a:fillRect/>
+                    </a:stretch>
+                  </pic:blipFill>
+                  <pic:spPr>
+                    <a:xfrm>
+                      <a:off x="0" y="0"/>
+                      <a:ext cx="3848637" cy="1600423"/>
+                    </a:xfrm>
+                    <a:prstGeom prst="rect">
+                      <a:avLst/>
+                    </a:prstGeom>
+                  </pic:spPr>
+                </pic:pic>
+              </a:graphicData>
+            </a:graphic>
+          </wp:inline>
+        </w:drawing>
+      </w:r>
+    </w:p>
+    <w:p/>
+    <w:p>
+      <w:r>
+        <w:rPr>
+          <w:b/>
+          <w:bCs/>
+        </w:rPr>
+        <w:t>13. Rank specialists based on consultation fee within each specialization.</w:t>
+      </w:r>
+    </w:p>
+    <w:p>
+      <w:r>
+        <w:t xml:space="preserve">SELECT </w:t>
+      </w:r>
+      <w:proofErr w:type="spellStart"/>
+      <w:r>
+        <w:t>first_name</w:t>
+      </w:r>
+      <w:proofErr w:type="spellEnd"/>
+      <w:r>
+        <w:t xml:space="preserve">, </w:t>
+      </w:r>
+      <w:proofErr w:type="spellStart"/>
+      <w:r>
+        <w:t>last_name</w:t>
+      </w:r>
+      <w:proofErr w:type="spellEnd"/>
+      <w:r>
+        <w:t xml:space="preserve">, specialization, </w:t>
+      </w:r>
+      <w:proofErr w:type="spellStart"/>
+      <w:r>
+        <w:t>consultation_fee</w:t>
+      </w:r>
+      <w:proofErr w:type="spellEnd"/>
+      <w:r>
+        <w:t>,</w:t>
+      </w:r>
+    </w:p>
+    <w:p>
+      <w:r>
+        <w:t xml:space="preserve">       ROW_</w:t>
+      </w:r>
+      <w:proofErr w:type="gramStart"/>
+      <w:r>
+        <w:t>NUMBER(</w:t>
+      </w:r>
+      <w:proofErr w:type="gramEnd"/>
+      <w:r>
+        <w:t>) OVER (</w:t>
+      </w:r>
+    </w:p>
+    <w:p>
+      <w:r>
+        <w:t xml:space="preserve">           PARTITION BY specialization </w:t>
+      </w:r>
+    </w:p>
+    <w:p>
+      <w:r>
+        <w:t xml:space="preserve">           ORDER BY </w:t>
+      </w:r>
+      <w:proofErr w:type="spellStart"/>
+      <w:r>
+        <w:t>consultation_fee</w:t>
+      </w:r>
+      <w:proofErr w:type="spellEnd"/>
+      <w:r>
+        <w:t xml:space="preserve"> DESC</w:t>
+      </w:r>
+    </w:p>
+    <w:p>
+      <w:r>
+        <w:t xml:space="preserve">       ) AS </w:t>
+      </w:r>
+      <w:proofErr w:type="spellStart"/>
+      <w:r>
+        <w:t>rnk</w:t>
+      </w:r>
+      <w:proofErr w:type="spellEnd"/>
+    </w:p>
+    <w:p>
+      <w:r>
+        <w:t>FROM Specialists;</w:t>
+      </w:r>
+    </w:p>
+    <w:p>
+      <w:r>
+        <w:rPr>
+          <w:noProof/>
+        </w:rPr>
+        <w:lastRenderedPageBreak/>
+        <w:drawing>
+          <wp:inline distT="0" distB="0" distL="0" distR="0" wp14:anchorId="15058932" wp14:editId="106CF7B1">
+            <wp:extent cx="3591426" cy="1524213"/>
+            <wp:effectExtent l="0" t="0" r="0" b="0"/>
+            <wp:docPr id="476845003" name="Picture 1"/>
+            <wp:cNvGraphicFramePr>
+              <a:graphicFrameLocks xmlns:a="http://schemas.openxmlformats.org/drawingml/2006/main" noChangeAspect="1"/>
+            </wp:cNvGraphicFramePr>
+            <a:graphic xmlns:a="http://schemas.openxmlformats.org/drawingml/2006/main">
+              <a:graphicData uri="http://schemas.openxmlformats.org/drawingml/2006/picture">
+                <pic:pic xmlns:pic="http://schemas.openxmlformats.org/drawingml/2006/picture">
+                  <pic:nvPicPr>
+                    <pic:cNvPr id="476845003" name=""/>
+                    <pic:cNvPicPr/>
+                  </pic:nvPicPr>
+                  <pic:blipFill>
+                    <a:blip r:embed="rId15"/>
+                    <a:stretch>
+                      <a:fillRect/>
+                    </a:stretch>
+                  </pic:blipFill>
+                  <pic:spPr>
+                    <a:xfrm>
+                      <a:off x="0" y="0"/>
+                      <a:ext cx="3591426" cy="1524213"/>
+                    </a:xfrm>
+                    <a:prstGeom prst="rect">
+                      <a:avLst/>
+                    </a:prstGeom>
+                  </pic:spPr>
+                </pic:pic>
+              </a:graphicData>
+            </a:graphic>
+          </wp:inline>
+        </w:drawing>
+      </w:r>
+    </w:p>
+    <w:p/>
+    <w:p>
+      <w:r>
+        <w:rPr>
+          <w:b/>
+          <w:bCs/>
+        </w:rPr>
+        <w:t>14. Display the previous consultation fee for each specialist.</w:t>
+      </w:r>
+    </w:p>
+    <w:p>
+      <w:r>
+        <w:t xml:space="preserve">SELECT </w:t>
+      </w:r>
+      <w:proofErr w:type="spellStart"/>
+      <w:r>
+        <w:t>first_name</w:t>
+      </w:r>
+      <w:proofErr w:type="spellEnd"/>
+      <w:r>
+        <w:t xml:space="preserve">, </w:t>
+      </w:r>
+      <w:proofErr w:type="spellStart"/>
+      <w:r>
+        <w:t>last_name</w:t>
+      </w:r>
+      <w:proofErr w:type="spellEnd"/>
+      <w:r>
+        <w:t xml:space="preserve">, specialization, </w:t>
+      </w:r>
+      <w:proofErr w:type="spellStart"/>
+      <w:r>
+        <w:t>consultation_fee</w:t>
+      </w:r>
+      <w:proofErr w:type="spellEnd"/>
+      <w:r>
+        <w:t>,</w:t>
+      </w:r>
+    </w:p>
+    <w:p>
+      <w:r>
+        <w:t xml:space="preserve">       </w:t>
+      </w:r>
+      <w:proofErr w:type="gramStart"/>
+      <w:r>
+        <w:t>LAG(</w:t>
+      </w:r>
+      <w:proofErr w:type="spellStart"/>
+      <w:proofErr w:type="gramEnd"/>
+      <w:r>
+        <w:t>consultation_fee</w:t>
+      </w:r>
+      <w:proofErr w:type="spellEnd"/>
+      <w:r>
+        <w:t>) OVER (</w:t>
+      </w:r>
+    </w:p>
+    <w:p>
+      <w:r>
+        <w:t xml:space="preserve">           ORDER BY </w:t>
+      </w:r>
+      <w:proofErr w:type="spellStart"/>
+      <w:r>
+        <w:t>consultation_fee</w:t>
+      </w:r>
+      <w:proofErr w:type="spellEnd"/>
+      <w:r>
+        <w:t xml:space="preserve"> DESC</w:t>
+      </w:r>
+    </w:p>
+    <w:p>
+      <w:r>
+        <w:t xml:space="preserve">       )</w:t>
+      </w:r>
+    </w:p>
+    <w:p>
+      <w:r>
+        <w:t>FROM Specialists;</w:t>
+      </w:r>
+    </w:p>
+    <w:p>
+      <w:r>
+        <w:rPr>
+          <w:noProof/>
+        </w:rPr>
+        <w:drawing>
+          <wp:inline distT="0" distB="0" distL="0" distR="0" wp14:anchorId="5C87C94E" wp14:editId="626E497A">
+            <wp:extent cx="5731510" cy="1543050"/>
+            <wp:effectExtent l="0" t="0" r="2540" b="0"/>
+            <wp:docPr id="1165088010" name="Picture 1"/>
+            <wp:cNvGraphicFramePr>
+              <a:graphicFrameLocks xmlns:a="http://schemas.openxmlformats.org/drawingml/2006/main" noChangeAspect="1"/>
+            </wp:cNvGraphicFramePr>
+            <a:graphic xmlns:a="http://schemas.openxmlformats.org/drawingml/2006/main">
+              <a:graphicData uri="http://schemas.openxmlformats.org/drawingml/2006/picture">
+                <pic:pic xmlns:pic="http://schemas.openxmlformats.org/drawingml/2006/picture">
+                  <pic:nvPicPr>
+                    <pic:cNvPr id="1165088010" name=""/>
+                    <pic:cNvPicPr/>
+                  </pic:nvPicPr>
+                  <pic:blipFill>
+                    <a:blip r:embed="rId16"/>
+                    <a:stretch>
+                      <a:fillRect/>
+                    </a:stretch>
+                  </pic:blipFill>
+                  <pic:spPr>
+                    <a:xfrm>
+                      <a:off x="0" y="0"/>
+                      <a:ext cx="5731510" cy="1543050"/>
+                    </a:xfrm>
+                    <a:prstGeom prst="rect">
+                      <a:avLst/>
+                    </a:prstGeom>
+                  </pic:spPr>
+                </pic:pic>
+              </a:graphicData>
+            </a:graphic>
+          </wp:inline>
+        </w:drawing>
+      </w:r>
+    </w:p>
+    <w:p/>
+    <w:p>
+      <w:r>
+        <w:rPr>
+          <w:b/>
+          <w:bCs/>
+        </w:rPr>
+        <w:t>15. Display the next consultation fee for each specialist.</w:t>
+      </w:r>
+    </w:p>
+    <w:p>
+      <w:r>
+        <w:t xml:space="preserve">SELECT </w:t>
+      </w:r>
+      <w:proofErr w:type="spellStart"/>
+      <w:r>
+        <w:t>first_name</w:t>
+      </w:r>
+      <w:proofErr w:type="spellEnd"/>
+      <w:r>
+        <w:t xml:space="preserve">, </w:t>
+      </w:r>
+      <w:proofErr w:type="spellStart"/>
+      <w:r>
+        <w:t>last_name</w:t>
+      </w:r>
+      <w:proofErr w:type="spellEnd"/>
+      <w:r>
+        <w:t xml:space="preserve">, specialization, </w:t>
+      </w:r>
+      <w:proofErr w:type="spellStart"/>
+      <w:r>
+        <w:t>consultation_fee</w:t>
+      </w:r>
+      <w:proofErr w:type="spellEnd"/>
+      <w:r>
+        <w:t>,</w:t>
+      </w:r>
+    </w:p>
+    <w:p>
+      <w:r>
+        <w:t xml:space="preserve">       </w:t>
+      </w:r>
+      <w:proofErr w:type="gramStart"/>
+      <w:r>
+        <w:t>LEAD(</w:t>
+      </w:r>
+      <w:proofErr w:type="spellStart"/>
+      <w:proofErr w:type="gramEnd"/>
+      <w:r>
+        <w:t>consultation_fee</w:t>
+      </w:r>
+      <w:proofErr w:type="spellEnd"/>
+      <w:r>
+        <w:t>) OVER (</w:t>
+      </w:r>
+    </w:p>
+    <w:p>
+      <w:r>
+        <w:t xml:space="preserve">           ORDER BY </w:t>
+      </w:r>
+      <w:proofErr w:type="spellStart"/>
+      <w:r>
+        <w:t>consultation_fee</w:t>
+      </w:r>
+      <w:proofErr w:type="spellEnd"/>
+      <w:r>
+        <w:t xml:space="preserve"> DESC</w:t>
+      </w:r>
+    </w:p>
+    <w:p>
+      <w:r>
+        <w:t xml:space="preserve">       )</w:t>
+      </w:r>
+    </w:p>
+    <w:p>
+      <w:r>
+        <w:t>FROM Specialists;</w:t>
+      </w:r>
+    </w:p>
+    <w:p>
+      <w:r>
+        <w:rPr>
+          <w:noProof/>
+        </w:rPr>
+        <w:lastRenderedPageBreak/>
+        <w:drawing>
+          <wp:inline distT="0" distB="0" distL="0" distR="0" wp14:anchorId="746AAD25" wp14:editId="0F3234A6">
+            <wp:extent cx="5731510" cy="1494155"/>
+            <wp:effectExtent l="0" t="0" r="2540" b="0"/>
+            <wp:docPr id="242616356" name="Picture 1"/>
+            <wp:cNvGraphicFramePr>
+              <a:graphicFrameLocks xmlns:a="http://schemas.openxmlformats.org/drawingml/2006/main" noChangeAspect="1"/>
+            </wp:cNvGraphicFramePr>
+            <a:graphic xmlns:a="http://schemas.openxmlformats.org/drawingml/2006/main">
+              <a:graphicData uri="http://schemas.openxmlformats.org/drawingml/2006/picture">
+                <pic:pic xmlns:pic="http://schemas.openxmlformats.org/drawingml/2006/picture">
+                  <pic:nvPicPr>
+                    <pic:cNvPr id="242616356" name=""/>
+                    <pic:cNvPicPr/>
+                  </pic:nvPicPr>
+                  <pic:blipFill>
+                    <a:blip r:embed="rId17"/>
+                    <a:stretch>
+                      <a:fillRect/>
+                    </a:stretch>
+                  </pic:blipFill>
+                  <pic:spPr>
+                    <a:xfrm>
+                      <a:off x="0" y="0"/>
+                      <a:ext cx="5731510" cy="1494155"/>
+                    </a:xfrm>
+                    <a:prstGeom prst="rect">
+                      <a:avLst/>
+                    </a:prstGeom>
+                  </pic:spPr>
+                </pic:pic>
+              </a:graphicData>
+            </a:graphic>
+          </wp:inline>
+        </w:drawing>
+      </w:r>
+    </w:p>
+    <w:p/>
+    <w:p>
+      <w:pPr>
+        <w:rPr>
+          <w:b/>
+          <w:bCs/>
+          <w:sz w:val="28"/>
+          <w:szCs w:val="28"/>
+        </w:rPr>
+      </w:pPr>
+      <w:proofErr w:type="gramStart"/>
+      <w:r>
+        <w:rPr>
+          <w:b/>
+          <w:bCs/>
+          <w:sz w:val="28"/>
+          <w:szCs w:val="28"/>
+        </w:rPr>
+        <w:t>KPI</w:t>
+      </w:r>
+      <w:r>
+        <w:rPr>
+          <w:b/>
+          <w:bCs/>
+          <w:sz w:val="28"/>
+          <w:szCs w:val="28"/>
+        </w:rPr>
+        <w:t xml:space="preserve"> :</w:t>
+      </w:r>
+      <w:proofErr w:type="gramEnd"/>
+    </w:p>
+    <w:p>
+      <w:pPr>
+        <w:pStyle w:val="ListParagraph"/>
+        <w:numPr>
+          <w:ilvl w:val="0"/>
+          <w:numId w:val="2"/>
+        </w:numPr>
+      </w:pPr>
+      <w:r>
+        <w:rPr>
+          <w:b/>
+          <w:bCs/>
+        </w:rPr>
+        <w:t>What is the total revenue generated from billing?</w:t>
+      </w:r>
+    </w:p>
+    <w:p>
+      <w:r>
+        <w:t xml:space="preserve">SELECT </w:t>
+      </w:r>
+      <w:proofErr w:type="gramStart"/>
+      <w:r>
+        <w:t>SUM(</w:t>
+      </w:r>
+      <w:proofErr w:type="spellStart"/>
+      <w:proofErr w:type="gramEnd"/>
+      <w:r>
+        <w:t>total_amount</w:t>
+      </w:r>
+      <w:proofErr w:type="spellEnd"/>
+      <w:r>
+        <w:t xml:space="preserve">) AS </w:t>
+      </w:r>
+      <w:proofErr w:type="spellStart"/>
+      <w:r>
+        <w:t>Total_Revenue</w:t>
+      </w:r>
+      <w:proofErr w:type="spellEnd"/>
+    </w:p>
+    <w:p>
+      <w:r>
+        <w:t>FROM Billing;</w:t>
+      </w:r>
+    </w:p>
+    <w:p>
+      <w:r>
+        <w:rPr>
+          <w:noProof/>
+        </w:rPr>
+        <w:drawing>
+          <wp:inline distT="0" distB="0" distL="0" distR="0" wp14:anchorId="18289A50" wp14:editId="68B4BFFC">
+            <wp:extent cx="1181265" cy="457264"/>
+            <wp:effectExtent l="0" t="0" r="0" b="0"/>
+            <wp:docPr id="1447874672" name="Picture 1"/>
+            <wp:cNvGraphicFramePr>
+              <a:graphicFrameLocks xmlns:a="http://schemas.openxmlformats.org/drawingml/2006/main" noChangeAspect="1"/>
+            </wp:cNvGraphicFramePr>
+            <a:graphic xmlns:a="http://schemas.openxmlformats.org/drawingml/2006/main">
+              <a:graphicData uri="http://schemas.openxmlformats.org/drawingml/2006/picture">
+                <pic:pic xmlns:pic="http://schemas.openxmlformats.org/drawingml/2006/picture">
+                  <pic:nvPicPr>
+                    <pic:cNvPr id="1447874672" name=""/>
+                    <pic:cNvPicPr/>
+                  </pic:nvPicPr>
+                  <pic:blipFill>
+                    <a:blip r:embed="rId18"/>
+                    <a:stretch>
+                      <a:fillRect/>
+                    </a:stretch>
+                  </pic:blipFill>
+                  <pic:spPr>
+                    <a:xfrm>
+                      <a:off x="0" y="0"/>
+                      <a:ext cx="1181265" cy="457264"/>
+                    </a:xfrm>
+                    <a:prstGeom prst="rect">
+                      <a:avLst/>
+                    </a:prstGeom>
+                  </pic:spPr>
+                </pic:pic>
+              </a:graphicData>
+            </a:graphic>
+          </wp:inline>
+        </w:drawing>
+      </w:r>
+    </w:p>
+    <w:p/>
+    <w:p>
+      <w:pPr>
+        <w:pStyle w:val="ListParagraph"/>
+        <w:numPr>
+          <w:ilvl w:val="0"/>
+          <w:numId w:val="2"/>
+        </w:numPr>
+      </w:pPr>
+      <w:r>
+        <w:rPr>
+          <w:b/>
+          <w:bCs/>
+        </w:rPr>
+        <w:t>How many specialists are there?</w:t>
+      </w:r>
+    </w:p>
+    <w:p>
+      <w:r>
+        <w:t xml:space="preserve">SELECT </w:t>
+      </w:r>
+      <w:proofErr w:type="gramStart"/>
+      <w:r>
+        <w:t>COUNT(</w:t>
+      </w:r>
+      <w:proofErr w:type="gramEnd"/>
+      <w:r>
         <w:t xml:space="preserve">*) AS </w:t>
       </w:r>
       <w:proofErr w:type="spellStart"/>
@@ -956,8 +2310,11 @@
     </w:p>
     <w:p>
       <w:r>
+        <w:rPr>
+          <w:noProof/>
+        </w:rPr>
         <w:drawing>
-          <wp:inline distT="0" distB="0" distL="0" distR="0" wp14:anchorId="56C95C9C" wp14:editId="05F2A072">
+          <wp:inline distT="0" distB="0" distL="0" distR="0" wp14:anchorId="78753FC0" wp14:editId="451BA9B4">
             <wp:extent cx="1552792" cy="466790"/>
             <wp:effectExtent l="0" t="0" r="9525" b="9525"/>
             <wp:docPr id="2032202725" name="Picture 1"/>
@@ -972,7 +2329,7 @@
                     <pic:cNvPicPr/>
                   </pic:nvPicPr>
                   <pic:blipFill>
-                    <a:blip r:embed="rId7"/>
+                    <a:blip r:embed="rId19"/>
                     <a:stretch>
                       <a:fillRect/>
                     </a:stretch>
@@ -994,1274 +2351,18 @@
       </w:r>
     </w:p>
     <w:p/>
-    <w:p>
-      <w:r>
-        <w:rPr>
-          <w:b/>
-          <w:bCs/>
-        </w:rPr>
-        <w:t>5. What is the total revenue generated from billing?</w:t>
-      </w:r>
-    </w:p>
-    <w:p>
-      <w:r>
-        <w:t xml:space="preserve">SELECT </w:t>
-      </w:r>
-      <w:proofErr w:type="gramStart"/>
-      <w:r>
-        <w:t>SUM(</w:t>
-      </w:r>
-      <w:proofErr w:type="spellStart"/>
-      <w:proofErr w:type="gramEnd"/>
-      <w:r>
-        <w:t>total_amount</w:t>
-      </w:r>
-      <w:proofErr w:type="spellEnd"/>
-      <w:r>
-        <w:t xml:space="preserve">) AS </w:t>
-      </w:r>
-      <w:proofErr w:type="spellStart"/>
-      <w:r>
-        <w:t>Total_Revenue</w:t>
-      </w:r>
-      <w:proofErr w:type="spellEnd"/>
-    </w:p>
-    <w:p>
-      <w:r>
-        <w:t>FROM Billing;</w:t>
-      </w:r>
-    </w:p>
-    <w:p>
-      <w:r>
-        <w:drawing>
-          <wp:inline distT="0" distB="0" distL="0" distR="0" wp14:anchorId="6B2E2440" wp14:editId="64318B9B">
-            <wp:extent cx="1181265" cy="457264"/>
-            <wp:effectExtent l="0" t="0" r="0" b="0"/>
-            <wp:docPr id="1447874672" name="Picture 1"/>
-            <wp:cNvGraphicFramePr>
-              <a:graphicFrameLocks xmlns:a="http://schemas.openxmlformats.org/drawingml/2006/main" noChangeAspect="1"/>
-            </wp:cNvGraphicFramePr>
-            <a:graphic xmlns:a="http://schemas.openxmlformats.org/drawingml/2006/main">
-              <a:graphicData uri="http://schemas.openxmlformats.org/drawingml/2006/picture">
-                <pic:pic xmlns:pic="http://schemas.openxmlformats.org/drawingml/2006/picture">
-                  <pic:nvPicPr>
-                    <pic:cNvPr id="1447874672" name=""/>
-                    <pic:cNvPicPr/>
-                  </pic:nvPicPr>
-                  <pic:blipFill>
-                    <a:blip r:embed="rId8"/>
-                    <a:stretch>
-                      <a:fillRect/>
-                    </a:stretch>
-                  </pic:blipFill>
-                  <pic:spPr>
-                    <a:xfrm>
-                      <a:off x="0" y="0"/>
-                      <a:ext cx="1181265" cy="457264"/>
-                    </a:xfrm>
-                    <a:prstGeom prst="rect">
-                      <a:avLst/>
-                    </a:prstGeom>
-                  </pic:spPr>
-                </pic:pic>
-              </a:graphicData>
-            </a:graphic>
-          </wp:inline>
-        </w:drawing>
-      </w:r>
-    </w:p>
     <w:p/>
-    <w:p>
-      <w:r>
-        <w:rPr>
-          <w:b/>
-          <w:bCs/>
-        </w:rPr>
-        <w:t>6. What is the highest and lowest billing amount?</w:t>
-      </w:r>
-    </w:p>
-    <w:p>
-      <w:r>
-        <w:t xml:space="preserve">SELECT </w:t>
-      </w:r>
-    </w:p>
-    <w:p>
-      <w:r>
-        <w:t xml:space="preserve">    </w:t>
-      </w:r>
-      <w:proofErr w:type="gramStart"/>
-      <w:r>
-        <w:t>MAX(</w:t>
-      </w:r>
-      <w:proofErr w:type="spellStart"/>
-      <w:proofErr w:type="gramEnd"/>
-      <w:r>
-        <w:t>total_amount</w:t>
-      </w:r>
-      <w:proofErr w:type="spellEnd"/>
-      <w:r>
-        <w:t xml:space="preserve">) AS </w:t>
-      </w:r>
-      <w:proofErr w:type="spellStart"/>
-      <w:r>
-        <w:t>Highest_Bill</w:t>
-      </w:r>
-      <w:proofErr w:type="spellEnd"/>
-      <w:r>
-        <w:t>,</w:t>
-      </w:r>
-    </w:p>
-    <w:p>
-      <w:r>
-        <w:t xml:space="preserve">    </w:t>
-      </w:r>
-      <w:proofErr w:type="gramStart"/>
-      <w:r>
-        <w:t>MIN(</w:t>
-      </w:r>
-      <w:proofErr w:type="spellStart"/>
-      <w:proofErr w:type="gramEnd"/>
-      <w:r>
-        <w:t>total_amount</w:t>
-      </w:r>
-      <w:proofErr w:type="spellEnd"/>
-      <w:r>
-        <w:t xml:space="preserve">) AS </w:t>
-      </w:r>
-      <w:proofErr w:type="spellStart"/>
-      <w:r>
-        <w:t>Lowest_Bill</w:t>
-      </w:r>
-      <w:proofErr w:type="spellEnd"/>
-    </w:p>
-    <w:p>
-      <w:r>
-        <w:t>FROM Billing;</w:t>
-      </w:r>
-    </w:p>
-    <w:p>
-      <w:r>
-        <w:drawing>
-          <wp:inline distT="0" distB="0" distL="0" distR="0" wp14:anchorId="5560F137" wp14:editId="0312BDED">
-            <wp:extent cx="1609950" cy="495369"/>
-            <wp:effectExtent l="0" t="0" r="9525" b="0"/>
-            <wp:docPr id="599362883" name="Picture 1"/>
-            <wp:cNvGraphicFramePr>
-              <a:graphicFrameLocks xmlns:a="http://schemas.openxmlformats.org/drawingml/2006/main" noChangeAspect="1"/>
-            </wp:cNvGraphicFramePr>
-            <a:graphic xmlns:a="http://schemas.openxmlformats.org/drawingml/2006/main">
-              <a:graphicData uri="http://schemas.openxmlformats.org/drawingml/2006/picture">
-                <pic:pic xmlns:pic="http://schemas.openxmlformats.org/drawingml/2006/picture">
-                  <pic:nvPicPr>
-                    <pic:cNvPr id="599362883" name=""/>
-                    <pic:cNvPicPr/>
-                  </pic:nvPicPr>
-                  <pic:blipFill>
-                    <a:blip r:embed="rId9"/>
-                    <a:stretch>
-                      <a:fillRect/>
-                    </a:stretch>
-                  </pic:blipFill>
-                  <pic:spPr>
-                    <a:xfrm>
-                      <a:off x="0" y="0"/>
-                      <a:ext cx="1609950" cy="495369"/>
-                    </a:xfrm>
-                    <a:prstGeom prst="rect">
-                      <a:avLst/>
-                    </a:prstGeom>
-                  </pic:spPr>
-                </pic:pic>
-              </a:graphicData>
-            </a:graphic>
-          </wp:inline>
-        </w:drawing>
-      </w:r>
-    </w:p>
     <w:p/>
     <w:p>
-      <w:r>
-        <w:rPr>
-          <w:b/>
-          <w:bCs/>
-        </w:rPr>
-        <w:t>7. How many members are there in each membership type?</w:t>
-      </w:r>
-    </w:p>
-    <w:p>
-      <w:r>
-        <w:t xml:space="preserve">SELECT </w:t>
-      </w:r>
-      <w:proofErr w:type="spellStart"/>
-      <w:r>
-        <w:t>membership_type</w:t>
-      </w:r>
-      <w:proofErr w:type="spellEnd"/>
-      <w:r>
-        <w:t xml:space="preserve">, </w:t>
-      </w:r>
-      <w:proofErr w:type="gramStart"/>
-      <w:r>
-        <w:t>COUNT(</w:t>
-      </w:r>
-      <w:proofErr w:type="spellStart"/>
-      <w:proofErr w:type="gramEnd"/>
-      <w:r>
-        <w:t>member_id</w:t>
-      </w:r>
-      <w:proofErr w:type="spellEnd"/>
-      <w:r>
-        <w:t xml:space="preserve">) AS </w:t>
-      </w:r>
-      <w:proofErr w:type="spellStart"/>
-      <w:r>
-        <w:t>Total_Members</w:t>
-      </w:r>
-      <w:proofErr w:type="spellEnd"/>
-    </w:p>
-    <w:p>
-      <w:r>
-        <w:t>FROM Members</w:t>
-      </w:r>
-    </w:p>
-    <w:p>
-      <w:r>
-        <w:t xml:space="preserve">GROUP BY </w:t>
-      </w:r>
-      <w:proofErr w:type="spellStart"/>
-      <w:r>
-        <w:t>membership_type</w:t>
-      </w:r>
-      <w:proofErr w:type="spellEnd"/>
-      <w:r>
-        <w:t>;</w:t>
-      </w:r>
-    </w:p>
-    <w:p/>
-    <w:p>
-      <w:r>
-        <w:lastRenderedPageBreak/>
-        <w:drawing>
-          <wp:inline distT="0" distB="0" distL="0" distR="0" wp14:anchorId="16234E03" wp14:editId="63747632">
-            <wp:extent cx="2143424" cy="733527"/>
-            <wp:effectExtent l="0" t="0" r="9525" b="9525"/>
-            <wp:docPr id="576495716" name="Picture 1"/>
-            <wp:cNvGraphicFramePr>
-              <a:graphicFrameLocks xmlns:a="http://schemas.openxmlformats.org/drawingml/2006/main" noChangeAspect="1"/>
-            </wp:cNvGraphicFramePr>
-            <a:graphic xmlns:a="http://schemas.openxmlformats.org/drawingml/2006/main">
-              <a:graphicData uri="http://schemas.openxmlformats.org/drawingml/2006/picture">
-                <pic:pic xmlns:pic="http://schemas.openxmlformats.org/drawingml/2006/picture">
-                  <pic:nvPicPr>
-                    <pic:cNvPr id="576495716" name=""/>
-                    <pic:cNvPicPr/>
-                  </pic:nvPicPr>
-                  <pic:blipFill>
-                    <a:blip r:embed="rId10"/>
-                    <a:stretch>
-                      <a:fillRect/>
-                    </a:stretch>
-                  </pic:blipFill>
-                  <pic:spPr>
-                    <a:xfrm>
-                      <a:off x="0" y="0"/>
-                      <a:ext cx="2143424" cy="733527"/>
-                    </a:xfrm>
-                    <a:prstGeom prst="rect">
-                      <a:avLst/>
-                    </a:prstGeom>
-                  </pic:spPr>
-                </pic:pic>
-              </a:graphicData>
-            </a:graphic>
-          </wp:inline>
-        </w:drawing>
-      </w:r>
-    </w:p>
-    <w:p/>
-    <w:p>
-      <w:r>
-        <w:rPr>
-          <w:b/>
-          <w:bCs/>
-        </w:rPr>
-        <w:t>8. How many consultations are there for each consultation mode?</w:t>
-      </w:r>
-    </w:p>
-    <w:p>
-      <w:r>
-        <w:t xml:space="preserve">SELECT </w:t>
-      </w:r>
-      <w:proofErr w:type="spellStart"/>
-      <w:r>
-        <w:t>consultation_mode</w:t>
-      </w:r>
-      <w:proofErr w:type="spellEnd"/>
-      <w:r>
-        <w:t xml:space="preserve">, </w:t>
-      </w:r>
-      <w:proofErr w:type="gramStart"/>
-      <w:r>
-        <w:t>COUNT(</w:t>
-      </w:r>
-      <w:proofErr w:type="spellStart"/>
-      <w:proofErr w:type="gramEnd"/>
-      <w:r>
-        <w:t>consultation_id</w:t>
-      </w:r>
-      <w:proofErr w:type="spellEnd"/>
-      <w:r>
-        <w:t xml:space="preserve">) AS </w:t>
-      </w:r>
-      <w:proofErr w:type="spellStart"/>
-      <w:r>
-        <w:t>Total_Consultations</w:t>
-      </w:r>
-      <w:proofErr w:type="spellEnd"/>
-    </w:p>
-    <w:p>
-      <w:r>
-        <w:t>FROM Consultations</w:t>
-      </w:r>
-    </w:p>
-    <w:p>
-      <w:r>
-        <w:t xml:space="preserve">GROUP BY </w:t>
-      </w:r>
-      <w:proofErr w:type="spellStart"/>
-      <w:r>
-        <w:t>consultation_mode</w:t>
-      </w:r>
-      <w:proofErr w:type="spellEnd"/>
-      <w:r>
-        <w:t>;</w:t>
-      </w:r>
-    </w:p>
-    <w:p>
-      <w:r>
-        <w:drawing>
-          <wp:inline distT="0" distB="0" distL="0" distR="0" wp14:anchorId="53AFB860" wp14:editId="17412FC4">
-            <wp:extent cx="2381582" cy="619211"/>
-            <wp:effectExtent l="0" t="0" r="0" b="9525"/>
-            <wp:docPr id="27742824" name="Picture 1"/>
-            <wp:cNvGraphicFramePr>
-              <a:graphicFrameLocks xmlns:a="http://schemas.openxmlformats.org/drawingml/2006/main" noChangeAspect="1"/>
-            </wp:cNvGraphicFramePr>
-            <a:graphic xmlns:a="http://schemas.openxmlformats.org/drawingml/2006/main">
-              <a:graphicData uri="http://schemas.openxmlformats.org/drawingml/2006/picture">
-                <pic:pic xmlns:pic="http://schemas.openxmlformats.org/drawingml/2006/picture">
-                  <pic:nvPicPr>
-                    <pic:cNvPr id="27742824" name=""/>
-                    <pic:cNvPicPr/>
-                  </pic:nvPicPr>
-                  <pic:blipFill>
-                    <a:blip r:embed="rId11"/>
-                    <a:stretch>
-                      <a:fillRect/>
-                    </a:stretch>
-                  </pic:blipFill>
-                  <pic:spPr>
-                    <a:xfrm>
-                      <a:off x="0" y="0"/>
-                      <a:ext cx="2381582" cy="619211"/>
-                    </a:xfrm>
-                    <a:prstGeom prst="rect">
-                      <a:avLst/>
-                    </a:prstGeom>
-                  </pic:spPr>
-                </pic:pic>
-              </a:graphicData>
-            </a:graphic>
-          </wp:inline>
-        </w:drawing>
-      </w:r>
-    </w:p>
-    <w:p/>
-    <w:p>
-      <w:r>
-        <w:rPr>
-          <w:b/>
-          <w:bCs/>
-        </w:rPr>
-        <w:t>9. How many consultations are there for each consultation status?</w:t>
-      </w:r>
-    </w:p>
-    <w:p>
-      <w:r>
-        <w:t xml:space="preserve">SELECT status, </w:t>
-      </w:r>
-      <w:proofErr w:type="gramStart"/>
-      <w:r>
-        <w:t>COUNT(</w:t>
-      </w:r>
-      <w:proofErr w:type="spellStart"/>
-      <w:proofErr w:type="gramEnd"/>
-      <w:r>
-        <w:t>consultation_id</w:t>
-      </w:r>
-      <w:proofErr w:type="spellEnd"/>
-      <w:r>
-        <w:t xml:space="preserve">) AS </w:t>
-      </w:r>
-      <w:proofErr w:type="spellStart"/>
-      <w:r>
-        <w:t>Total_Consultations</w:t>
-      </w:r>
-      <w:proofErr w:type="spellEnd"/>
-    </w:p>
-    <w:p>
-      <w:r>
-        <w:t>FROM Consultations</w:t>
-      </w:r>
-    </w:p>
-    <w:p>
-      <w:r>
-        <w:t>GROUP BY status;</w:t>
-      </w:r>
-    </w:p>
-    <w:p>
-      <w:r>
-        <w:drawing>
-          <wp:inline distT="0" distB="0" distL="0" distR="0" wp14:anchorId="078BE832" wp14:editId="1D5785A1">
-            <wp:extent cx="2029108" cy="933580"/>
-            <wp:effectExtent l="0" t="0" r="9525" b="0"/>
-            <wp:docPr id="2131567757" name="Picture 1"/>
-            <wp:cNvGraphicFramePr>
-              <a:graphicFrameLocks xmlns:a="http://schemas.openxmlformats.org/drawingml/2006/main" noChangeAspect="1"/>
-            </wp:cNvGraphicFramePr>
-            <a:graphic xmlns:a="http://schemas.openxmlformats.org/drawingml/2006/main">
-              <a:graphicData uri="http://schemas.openxmlformats.org/drawingml/2006/picture">
-                <pic:pic xmlns:pic="http://schemas.openxmlformats.org/drawingml/2006/picture">
-                  <pic:nvPicPr>
-                    <pic:cNvPr id="2131567757" name=""/>
-                    <pic:cNvPicPr/>
-                  </pic:nvPicPr>
-                  <pic:blipFill>
-                    <a:blip r:embed="rId12"/>
-                    <a:stretch>
-                      <a:fillRect/>
-                    </a:stretch>
-                  </pic:blipFill>
-                  <pic:spPr>
-                    <a:xfrm>
-                      <a:off x="0" y="0"/>
-                      <a:ext cx="2029108" cy="933580"/>
-                    </a:xfrm>
-                    <a:prstGeom prst="rect">
-                      <a:avLst/>
-                    </a:prstGeom>
-                  </pic:spPr>
-                </pic:pic>
-              </a:graphicData>
-            </a:graphic>
-          </wp:inline>
-        </w:drawing>
-      </w:r>
-    </w:p>
-    <w:p/>
-    <w:p>
-      <w:r>
-        <w:rPr>
-          <w:b/>
-          <w:bCs/>
-        </w:rPr>
-        <w:t>10. Which specializations have more than 100 consultations?</w:t>
-      </w:r>
-    </w:p>
-    <w:p>
-      <w:r>
-        <w:t xml:space="preserve">SELECT </w:t>
-      </w:r>
-      <w:proofErr w:type="spellStart"/>
-      <w:proofErr w:type="gramStart"/>
-      <w:r>
-        <w:t>s.specialization</w:t>
-      </w:r>
-      <w:proofErr w:type="spellEnd"/>
-      <w:proofErr w:type="gramEnd"/>
-      <w:r>
-        <w:t>, COUNT(</w:t>
-      </w:r>
-      <w:proofErr w:type="spellStart"/>
-      <w:proofErr w:type="gramStart"/>
-      <w:r>
-        <w:t>c.consultation</w:t>
-      </w:r>
-      <w:proofErr w:type="gramEnd"/>
-      <w:r>
-        <w:t>_id</w:t>
-      </w:r>
-      <w:proofErr w:type="spellEnd"/>
-      <w:r>
-        <w:t xml:space="preserve">) AS </w:t>
-      </w:r>
-      <w:proofErr w:type="spellStart"/>
-      <w:r>
-        <w:t>Total_Consultations</w:t>
-      </w:r>
-      <w:proofErr w:type="spellEnd"/>
-    </w:p>
-    <w:p>
-      <w:r>
-        <w:t>FROM Specialists s</w:t>
-      </w:r>
-    </w:p>
-    <w:p>
-      <w:r>
-        <w:t>INNER JOIN Consultations c</w:t>
-      </w:r>
-    </w:p>
-    <w:p>
-      <w:r>
-        <w:t xml:space="preserve">    ON </w:t>
-      </w:r>
-      <w:proofErr w:type="spellStart"/>
-      <w:proofErr w:type="gramStart"/>
-      <w:r>
-        <w:t>s.specialist</w:t>
-      </w:r>
-      <w:proofErr w:type="gramEnd"/>
-      <w:r>
-        <w:t>_id</w:t>
-      </w:r>
-      <w:proofErr w:type="spellEnd"/>
-      <w:r>
-        <w:t xml:space="preserve"> = </w:t>
-      </w:r>
-      <w:proofErr w:type="spellStart"/>
-      <w:proofErr w:type="gramStart"/>
-      <w:r>
-        <w:t>c.specialist</w:t>
-      </w:r>
-      <w:proofErr w:type="gramEnd"/>
-      <w:r>
-        <w:t>_id</w:t>
-      </w:r>
-      <w:proofErr w:type="spellEnd"/>
-    </w:p>
-    <w:p>
-      <w:r>
-        <w:t xml:space="preserve">GROUP BY </w:t>
-      </w:r>
-      <w:proofErr w:type="spellStart"/>
-      <w:proofErr w:type="gramStart"/>
-      <w:r>
-        <w:t>s.specialization</w:t>
-      </w:r>
-      <w:proofErr w:type="spellEnd"/>
-      <w:proofErr w:type="gramEnd"/>
-    </w:p>
-    <w:p>
-      <w:r>
-        <w:t>HAVING COUNT(</w:t>
-      </w:r>
-      <w:proofErr w:type="spellStart"/>
-      <w:proofErr w:type="gramStart"/>
-      <w:r>
-        <w:t>c.consultation</w:t>
-      </w:r>
-      <w:proofErr w:type="gramEnd"/>
-      <w:r>
-        <w:t>_id</w:t>
-      </w:r>
-      <w:proofErr w:type="spellEnd"/>
-      <w:r>
-        <w:t>) &gt; 100</w:t>
-      </w:r>
-    </w:p>
-    <w:p>
-      <w:r>
-        <w:t xml:space="preserve">ORDER BY </w:t>
-      </w:r>
-      <w:proofErr w:type="spellStart"/>
-      <w:r>
-        <w:t>Total_Consultations</w:t>
-      </w:r>
-      <w:proofErr w:type="spellEnd"/>
-      <w:r>
-        <w:t xml:space="preserve"> DESC;</w:t>
-      </w:r>
-    </w:p>
-    <w:p>
-      <w:r>
-        <w:lastRenderedPageBreak/>
-        <w:drawing>
-          <wp:inline distT="0" distB="0" distL="0" distR="0" wp14:anchorId="7250FD0F" wp14:editId="28092030">
-            <wp:extent cx="2229161" cy="1524213"/>
-            <wp:effectExtent l="0" t="0" r="0" b="0"/>
-            <wp:docPr id="1165023968" name="Picture 1"/>
-            <wp:cNvGraphicFramePr>
-              <a:graphicFrameLocks xmlns:a="http://schemas.openxmlformats.org/drawingml/2006/main" noChangeAspect="1"/>
-            </wp:cNvGraphicFramePr>
-            <a:graphic xmlns:a="http://schemas.openxmlformats.org/drawingml/2006/main">
-              <a:graphicData uri="http://schemas.openxmlformats.org/drawingml/2006/picture">
-                <pic:pic xmlns:pic="http://schemas.openxmlformats.org/drawingml/2006/picture">
-                  <pic:nvPicPr>
-                    <pic:cNvPr id="1165023968" name=""/>
-                    <pic:cNvPicPr/>
-                  </pic:nvPicPr>
-                  <pic:blipFill>
-                    <a:blip r:embed="rId13"/>
-                    <a:stretch>
-                      <a:fillRect/>
-                    </a:stretch>
-                  </pic:blipFill>
-                  <pic:spPr>
-                    <a:xfrm>
-                      <a:off x="0" y="0"/>
-                      <a:ext cx="2229161" cy="1524213"/>
-                    </a:xfrm>
-                    <a:prstGeom prst="rect">
-                      <a:avLst/>
-                    </a:prstGeom>
-                  </pic:spPr>
-                </pic:pic>
-              </a:graphicData>
-            </a:graphic>
-          </wp:inline>
-        </w:drawing>
-      </w:r>
-    </w:p>
-    <w:p/>
-    <w:p>
-      <w:r>
-        <w:rPr>
-          <w:b/>
-          <w:bCs/>
-        </w:rPr>
-        <w:t>11. Which are the top 5 clinics based on the number of consultations?</w:t>
-      </w:r>
-    </w:p>
-    <w:p>
-      <w:r>
-        <w:t xml:space="preserve">SELECT </w:t>
-      </w:r>
-      <w:proofErr w:type="spellStart"/>
-      <w:proofErr w:type="gramStart"/>
-      <w:r>
-        <w:t>cl.clinic</w:t>
-      </w:r>
-      <w:proofErr w:type="gramEnd"/>
-      <w:r>
-        <w:t>_name</w:t>
-      </w:r>
-      <w:proofErr w:type="spellEnd"/>
-      <w:r>
-        <w:t>, COUNT(</w:t>
-      </w:r>
-      <w:proofErr w:type="spellStart"/>
-      <w:proofErr w:type="gramStart"/>
-      <w:r>
-        <w:t>c.consultation</w:t>
-      </w:r>
-      <w:proofErr w:type="gramEnd"/>
-      <w:r>
-        <w:t>_id</w:t>
-      </w:r>
-      <w:proofErr w:type="spellEnd"/>
-      <w:r>
-        <w:t xml:space="preserve">) AS </w:t>
-      </w:r>
-      <w:proofErr w:type="spellStart"/>
-      <w:r>
-        <w:t>Total_Consultations</w:t>
-      </w:r>
-      <w:proofErr w:type="spellEnd"/>
-    </w:p>
-    <w:p>
-      <w:r>
-        <w:t>FROM Clinics cl</w:t>
-      </w:r>
-    </w:p>
-    <w:p>
-      <w:r>
-        <w:t xml:space="preserve">INNER JOIN Consultations c </w:t>
-      </w:r>
-    </w:p>
-    <w:p>
-      <w:r>
-        <w:t xml:space="preserve">    ON </w:t>
-      </w:r>
-      <w:proofErr w:type="spellStart"/>
-      <w:proofErr w:type="gramStart"/>
-      <w:r>
-        <w:t>cl.clinic</w:t>
-      </w:r>
-      <w:proofErr w:type="gramEnd"/>
-      <w:r>
-        <w:t>_id</w:t>
-      </w:r>
-      <w:proofErr w:type="spellEnd"/>
-      <w:r>
-        <w:t xml:space="preserve"> = </w:t>
-      </w:r>
-      <w:proofErr w:type="spellStart"/>
-      <w:proofErr w:type="gramStart"/>
-      <w:r>
-        <w:t>c.clinic</w:t>
-      </w:r>
-      <w:proofErr w:type="gramEnd"/>
-      <w:r>
-        <w:t>_id</w:t>
-      </w:r>
-      <w:proofErr w:type="spellEnd"/>
-    </w:p>
-    <w:p>
-      <w:r>
-        <w:t xml:space="preserve">GROUP BY </w:t>
-      </w:r>
-      <w:proofErr w:type="spellStart"/>
-      <w:proofErr w:type="gramStart"/>
-      <w:r>
-        <w:t>cl.clinic</w:t>
-      </w:r>
-      <w:proofErr w:type="gramEnd"/>
-      <w:r>
-        <w:t>_name</w:t>
-      </w:r>
-      <w:proofErr w:type="spellEnd"/>
-    </w:p>
-    <w:p>
-      <w:r>
-        <w:t xml:space="preserve">ORDER BY </w:t>
-      </w:r>
-      <w:proofErr w:type="spellStart"/>
-      <w:r>
-        <w:t>Total_Consultations</w:t>
-      </w:r>
-      <w:proofErr w:type="spellEnd"/>
-      <w:r>
-        <w:t xml:space="preserve"> DESC</w:t>
-      </w:r>
-    </w:p>
-    <w:p>
-      <w:r>
-        <w:t>LIMIT 5;</w:t>
-      </w:r>
-    </w:p>
-    <w:p>
-      <w:r>
-        <w:drawing>
-          <wp:inline distT="0" distB="0" distL="0" distR="0" wp14:anchorId="16D9BB4D" wp14:editId="39F344F3">
-            <wp:extent cx="3724795" cy="1076475"/>
-            <wp:effectExtent l="0" t="0" r="9525" b="9525"/>
-            <wp:docPr id="1824371586" name="Picture 1"/>
-            <wp:cNvGraphicFramePr>
-              <a:graphicFrameLocks xmlns:a="http://schemas.openxmlformats.org/drawingml/2006/main" noChangeAspect="1"/>
-            </wp:cNvGraphicFramePr>
-            <a:graphic xmlns:a="http://schemas.openxmlformats.org/drawingml/2006/main">
-              <a:graphicData uri="http://schemas.openxmlformats.org/drawingml/2006/picture">
-                <pic:pic xmlns:pic="http://schemas.openxmlformats.org/drawingml/2006/picture">
-                  <pic:nvPicPr>
-                    <pic:cNvPr id="1824371586" name=""/>
-                    <pic:cNvPicPr/>
-                  </pic:nvPicPr>
-                  <pic:blipFill>
-                    <a:blip r:embed="rId14"/>
-                    <a:stretch>
-                      <a:fillRect/>
-                    </a:stretch>
-                  </pic:blipFill>
-                  <pic:spPr>
-                    <a:xfrm>
-                      <a:off x="0" y="0"/>
-                      <a:ext cx="3724795" cy="1076475"/>
-                    </a:xfrm>
-                    <a:prstGeom prst="rect">
-                      <a:avLst/>
-                    </a:prstGeom>
-                  </pic:spPr>
-                </pic:pic>
-              </a:graphicData>
-            </a:graphic>
-          </wp:inline>
-        </w:drawing>
-      </w:r>
-    </w:p>
-    <w:p/>
-    <w:p>
-      <w:r>
-        <w:rPr>
-          <w:b/>
-          <w:bCs/>
-        </w:rPr>
-        <w:t>12. Rank specialists based on consultation fee from highest to lowest.</w:t>
-      </w:r>
-    </w:p>
-    <w:p>
-      <w:r>
-        <w:t xml:space="preserve">SELECT </w:t>
-      </w:r>
-      <w:proofErr w:type="spellStart"/>
-      <w:r>
-        <w:t>first_name</w:t>
-      </w:r>
-      <w:proofErr w:type="spellEnd"/>
-      <w:r>
-        <w:t xml:space="preserve">, </w:t>
-      </w:r>
-      <w:proofErr w:type="spellStart"/>
-      <w:r>
-        <w:t>last_name</w:t>
-      </w:r>
-      <w:proofErr w:type="spellEnd"/>
-      <w:r>
-        <w:t xml:space="preserve">, specialization, </w:t>
-      </w:r>
-      <w:proofErr w:type="spellStart"/>
-      <w:r>
-        <w:t>consultation_fee</w:t>
-      </w:r>
-      <w:proofErr w:type="spellEnd"/>
-      <w:r>
-        <w:t>,</w:t>
-      </w:r>
-    </w:p>
-    <w:p>
-      <w:r>
-        <w:t xml:space="preserve">       ROW_</w:t>
-      </w:r>
-      <w:proofErr w:type="gramStart"/>
-      <w:r>
-        <w:t>NUMBER(</w:t>
-      </w:r>
-      <w:proofErr w:type="gramEnd"/>
-      <w:r>
-        <w:t>) OVER (</w:t>
-      </w:r>
-    </w:p>
-    <w:p>
-      <w:r>
-        <w:t xml:space="preserve">           ORDER BY </w:t>
-      </w:r>
-      <w:proofErr w:type="spellStart"/>
-      <w:r>
-        <w:t>consultation_fee</w:t>
-      </w:r>
-      <w:proofErr w:type="spellEnd"/>
-      <w:r>
-        <w:t xml:space="preserve"> DESC</w:t>
-      </w:r>
-    </w:p>
-    <w:p>
-      <w:r>
-        <w:t xml:space="preserve">       ) AS </w:t>
-      </w:r>
-      <w:proofErr w:type="spellStart"/>
-      <w:r>
-        <w:t>rnk</w:t>
-      </w:r>
-      <w:proofErr w:type="spellEnd"/>
-    </w:p>
-    <w:p>
-      <w:r>
-        <w:t>FROM Specialists;</w:t>
-      </w:r>
-    </w:p>
-    <w:p>
-      <w:r>
-        <w:lastRenderedPageBreak/>
-        <w:drawing>
-          <wp:inline distT="0" distB="0" distL="0" distR="0" wp14:anchorId="79066582" wp14:editId="05711A00">
-            <wp:extent cx="3848637" cy="1600423"/>
-            <wp:effectExtent l="0" t="0" r="0" b="0"/>
-            <wp:docPr id="472014944" name="Picture 1"/>
-            <wp:cNvGraphicFramePr>
-              <a:graphicFrameLocks xmlns:a="http://schemas.openxmlformats.org/drawingml/2006/main" noChangeAspect="1"/>
-            </wp:cNvGraphicFramePr>
-            <a:graphic xmlns:a="http://schemas.openxmlformats.org/drawingml/2006/main">
-              <a:graphicData uri="http://schemas.openxmlformats.org/drawingml/2006/picture">
-                <pic:pic xmlns:pic="http://schemas.openxmlformats.org/drawingml/2006/picture">
-                  <pic:nvPicPr>
-                    <pic:cNvPr id="472014944" name=""/>
-                    <pic:cNvPicPr/>
-                  </pic:nvPicPr>
-                  <pic:blipFill>
-                    <a:blip r:embed="rId15"/>
-                    <a:stretch>
-                      <a:fillRect/>
-                    </a:stretch>
-                  </pic:blipFill>
-                  <pic:spPr>
-                    <a:xfrm>
-                      <a:off x="0" y="0"/>
-                      <a:ext cx="3848637" cy="1600423"/>
-                    </a:xfrm>
-                    <a:prstGeom prst="rect">
-                      <a:avLst/>
-                    </a:prstGeom>
-                  </pic:spPr>
-                </pic:pic>
-              </a:graphicData>
-            </a:graphic>
-          </wp:inline>
-        </w:drawing>
-      </w:r>
-    </w:p>
-    <w:p/>
-    <w:p>
-      <w:r>
-        <w:rPr>
-          <w:b/>
-          <w:bCs/>
-        </w:rPr>
-        <w:t>13. Rank specialists based on consultation fee within each specialization.</w:t>
-      </w:r>
-    </w:p>
-    <w:p>
-      <w:r>
-        <w:t xml:space="preserve">SELECT </w:t>
-      </w:r>
-      <w:proofErr w:type="spellStart"/>
-      <w:r>
-        <w:t>first_name</w:t>
-      </w:r>
-      <w:proofErr w:type="spellEnd"/>
-      <w:r>
-        <w:t xml:space="preserve">, </w:t>
-      </w:r>
-      <w:proofErr w:type="spellStart"/>
-      <w:r>
-        <w:t>last_name</w:t>
-      </w:r>
-      <w:proofErr w:type="spellEnd"/>
-      <w:r>
-        <w:t xml:space="preserve">, specialization, </w:t>
-      </w:r>
-      <w:proofErr w:type="spellStart"/>
-      <w:r>
-        <w:t>consultation_fee</w:t>
-      </w:r>
-      <w:proofErr w:type="spellEnd"/>
-      <w:r>
-        <w:t>,</w:t>
-      </w:r>
-    </w:p>
-    <w:p>
-      <w:r>
-        <w:t xml:space="preserve">       ROW_</w:t>
-      </w:r>
-      <w:proofErr w:type="gramStart"/>
-      <w:r>
-        <w:t>NUMBER(</w:t>
-      </w:r>
-      <w:proofErr w:type="gramEnd"/>
-      <w:r>
-        <w:t>) OVER (</w:t>
-      </w:r>
-    </w:p>
-    <w:p>
-      <w:r>
-        <w:t xml:space="preserve">           PARTITION BY specialization </w:t>
-      </w:r>
-    </w:p>
-    <w:p>
-      <w:r>
-        <w:t xml:space="preserve">           ORDER BY </w:t>
-      </w:r>
-      <w:proofErr w:type="spellStart"/>
-      <w:r>
-        <w:t>consultation_fee</w:t>
-      </w:r>
-      <w:proofErr w:type="spellEnd"/>
-      <w:r>
-        <w:t xml:space="preserve"> DESC</w:t>
-      </w:r>
-    </w:p>
-    <w:p>
-      <w:r>
-        <w:t xml:space="preserve">       ) AS </w:t>
-      </w:r>
-      <w:proofErr w:type="spellStart"/>
-      <w:r>
-        <w:t>rnk</w:t>
-      </w:r>
-      <w:proofErr w:type="spellEnd"/>
-    </w:p>
-    <w:p>
-      <w:r>
-        <w:t>FROM Specialists;</w:t>
-      </w:r>
-    </w:p>
-    <w:p>
-      <w:r>
-        <w:drawing>
-          <wp:inline distT="0" distB="0" distL="0" distR="0" wp14:anchorId="15058932" wp14:editId="106CF7B1">
-            <wp:extent cx="3591426" cy="1524213"/>
-            <wp:effectExtent l="0" t="0" r="0" b="0"/>
-            <wp:docPr id="476845003" name="Picture 1"/>
-            <wp:cNvGraphicFramePr>
-              <a:graphicFrameLocks xmlns:a="http://schemas.openxmlformats.org/drawingml/2006/main" noChangeAspect="1"/>
-            </wp:cNvGraphicFramePr>
-            <a:graphic xmlns:a="http://schemas.openxmlformats.org/drawingml/2006/main">
-              <a:graphicData uri="http://schemas.openxmlformats.org/drawingml/2006/picture">
-                <pic:pic xmlns:pic="http://schemas.openxmlformats.org/drawingml/2006/picture">
-                  <pic:nvPicPr>
-                    <pic:cNvPr id="476845003" name=""/>
-                    <pic:cNvPicPr/>
-                  </pic:nvPicPr>
-                  <pic:blipFill>
-                    <a:blip r:embed="rId16"/>
-                    <a:stretch>
-                      <a:fillRect/>
-                    </a:stretch>
-                  </pic:blipFill>
-                  <pic:spPr>
-                    <a:xfrm>
-                      <a:off x="0" y="0"/>
-                      <a:ext cx="3591426" cy="1524213"/>
-                    </a:xfrm>
-                    <a:prstGeom prst="rect">
-                      <a:avLst/>
-                    </a:prstGeom>
-                  </pic:spPr>
-                </pic:pic>
-              </a:graphicData>
-            </a:graphic>
-          </wp:inline>
-        </w:drawing>
-      </w:r>
-    </w:p>
-    <w:p/>
-    <w:p>
-      <w:r>
-        <w:rPr>
-          <w:b/>
-          <w:bCs/>
-        </w:rPr>
-        <w:t>14. Display the previous consultation fee for each specialist.</w:t>
-      </w:r>
-    </w:p>
-    <w:p>
-      <w:r>
-        <w:t xml:space="preserve">SELECT </w:t>
-      </w:r>
-      <w:proofErr w:type="spellStart"/>
-      <w:r>
-        <w:t>first_name</w:t>
-      </w:r>
-      <w:proofErr w:type="spellEnd"/>
-      <w:r>
-        <w:t xml:space="preserve">, </w:t>
-      </w:r>
-      <w:proofErr w:type="spellStart"/>
-      <w:r>
-        <w:t>last_name</w:t>
-      </w:r>
-      <w:proofErr w:type="spellEnd"/>
-      <w:r>
-        <w:t xml:space="preserve">, specialization, </w:t>
-      </w:r>
-      <w:proofErr w:type="spellStart"/>
-      <w:r>
-        <w:t>consultation_fee</w:t>
-      </w:r>
-      <w:proofErr w:type="spellEnd"/>
-      <w:r>
-        <w:t>,</w:t>
-      </w:r>
-    </w:p>
-    <w:p>
-      <w:r>
-        <w:t xml:space="preserve">       </w:t>
-      </w:r>
-      <w:proofErr w:type="gramStart"/>
-      <w:r>
-        <w:t>LAG(</w:t>
-      </w:r>
-      <w:proofErr w:type="spellStart"/>
-      <w:proofErr w:type="gramEnd"/>
-      <w:r>
-        <w:t>consultation_fee</w:t>
-      </w:r>
-      <w:proofErr w:type="spellEnd"/>
-      <w:r>
-        <w:t>) OVER (</w:t>
-      </w:r>
-    </w:p>
-    <w:p>
-      <w:r>
-        <w:t xml:space="preserve">           ORDER BY </w:t>
-      </w:r>
-      <w:proofErr w:type="spellStart"/>
-      <w:r>
-        <w:t>consultation_fee</w:t>
-      </w:r>
-      <w:proofErr w:type="spellEnd"/>
-      <w:r>
-        <w:t xml:space="preserve"> DESC</w:t>
-      </w:r>
-    </w:p>
-    <w:p>
-      <w:r>
-        <w:t xml:space="preserve">       )</w:t>
-      </w:r>
-    </w:p>
-    <w:p>
-      <w:r>
-        <w:t>FROM Specialists;</w:t>
-      </w:r>
-    </w:p>
-    <w:p>
-      <w:r>
-        <w:lastRenderedPageBreak/>
-        <w:drawing>
-          <wp:inline distT="0" distB="0" distL="0" distR="0" wp14:anchorId="5C87C94E" wp14:editId="626E497A">
-            <wp:extent cx="5731510" cy="1543050"/>
-            <wp:effectExtent l="0" t="0" r="2540" b="0"/>
-            <wp:docPr id="1165088010" name="Picture 1"/>
-            <wp:cNvGraphicFramePr>
-              <a:graphicFrameLocks xmlns:a="http://schemas.openxmlformats.org/drawingml/2006/main" noChangeAspect="1"/>
-            </wp:cNvGraphicFramePr>
-            <a:graphic xmlns:a="http://schemas.openxmlformats.org/drawingml/2006/main">
-              <a:graphicData uri="http://schemas.openxmlformats.org/drawingml/2006/picture">
-                <pic:pic xmlns:pic="http://schemas.openxmlformats.org/drawingml/2006/picture">
-                  <pic:nvPicPr>
-                    <pic:cNvPr id="1165088010" name=""/>
-                    <pic:cNvPicPr/>
-                  </pic:nvPicPr>
-                  <pic:blipFill>
-                    <a:blip r:embed="rId17"/>
-                    <a:stretch>
-                      <a:fillRect/>
-                    </a:stretch>
-                  </pic:blipFill>
-                  <pic:spPr>
-                    <a:xfrm>
-                      <a:off x="0" y="0"/>
-                      <a:ext cx="5731510" cy="1543050"/>
-                    </a:xfrm>
-                    <a:prstGeom prst="rect">
-                      <a:avLst/>
-                    </a:prstGeom>
-                  </pic:spPr>
-                </pic:pic>
-              </a:graphicData>
-            </a:graphic>
-          </wp:inline>
-        </w:drawing>
-      </w:r>
-    </w:p>
-    <w:p/>
-    <w:p>
-      <w:r>
-        <w:rPr>
-          <w:b/>
-          <w:bCs/>
-        </w:rPr>
-        <w:t>15. Display the next consultation fee for each specialist.</w:t>
-      </w:r>
-    </w:p>
-    <w:p>
-      <w:r>
-        <w:t xml:space="preserve">SELECT </w:t>
-      </w:r>
-      <w:proofErr w:type="spellStart"/>
-      <w:r>
-        <w:t>first_name</w:t>
-      </w:r>
-      <w:proofErr w:type="spellEnd"/>
-      <w:r>
-        <w:t xml:space="preserve">, </w:t>
-      </w:r>
-      <w:proofErr w:type="spellStart"/>
-      <w:r>
-        <w:t>last_name</w:t>
-      </w:r>
-      <w:proofErr w:type="spellEnd"/>
-      <w:r>
-        <w:t xml:space="preserve">, specialization, </w:t>
-      </w:r>
-      <w:proofErr w:type="spellStart"/>
-      <w:r>
-        <w:t>consultation_fee</w:t>
-      </w:r>
-      <w:proofErr w:type="spellEnd"/>
-      <w:r>
-        <w:t>,</w:t>
-      </w:r>
-    </w:p>
-    <w:p>
-      <w:r>
-        <w:t xml:space="preserve">       </w:t>
-      </w:r>
-      <w:proofErr w:type="gramStart"/>
-      <w:r>
-        <w:t>LEAD(</w:t>
-      </w:r>
-      <w:proofErr w:type="spellStart"/>
-      <w:proofErr w:type="gramEnd"/>
-      <w:r>
-        <w:t>consultation_fee</w:t>
-      </w:r>
-      <w:proofErr w:type="spellEnd"/>
-      <w:r>
-        <w:t>) OVER (</w:t>
-      </w:r>
-    </w:p>
-    <w:p>
-      <w:r>
-        <w:t xml:space="preserve">           ORDER BY </w:t>
-      </w:r>
-      <w:proofErr w:type="spellStart"/>
-      <w:r>
-        <w:t>consultation_fee</w:t>
-      </w:r>
-      <w:proofErr w:type="spellEnd"/>
-      <w:r>
-        <w:t xml:space="preserve"> DESC</w:t>
-      </w:r>
-    </w:p>
-    <w:p>
-      <w:r>
-        <w:t xml:space="preserve">       )</w:t>
-      </w:r>
-    </w:p>
-    <w:p>
-      <w:r>
-        <w:t>FROM Specialists;</w:t>
-      </w:r>
-    </w:p>
-    <w:p>
-      <w:r>
-        <w:drawing>
-          <wp:inline distT="0" distB="0" distL="0" distR="0" wp14:anchorId="746AAD25" wp14:editId="0F3234A6">
-            <wp:extent cx="5731510" cy="1494155"/>
-            <wp:effectExtent l="0" t="0" r="2540" b="0"/>
-            <wp:docPr id="242616356" name="Picture 1"/>
-            <wp:cNvGraphicFramePr>
-              <a:graphicFrameLocks xmlns:a="http://schemas.openxmlformats.org/drawingml/2006/main" noChangeAspect="1"/>
-            </wp:cNvGraphicFramePr>
-            <a:graphic xmlns:a="http://schemas.openxmlformats.org/drawingml/2006/main">
-              <a:graphicData uri="http://schemas.openxmlformats.org/drawingml/2006/picture">
-                <pic:pic xmlns:pic="http://schemas.openxmlformats.org/drawingml/2006/picture">
-                  <pic:nvPicPr>
-                    <pic:cNvPr id="242616356" name=""/>
-                    <pic:cNvPicPr/>
-                  </pic:nvPicPr>
-                  <pic:blipFill>
-                    <a:blip r:embed="rId18"/>
-                    <a:stretch>
-                      <a:fillRect/>
-                    </a:stretch>
-                  </pic:blipFill>
-                  <pic:spPr>
-                    <a:xfrm>
-                      <a:off x="0" y="0"/>
-                      <a:ext cx="5731510" cy="1494155"/>
-                    </a:xfrm>
-                    <a:prstGeom prst="rect">
-                      <a:avLst/>
-                    </a:prstGeom>
-                  </pic:spPr>
-                </pic:pic>
-              </a:graphicData>
-            </a:graphic>
-          </wp:inline>
-        </w:drawing>
-      </w:r>
-    </w:p>
-    <w:p/>
+      <w:pPr>
+        <w:rPr>
+          <w:b/>
+          <w:bCs/>
+          <w:sz w:val="28"/>
+          <w:szCs w:val="28"/>
+        </w:rPr>
+      </w:pPr>
+    </w:p>
     <w:sectPr>
       <w:pgSz w:w="11906" w:h="16838"/>
       <w:pgMar w:top="1440" w:right="1440" w:bottom="1440" w:left="1440" w:header="708" w:footer="708" w:gutter="0"/>
@@ -2270,6 +2371,200 @@
     </w:sectPr>
   </w:body>
 </w:document>
+</file>
+
+<file path=word/numbering.xml><?xml version="1.0" encoding="utf-8"?>
+<w:numbering xmlns:wpc="http://schemas.microsoft.com/office/word/2010/wordprocessingCanvas" xmlns:cx="http://schemas.microsoft.com/office/drawing/2014/chartex" xmlns:cx1="http://schemas.microsoft.com/office/drawing/2015/9/8/chartex" xmlns:cx2="http://schemas.microsoft.com/office/drawing/2015/10/21/chartex" xmlns:cx3="http://schemas.microsoft.com/office/drawing/2016/5/9/chartex" xmlns:cx4="http://schemas.microsoft.com/office/drawing/2016/5/10/chartex" xmlns:cx5="http://schemas.microsoft.com/office/drawing/2016/5/11/chartex" xmlns:cx6="http://schemas.microsoft.com/office/drawing/2016/5/12/chartex" xmlns:cx7="http://schemas.microsoft.com/office/drawing/2016/5/13/chartex" xmlns:cx8="http://schemas.microsoft.com/office/drawing/2016/5/14/chartex" xmlns:mc="http://schemas.openxmlformats.org/markup-compatibility/2006" xmlns:aink="http://schemas.microsoft.com/office/drawing/2016/ink" xmlns:am3d="http://schemas.microsoft.com/office/drawing/2017/model3d" xmlns:o="urn:schemas-microsoft-com:office:office" xmlns:oel="http://schemas.microsoft.com/office/2019/extlst" xmlns:r="http://schemas.openxmlformats.org/officeDocument/2006/relationships" xmlns:m="http://schemas.openxmlformats.org/officeDocument/2006/math" xmlns:v="urn:schemas-microsoft-com:vml" xmlns:wp14="http://schemas.microsoft.com/office/word/2010/wordprocessingDrawing" xmlns:wp="http://schemas.openxmlformats.org/drawingml/2006/wordprocessingDrawing" xmlns:w10="urn:schemas-microsoft-com:office:word" xmlns:w="http://schemas.openxmlformats.org/wordprocessingml/2006/main" xmlns:w14="http://schemas.microsoft.com/office/word/2010/wordml" xmlns:w15="http://schemas.microsoft.com/office/word/2012/wordml" xmlns:w16cex="http://schemas.microsoft.com/office/word/2018/wordml/cex" xmlns:w16cid="http://schemas.microsoft.com/office/word/2016/wordml/cid" xmlns:w16="http://schemas.microsoft.com/office/word/2018/wordml" xmlns:w16du="http://schemas.microsoft.com/office/word/2023/wordml/word16du" xmlns:w16sdtdh="http://schemas.microsoft.com/office/word/2020/wordml/sdtdatahash" xmlns:w16sdtfl="http://schemas.microsoft.com/office/word/2024/wordml/sdtformatlock" xmlns:w16se="http://schemas.microsoft.com/office/word/2015/wordml/symex" xmlns:wpg="http://schemas.microsoft.com/office/word/2010/wordprocessingGroup" xmlns:wpi="http://schemas.microsoft.com/office/word/2010/wordprocessingInk" xmlns:wne="http://schemas.microsoft.com/office/word/2006/wordml" xmlns:wps="http://schemas.microsoft.com/office/word/2010/wordprocessingShape" mc:Ignorable="w14 w15 w16se w16cid w16 w16cex w16sdtdh w16sdtfl w16du wp14">
+  <w:abstractNum w:abstractNumId="0" w15:restartNumberingAfterBreak="0">
+    <w:nsid w:val="07770453"/>
+    <w:multiLevelType w:val="hybridMultilevel"/>
+    <w:tmpl w:val="23D6492E"/>
+    <w:lvl w:ilvl="0" w:tplc="B73601F2">
+      <w:start w:val="1"/>
+      <w:numFmt w:val="decimal"/>
+      <w:lvlText w:val="%1."/>
+      <w:lvlJc w:val="left"/>
+      <w:pPr>
+        <w:ind w:left="720" w:hanging="360"/>
+      </w:pPr>
+      <w:rPr>
+        <w:rFonts w:hint="default"/>
+        <w:b/>
+      </w:rPr>
+    </w:lvl>
+    <w:lvl w:ilvl="1" w:tplc="40090019" w:tentative="1">
+      <w:start w:val="1"/>
+      <w:numFmt w:val="lowerLetter"/>
+      <w:lvlText w:val="%2."/>
+      <w:lvlJc w:val="left"/>
+      <w:pPr>
+        <w:ind w:left="1440" w:hanging="360"/>
+      </w:pPr>
+    </w:lvl>
+    <w:lvl w:ilvl="2" w:tplc="4009001B" w:tentative="1">
+      <w:start w:val="1"/>
+      <w:numFmt w:val="lowerRoman"/>
+      <w:lvlText w:val="%3."/>
+      <w:lvlJc w:val="right"/>
+      <w:pPr>
+        <w:ind w:left="2160" w:hanging="180"/>
+      </w:pPr>
+    </w:lvl>
+    <w:lvl w:ilvl="3" w:tplc="4009000F" w:tentative="1">
+      <w:start w:val="1"/>
+      <w:numFmt w:val="decimal"/>
+      <w:lvlText w:val="%4."/>
+      <w:lvlJc w:val="left"/>
+      <w:pPr>
+        <w:ind w:left="2880" w:hanging="360"/>
+      </w:pPr>
+    </w:lvl>
+    <w:lvl w:ilvl="4" w:tplc="40090019" w:tentative="1">
+      <w:start w:val="1"/>
+      <w:numFmt w:val="lowerLetter"/>
+      <w:lvlText w:val="%5."/>
+      <w:lvlJc w:val="left"/>
+      <w:pPr>
+        <w:ind w:left="3600" w:hanging="360"/>
+      </w:pPr>
+    </w:lvl>
+    <w:lvl w:ilvl="5" w:tplc="4009001B" w:tentative="1">
+      <w:start w:val="1"/>
+      <w:numFmt w:val="lowerRoman"/>
+      <w:lvlText w:val="%6."/>
+      <w:lvlJc w:val="right"/>
+      <w:pPr>
+        <w:ind w:left="4320" w:hanging="180"/>
+      </w:pPr>
+    </w:lvl>
+    <w:lvl w:ilvl="6" w:tplc="4009000F" w:tentative="1">
+      <w:start w:val="1"/>
+      <w:numFmt w:val="decimal"/>
+      <w:lvlText w:val="%7."/>
+      <w:lvlJc w:val="left"/>
+      <w:pPr>
+        <w:ind w:left="5040" w:hanging="360"/>
+      </w:pPr>
+    </w:lvl>
+    <w:lvl w:ilvl="7" w:tplc="40090019" w:tentative="1">
+      <w:start w:val="1"/>
+      <w:numFmt w:val="lowerLetter"/>
+      <w:lvlText w:val="%8."/>
+      <w:lvlJc w:val="left"/>
+      <w:pPr>
+        <w:ind w:left="5760" w:hanging="360"/>
+      </w:pPr>
+    </w:lvl>
+    <w:lvl w:ilvl="8" w:tplc="4009001B" w:tentative="1">
+      <w:start w:val="1"/>
+      <w:numFmt w:val="lowerRoman"/>
+      <w:lvlText w:val="%9."/>
+      <w:lvlJc w:val="right"/>
+      <w:pPr>
+        <w:ind w:left="6480" w:hanging="180"/>
+      </w:pPr>
+    </w:lvl>
+  </w:abstractNum>
+  <w:abstractNum w:abstractNumId="1" w15:restartNumberingAfterBreak="0">
+    <w:nsid w:val="1D9C11B1"/>
+    <w:multiLevelType w:val="hybridMultilevel"/>
+    <w:tmpl w:val="FE8CEE8A"/>
+    <w:lvl w:ilvl="0" w:tplc="B5CCF9E6">
+      <w:start w:val="1"/>
+      <w:numFmt w:val="decimal"/>
+      <w:lvlText w:val="%1."/>
+      <w:lvlJc w:val="left"/>
+      <w:pPr>
+        <w:ind w:left="720" w:hanging="360"/>
+      </w:pPr>
+      <w:rPr>
+        <w:rFonts w:hint="default"/>
+        <w:b w:val="0"/>
+        <w:bCs w:val="0"/>
+        <w:sz w:val="24"/>
+        <w:szCs w:val="24"/>
+      </w:rPr>
+    </w:lvl>
+    <w:lvl w:ilvl="1" w:tplc="40090019" w:tentative="1">
+      <w:start w:val="1"/>
+      <w:numFmt w:val="lowerLetter"/>
+      <w:lvlText w:val="%2."/>
+      <w:lvlJc w:val="left"/>
+      <w:pPr>
+        <w:ind w:left="1440" w:hanging="360"/>
+      </w:pPr>
+    </w:lvl>
+    <w:lvl w:ilvl="2" w:tplc="4009001B" w:tentative="1">
+      <w:start w:val="1"/>
+      <w:numFmt w:val="lowerRoman"/>
+      <w:lvlText w:val="%3."/>
+      <w:lvlJc w:val="right"/>
+      <w:pPr>
+        <w:ind w:left="2160" w:hanging="180"/>
+      </w:pPr>
+    </w:lvl>
+    <w:lvl w:ilvl="3" w:tplc="4009000F" w:tentative="1">
+      <w:start w:val="1"/>
+      <w:numFmt w:val="decimal"/>
+      <w:lvlText w:val="%4."/>
+      <w:lvlJc w:val="left"/>
+      <w:pPr>
+        <w:ind w:left="2880" w:hanging="360"/>
+      </w:pPr>
+    </w:lvl>
+    <w:lvl w:ilvl="4" w:tplc="40090019" w:tentative="1">
+      <w:start w:val="1"/>
+      <w:numFmt w:val="lowerLetter"/>
+      <w:lvlText w:val="%5."/>
+      <w:lvlJc w:val="left"/>
+      <w:pPr>
+        <w:ind w:left="3600" w:hanging="360"/>
+      </w:pPr>
+    </w:lvl>
+    <w:lvl w:ilvl="5" w:tplc="4009001B" w:tentative="1">
+      <w:start w:val="1"/>
+      <w:numFmt w:val="lowerRoman"/>
+      <w:lvlText w:val="%6."/>
+      <w:lvlJc w:val="right"/>
+      <w:pPr>
+        <w:ind w:left="4320" w:hanging="180"/>
+      </w:pPr>
+    </w:lvl>
+    <w:lvl w:ilvl="6" w:tplc="4009000F" w:tentative="1">
+      <w:start w:val="1"/>
+      <w:numFmt w:val="decimal"/>
+      <w:lvlText w:val="%7."/>
+      <w:lvlJc w:val="left"/>
+      <w:pPr>
+        <w:ind w:left="5040" w:hanging="360"/>
+      </w:pPr>
+    </w:lvl>
+    <w:lvl w:ilvl="7" w:tplc="40090019" w:tentative="1">
+      <w:start w:val="1"/>
+      <w:numFmt w:val="lowerLetter"/>
+      <w:lvlText w:val="%8."/>
+      <w:lvlJc w:val="left"/>
+      <w:pPr>
+        <w:ind w:left="5760" w:hanging="360"/>
+      </w:pPr>
+    </w:lvl>
+    <w:lvl w:ilvl="8" w:tplc="4009001B" w:tentative="1">
+      <w:start w:val="1"/>
+      <w:numFmt w:val="lowerRoman"/>
+      <w:lvlText w:val="%9."/>
+      <w:lvlJc w:val="right"/>
+      <w:pPr>
+        <w:ind w:left="6480" w:hanging="180"/>
+      </w:pPr>
+    </w:lvl>
+  </w:abstractNum>
+  <w:num w:numId="1" w16cid:durableId="556282633">
+    <w:abstractNumId w:val="1"/>
+  </w:num>
+  <w:num w:numId="2" w16cid:durableId="776215922">
+    <w:abstractNumId w:val="0"/>
+  </w:num>
+</w:numbering>
 </file>
 
 <file path=word/styles.xml><?xml version="1.0" encoding="utf-8"?>
@@ -2875,6 +3170,7 @@
   <w:style w:type="character" w:default="1" w:styleId="DefaultParagraphFont">
     <w:name w:val="Default Paragraph Font"/>
     <w:uiPriority w:val="1"/>
+    <w:semiHidden/>
     <w:unhideWhenUsed/>
   </w:style>
   <w:style w:type="table" w:default="1" w:styleId="TableNormal">

</xml_diff>

<commit_message>
Completed day1 and day2 tasks in python and also updated powerbi dashboard
</commit_message>
<xml_diff>
--- a/SQL/Project/HealthPlus_Care/Health Plus documentation.docx
+++ b/SQL/Project/HealthPlus_Care/Health Plus documentation.docx
@@ -105,40 +105,16 @@
     </w:p>
     <w:p>
       <w:r>
-        <w:t>WHERE email NOT LIKE '%@</w:t>
-      </w:r>
-      <w:proofErr w:type="gramStart"/>
-      <w:r>
-        <w:t>%.%</w:t>
-      </w:r>
-      <w:proofErr w:type="gramEnd"/>
-      <w:r>
-        <w:t>';</w:t>
-      </w:r>
-    </w:p>
-    <w:p>
-      <w:r>
-        <w:rPr>
-          <w:b/>
-          <w:bCs/>
-        </w:rPr>
-        <w:t xml:space="preserve">4. Find claims where </w:t>
-      </w:r>
-      <w:proofErr w:type="spellStart"/>
-      <w:r>
-        <w:rPr>
-          <w:b/>
-          <w:bCs/>
-        </w:rPr>
-        <w:t>consultation_id</w:t>
-      </w:r>
-      <w:proofErr w:type="spellEnd"/>
-      <w:r>
-        <w:rPr>
-          <w:b/>
-          <w:bCs/>
-        </w:rPr>
-        <w:t xml:space="preserve"> is blank.</w:t>
+        <w:t>WHERE email NOT LIKE '%@%.%';</w:t>
+      </w:r>
+    </w:p>
+    <w:p>
+      <w:r>
+        <w:rPr>
+          <w:b/>
+          <w:bCs/>
+        </w:rPr>
+        <w:t>4. Find claims where consultation_id is blank.</w:t>
       </w:r>
     </w:p>
     <w:p>
@@ -153,40 +129,16 @@
     </w:p>
     <w:p>
       <w:r>
-        <w:t xml:space="preserve">WHERE </w:t>
-      </w:r>
-      <w:proofErr w:type="spellStart"/>
-      <w:r>
-        <w:t>consultation_id</w:t>
-      </w:r>
-      <w:proofErr w:type="spellEnd"/>
-      <w:r>
-        <w:t xml:space="preserve"> IS NULL;</w:t>
-      </w:r>
-    </w:p>
-    <w:p>
-      <w:r>
-        <w:rPr>
-          <w:b/>
-          <w:bCs/>
-        </w:rPr>
-        <w:t xml:space="preserve">5. Find claims where </w:t>
-      </w:r>
-      <w:proofErr w:type="spellStart"/>
-      <w:r>
-        <w:rPr>
-          <w:b/>
-          <w:bCs/>
-        </w:rPr>
-        <w:t>insurance_provider</w:t>
-      </w:r>
-      <w:proofErr w:type="spellEnd"/>
-      <w:r>
-        <w:rPr>
-          <w:b/>
-          <w:bCs/>
-        </w:rPr>
-        <w:t xml:space="preserve"> is blank.</w:t>
+        <w:t>WHERE consultation_id IS NULL;</w:t>
+      </w:r>
+    </w:p>
+    <w:p>
+      <w:r>
+        <w:rPr>
+          <w:b/>
+          <w:bCs/>
+        </w:rPr>
+        <w:t>5. Find claims where insurance_provider is blank.</w:t>
       </w:r>
     </w:p>
     <w:p>
@@ -201,40 +153,16 @@
     </w:p>
     <w:p>
       <w:r>
-        <w:t xml:space="preserve">WHERE </w:t>
-      </w:r>
-      <w:proofErr w:type="spellStart"/>
-      <w:r>
-        <w:t>insurance_provider</w:t>
-      </w:r>
-      <w:proofErr w:type="spellEnd"/>
-      <w:r>
-        <w:t xml:space="preserve"> IS NULL;</w:t>
-      </w:r>
-    </w:p>
-    <w:p>
-      <w:r>
-        <w:rPr>
-          <w:b/>
-          <w:bCs/>
-        </w:rPr>
-        <w:t xml:space="preserve">6. Find billing records where </w:t>
-      </w:r>
-      <w:proofErr w:type="spellStart"/>
-      <w:r>
-        <w:rPr>
-          <w:b/>
-          <w:bCs/>
-        </w:rPr>
-        <w:t>consultation_id</w:t>
-      </w:r>
-      <w:proofErr w:type="spellEnd"/>
-      <w:r>
-        <w:rPr>
-          <w:b/>
-          <w:bCs/>
-        </w:rPr>
-        <w:t xml:space="preserve"> is blank.</w:t>
+        <w:t>WHERE insurance_provider IS NULL;</w:t>
+      </w:r>
+    </w:p>
+    <w:p>
+      <w:r>
+        <w:rPr>
+          <w:b/>
+          <w:bCs/>
+        </w:rPr>
+        <w:t>6. Find billing records where consultation_id is blank.</w:t>
       </w:r>
     </w:p>
     <w:p>
@@ -249,40 +177,16 @@
     </w:p>
     <w:p>
       <w:r>
-        <w:t xml:space="preserve">WHERE </w:t>
-      </w:r>
-      <w:proofErr w:type="spellStart"/>
-      <w:r>
-        <w:t>consultation_id</w:t>
-      </w:r>
-      <w:proofErr w:type="spellEnd"/>
-      <w:r>
-        <w:t xml:space="preserve"> IS NULL;</w:t>
-      </w:r>
-    </w:p>
-    <w:p>
-      <w:r>
-        <w:rPr>
-          <w:b/>
-          <w:bCs/>
-        </w:rPr>
-        <w:t xml:space="preserve">7. Find payments where </w:t>
-      </w:r>
-      <w:proofErr w:type="spellStart"/>
-      <w:r>
-        <w:rPr>
-          <w:b/>
-          <w:bCs/>
-        </w:rPr>
-        <w:t>payment_mode</w:t>
-      </w:r>
-      <w:proofErr w:type="spellEnd"/>
-      <w:r>
-        <w:rPr>
-          <w:b/>
-          <w:bCs/>
-        </w:rPr>
-        <w:t xml:space="preserve"> is blank.</w:t>
+        <w:t>WHERE consultation_id IS NULL;</w:t>
+      </w:r>
+    </w:p>
+    <w:p>
+      <w:r>
+        <w:rPr>
+          <w:b/>
+          <w:bCs/>
+        </w:rPr>
+        <w:t>7. Find payments where payment_mode is blank.</w:t>
       </w:r>
     </w:p>
     <w:p>
@@ -298,15 +202,7 @@
     <w:p>
       <w:r>
         <w:lastRenderedPageBreak/>
-        <w:t xml:space="preserve">WHERE </w:t>
-      </w:r>
-      <w:proofErr w:type="spellStart"/>
-      <w:r>
-        <w:t>payment_mode</w:t>
-      </w:r>
-      <w:proofErr w:type="spellEnd"/>
-      <w:r>
-        <w:t xml:space="preserve"> IS NULL;</w:t>
+        <w:t>WHERE payment_mode IS NULL;</w:t>
       </w:r>
     </w:p>
     <w:p/>
@@ -355,15 +251,7 @@
     </w:p>
     <w:p>
       <w:r>
-        <w:t xml:space="preserve">    WHEN LOWER(</w:t>
-      </w:r>
-      <w:proofErr w:type="gramStart"/>
-      <w:r>
-        <w:t>TRIM(</w:t>
-      </w:r>
-      <w:proofErr w:type="gramEnd"/>
-      <w:r>
-        <w:t>gender)) IN ('male', 'm')</w:t>
+        <w:t xml:space="preserve">    WHEN LOWER(TRIM(gender)) IN ('male', 'm')</w:t>
       </w:r>
     </w:p>
     <w:p>
@@ -373,15 +261,7 @@
     </w:p>
     <w:p>
       <w:r>
-        <w:t xml:space="preserve">    WHEN LOWER(</w:t>
-      </w:r>
-      <w:proofErr w:type="gramStart"/>
-      <w:r>
-        <w:t>TRIM(</w:t>
-      </w:r>
-      <w:proofErr w:type="gramEnd"/>
-      <w:r>
-        <w:t>gender)) IN ('female', 'f')</w:t>
+        <w:t xml:space="preserve">    WHEN LOWER(TRIM(gender)) IN ('female', 'f')</w:t>
       </w:r>
     </w:p>
     <w:p>
@@ -430,44 +310,12 @@
     </w:p>
     <w:p>
       <w:r>
-        <w:t xml:space="preserve">    WHEN email LIKE '%</w:t>
-      </w:r>
-      <w:proofErr w:type="spellStart"/>
-      <w:r>
-        <w:t>gmail</w:t>
-      </w:r>
-      <w:proofErr w:type="spellEnd"/>
-      <w:r>
-        <w:t>' AND email NOT LIKE '%@%'</w:t>
-      </w:r>
-    </w:p>
-    <w:p>
-      <w:r>
-        <w:t xml:space="preserve">        THEN </w:t>
-      </w:r>
-      <w:proofErr w:type="gramStart"/>
-      <w:r>
-        <w:t>REPLACE(</w:t>
-      </w:r>
-      <w:proofErr w:type="gramEnd"/>
-      <w:r>
-        <w:t>email, '</w:t>
-      </w:r>
-      <w:proofErr w:type="spellStart"/>
-      <w:r>
-        <w:t>gmail</w:t>
-      </w:r>
-      <w:proofErr w:type="spellEnd"/>
-      <w:r>
-        <w:t>', '@</w:t>
-      </w:r>
-      <w:proofErr w:type="spellStart"/>
-      <w:r>
-        <w:t>gmail</w:t>
-      </w:r>
-      <w:proofErr w:type="spellEnd"/>
-      <w:r>
-        <w:t>')</w:t>
+        <w:t xml:space="preserve">    WHEN email LIKE '%gmail' AND email NOT LIKE '%@%'</w:t>
+      </w:r>
+    </w:p>
+    <w:p>
+      <w:r>
+        <w:t xml:space="preserve">        THEN REPLACE(email, 'gmail', '@gmail')</w:t>
       </w:r>
     </w:p>
     <w:p>
@@ -477,15 +325,7 @@
     </w:p>
     <w:p>
       <w:r>
-        <w:t>WHERE email NOT LIKE '%@</w:t>
-      </w:r>
-      <w:proofErr w:type="gramStart"/>
-      <w:r>
-        <w:t>%.%</w:t>
-      </w:r>
-      <w:proofErr w:type="gramEnd"/>
-      <w:r>
-        <w:t>';</w:t>
+        <w:t>WHERE email NOT LIKE '%@%.%';</w:t>
       </w:r>
     </w:p>
     <w:p>
@@ -528,23 +368,7 @@
     </w:p>
     <w:p>
       <w:r>
-        <w:t xml:space="preserve">SELECT </w:t>
-      </w:r>
-      <w:proofErr w:type="spellStart"/>
-      <w:r>
-        <w:t>membership_type</w:t>
-      </w:r>
-      <w:proofErr w:type="spellEnd"/>
-      <w:r>
-        <w:t xml:space="preserve">, gender, </w:t>
-      </w:r>
-      <w:proofErr w:type="gramStart"/>
-      <w:r>
-        <w:t>COUNT(</w:t>
-      </w:r>
-      <w:proofErr w:type="gramEnd"/>
-      <w:r>
-        <w:t>*)</w:t>
+        <w:t>SELECT membership_type, gender, COUNT(*)</w:t>
       </w:r>
     </w:p>
     <w:p>
@@ -555,33 +379,12 @@
     <w:p>
       <w:r>
         <w:lastRenderedPageBreak/>
-        <w:t xml:space="preserve">GROUP BY </w:t>
-      </w:r>
-      <w:proofErr w:type="spellStart"/>
-      <w:r>
-        <w:t>membership_type</w:t>
-      </w:r>
-      <w:proofErr w:type="spellEnd"/>
-      <w:r>
-        <w:t>, gender</w:t>
-      </w:r>
-    </w:p>
-    <w:p>
-      <w:r>
-        <w:t xml:space="preserve">ORDER BY </w:t>
-      </w:r>
-      <w:proofErr w:type="gramStart"/>
-      <w:r>
-        <w:t>COUNT(</w:t>
-      </w:r>
-      <w:proofErr w:type="spellStart"/>
-      <w:proofErr w:type="gramEnd"/>
-      <w:r>
-        <w:t>member_id</w:t>
-      </w:r>
-      <w:proofErr w:type="spellEnd"/>
-      <w:r>
-        <w:t>) DESC;</w:t>
+        <w:t>GROUP BY membership_type, gender</w:t>
+      </w:r>
+    </w:p>
+    <w:p>
+      <w:r>
+        <w:t>ORDER BY COUNT(member_id) DESC;</w:t>
       </w:r>
     </w:p>
     <w:p>
@@ -638,21 +441,8 @@
     </w:p>
     <w:p>
       <w:r>
-        <w:t xml:space="preserve">SELECT city, </w:t>
-      </w:r>
-      <w:proofErr w:type="gramStart"/>
-      <w:r>
-        <w:t>COUNT(</w:t>
-      </w:r>
-      <w:proofErr w:type="gramEnd"/>
-      <w:r>
-        <w:t xml:space="preserve">*) AS </w:t>
-      </w:r>
-      <w:proofErr w:type="spellStart"/>
-      <w:r>
-        <w:t>total_members</w:t>
-      </w:r>
-      <w:proofErr w:type="spellEnd"/>
+        <w:t>SELECT city, COUNT(*) AS total_members</w:t>
+      </w:r>
     </w:p>
     <w:p>
       <w:r>
@@ -666,15 +456,7 @@
     </w:p>
     <w:p>
       <w:r>
-        <w:t xml:space="preserve">ORDER BY </w:t>
-      </w:r>
-      <w:proofErr w:type="spellStart"/>
-      <w:r>
-        <w:t>total_members</w:t>
-      </w:r>
-      <w:proofErr w:type="spellEnd"/>
-      <w:r>
-        <w:t xml:space="preserve"> DESC;</w:t>
+        <w:t>ORDER BY total_members DESC;</w:t>
       </w:r>
     </w:p>
     <w:p>
@@ -736,151 +518,33 @@
     </w:p>
     <w:p>
       <w:r>
-        <w:t xml:space="preserve">    </w:t>
-      </w:r>
-      <w:proofErr w:type="gramStart"/>
-      <w:r>
-        <w:t>COUNT(</w:t>
-      </w:r>
-      <w:proofErr w:type="gramEnd"/>
-      <w:r>
-        <w:t xml:space="preserve">*) AS </w:t>
-      </w:r>
-      <w:proofErr w:type="spellStart"/>
-      <w:r>
-        <w:t>total_bills</w:t>
-      </w:r>
-      <w:proofErr w:type="spellEnd"/>
-      <w:r>
-        <w:t>,</w:t>
-      </w:r>
-    </w:p>
-    <w:p>
-      <w:r>
-        <w:t xml:space="preserve">    ROUND(</w:t>
-      </w:r>
-      <w:proofErr w:type="gramStart"/>
-      <w:r>
-        <w:t>SUM(</w:t>
-      </w:r>
-      <w:proofErr w:type="spellStart"/>
-      <w:proofErr w:type="gramEnd"/>
-      <w:r>
-        <w:t>total_amount</w:t>
-      </w:r>
-      <w:proofErr w:type="spellEnd"/>
-      <w:r>
-        <w:t xml:space="preserve">), 2) AS </w:t>
-      </w:r>
-      <w:proofErr w:type="spellStart"/>
-      <w:r>
-        <w:t>total_revenue</w:t>
-      </w:r>
-      <w:proofErr w:type="spellEnd"/>
-      <w:r>
-        <w:t>,</w:t>
-      </w:r>
-    </w:p>
-    <w:p>
-      <w:r>
-        <w:t xml:space="preserve">    ROUND(</w:t>
-      </w:r>
-      <w:proofErr w:type="gramStart"/>
-      <w:r>
-        <w:t>AVG(</w:t>
-      </w:r>
-      <w:proofErr w:type="spellStart"/>
-      <w:proofErr w:type="gramEnd"/>
-      <w:r>
-        <w:t>total_amount</w:t>
-      </w:r>
-      <w:proofErr w:type="spellEnd"/>
-      <w:r>
-        <w:t xml:space="preserve">), 2) AS </w:t>
-      </w:r>
-      <w:proofErr w:type="spellStart"/>
-      <w:r>
-        <w:t>average_bill_value</w:t>
-      </w:r>
-      <w:proofErr w:type="spellEnd"/>
-      <w:r>
-        <w:t>,</w:t>
-      </w:r>
-    </w:p>
-    <w:p>
-      <w:r>
-        <w:t xml:space="preserve">    ROUND(</w:t>
-      </w:r>
-      <w:proofErr w:type="gramStart"/>
-      <w:r>
-        <w:t>SUM(</w:t>
-      </w:r>
-      <w:proofErr w:type="spellStart"/>
-      <w:proofErr w:type="gramEnd"/>
-      <w:r>
-        <w:t>consultation_charges</w:t>
-      </w:r>
-      <w:proofErr w:type="spellEnd"/>
-      <w:r>
-        <w:t xml:space="preserve">), 2) AS </w:t>
-      </w:r>
-      <w:proofErr w:type="spellStart"/>
-      <w:r>
-        <w:t>consultation_revenue</w:t>
-      </w:r>
-      <w:proofErr w:type="spellEnd"/>
-      <w:r>
-        <w:t>,</w:t>
-      </w:r>
-    </w:p>
-    <w:p>
-      <w:r>
-        <w:t xml:space="preserve">    ROUND(</w:t>
-      </w:r>
-      <w:proofErr w:type="gramStart"/>
-      <w:r>
-        <w:t>SUM(</w:t>
-      </w:r>
-      <w:proofErr w:type="spellStart"/>
-      <w:proofErr w:type="gramEnd"/>
-      <w:r>
-        <w:t>lab_charges</w:t>
-      </w:r>
-      <w:proofErr w:type="spellEnd"/>
-      <w:r>
-        <w:t xml:space="preserve">), 2) AS </w:t>
-      </w:r>
-      <w:proofErr w:type="spellStart"/>
-      <w:r>
-        <w:t>lab_revenue</w:t>
-      </w:r>
-      <w:proofErr w:type="spellEnd"/>
-      <w:r>
-        <w:t>,</w:t>
-      </w:r>
-    </w:p>
-    <w:p>
-      <w:r>
-        <w:t xml:space="preserve">    ROUND(</w:t>
-      </w:r>
-      <w:proofErr w:type="gramStart"/>
-      <w:r>
-        <w:t>SUM(</w:t>
-      </w:r>
-      <w:proofErr w:type="spellStart"/>
-      <w:proofErr w:type="gramEnd"/>
-      <w:r>
-        <w:t>medicine_charges</w:t>
-      </w:r>
-      <w:proofErr w:type="spellEnd"/>
-      <w:r>
-        <w:t xml:space="preserve">), 2) AS </w:t>
-      </w:r>
-      <w:proofErr w:type="spellStart"/>
-      <w:r>
-        <w:t>medicine_revenue</w:t>
-      </w:r>
-      <w:proofErr w:type="spellEnd"/>
+        <w:t xml:space="preserve">    COUNT(*) AS total_bills,</w:t>
+      </w:r>
+    </w:p>
+    <w:p>
+      <w:r>
+        <w:t xml:space="preserve">    ROUND(SUM(total_amount), 2) AS total_revenue,</w:t>
+      </w:r>
+    </w:p>
+    <w:p>
+      <w:r>
+        <w:t xml:space="preserve">    ROUND(AVG(total_amount), 2) AS average_bill_value,</w:t>
+      </w:r>
+    </w:p>
+    <w:p>
+      <w:r>
+        <w:t xml:space="preserve">    ROUND(SUM(consultation_charges), 2) AS consultation_revenue,</w:t>
+      </w:r>
+    </w:p>
+    <w:p>
+      <w:r>
+        <w:t xml:space="preserve">    ROUND(SUM(lab_charges), 2) AS lab_revenue,</w:t>
+      </w:r>
+    </w:p>
+    <w:p>
+      <w:r>
+        <w:t xml:space="preserve">    ROUND(SUM(medicine_charges), 2) AS medicine_revenue</w:t>
+      </w:r>
     </w:p>
     <w:p>
       <w:r>
@@ -937,7 +601,14 @@
           <w:b/>
           <w:bCs/>
         </w:rPr>
-        <w:t>6. What is the highest and lowest billing amount?</w:t>
+        <w:t>4</w:t>
+      </w:r>
+      <w:r>
+        <w:rPr>
+          <w:b/>
+          <w:bCs/>
+        </w:rPr>
+        <w:t>. What is the highest and lowest billing amount?</w:t>
       </w:r>
     </w:p>
     <w:p>
@@ -947,52 +618,13 @@
     </w:p>
     <w:p>
       <w:r>
-        <w:t xml:space="preserve">    </w:t>
-      </w:r>
-      <w:proofErr w:type="gramStart"/>
-      <w:r>
-        <w:t>MAX(</w:t>
-      </w:r>
-      <w:proofErr w:type="spellStart"/>
-      <w:proofErr w:type="gramEnd"/>
-      <w:r>
-        <w:t>total_amount</w:t>
-      </w:r>
-      <w:proofErr w:type="spellEnd"/>
-      <w:r>
-        <w:t xml:space="preserve">) AS </w:t>
-      </w:r>
-      <w:proofErr w:type="spellStart"/>
-      <w:r>
-        <w:t>Highest_Bill</w:t>
-      </w:r>
-      <w:proofErr w:type="spellEnd"/>
-      <w:r>
-        <w:t>,</w:t>
-      </w:r>
-    </w:p>
-    <w:p>
-      <w:r>
-        <w:t xml:space="preserve">    </w:t>
-      </w:r>
-      <w:proofErr w:type="gramStart"/>
-      <w:r>
-        <w:t>MIN(</w:t>
-      </w:r>
-      <w:proofErr w:type="spellStart"/>
-      <w:proofErr w:type="gramEnd"/>
-      <w:r>
-        <w:t>total_amount</w:t>
-      </w:r>
-      <w:proofErr w:type="spellEnd"/>
-      <w:r>
-        <w:t xml:space="preserve">) AS </w:t>
-      </w:r>
-      <w:proofErr w:type="spellStart"/>
-      <w:r>
-        <w:t>Lowest_Bill</w:t>
-      </w:r>
-      <w:proofErr w:type="spellEnd"/>
+        <w:t xml:space="preserve">    MAX(total_amount) AS Highest_Bill,</w:t>
+      </w:r>
+    </w:p>
+    <w:p>
+      <w:r>
+        <w:t xml:space="preserve">    MIN(total_amount) AS Lowest_Bill</w:t>
+      </w:r>
     </w:p>
     <w:p>
       <w:r>
@@ -1048,39 +680,20 @@
           <w:b/>
           <w:bCs/>
         </w:rPr>
-        <w:t>7. How many members are there in each membership type?</w:t>
-      </w:r>
-    </w:p>
-    <w:p>
-      <w:r>
-        <w:t xml:space="preserve">SELECT </w:t>
-      </w:r>
-      <w:proofErr w:type="spellStart"/>
-      <w:r>
-        <w:t>membership_type</w:t>
-      </w:r>
-      <w:proofErr w:type="spellEnd"/>
-      <w:r>
-        <w:t xml:space="preserve">, </w:t>
-      </w:r>
-      <w:proofErr w:type="gramStart"/>
-      <w:r>
-        <w:t>COUNT(</w:t>
-      </w:r>
-      <w:proofErr w:type="spellStart"/>
-      <w:proofErr w:type="gramEnd"/>
-      <w:r>
-        <w:t>member_id</w:t>
-      </w:r>
-      <w:proofErr w:type="spellEnd"/>
-      <w:r>
-        <w:t xml:space="preserve">) AS </w:t>
-      </w:r>
-      <w:proofErr w:type="spellStart"/>
-      <w:r>
-        <w:t>Total_Members</w:t>
-      </w:r>
-      <w:proofErr w:type="spellEnd"/>
+        <w:t>5</w:t>
+      </w:r>
+      <w:r>
+        <w:rPr>
+          <w:b/>
+          <w:bCs/>
+        </w:rPr>
+        <w:t>. How many members are there in each membership type?</w:t>
+      </w:r>
+    </w:p>
+    <w:p>
+      <w:r>
+        <w:t>SELECT membership_type, COUNT(member_id) AS Total_Members</w:t>
+      </w:r>
     </w:p>
     <w:p>
       <w:r>
@@ -1089,15 +702,7 @@
     </w:p>
     <w:p>
       <w:r>
-        <w:t xml:space="preserve">GROUP BY </w:t>
-      </w:r>
-      <w:proofErr w:type="spellStart"/>
-      <w:r>
-        <w:t>membership_type</w:t>
-      </w:r>
-      <w:proofErr w:type="spellEnd"/>
-      <w:r>
-        <w:t>;</w:t>
+        <w:t>GROUP BY membership_type;</w:t>
       </w:r>
     </w:p>
     <w:p/>
@@ -1150,39 +755,20 @@
           <w:b/>
           <w:bCs/>
         </w:rPr>
-        <w:t>8. How many consultations are there for each consultation mode?</w:t>
-      </w:r>
-    </w:p>
-    <w:p>
-      <w:r>
-        <w:t xml:space="preserve">SELECT </w:t>
-      </w:r>
-      <w:proofErr w:type="spellStart"/>
-      <w:r>
-        <w:t>consultation_mode</w:t>
-      </w:r>
-      <w:proofErr w:type="spellEnd"/>
-      <w:r>
-        <w:t xml:space="preserve">, </w:t>
-      </w:r>
-      <w:proofErr w:type="gramStart"/>
-      <w:r>
-        <w:t>COUNT(</w:t>
-      </w:r>
-      <w:proofErr w:type="spellStart"/>
-      <w:proofErr w:type="gramEnd"/>
-      <w:r>
-        <w:t>consultation_id</w:t>
-      </w:r>
-      <w:proofErr w:type="spellEnd"/>
-      <w:r>
-        <w:t xml:space="preserve">) AS </w:t>
-      </w:r>
-      <w:proofErr w:type="spellStart"/>
-      <w:r>
-        <w:t>Total_Consultations</w:t>
-      </w:r>
-      <w:proofErr w:type="spellEnd"/>
+        <w:t>6</w:t>
+      </w:r>
+      <w:r>
+        <w:rPr>
+          <w:b/>
+          <w:bCs/>
+        </w:rPr>
+        <w:t>. How many consultations are there for each consultation mode?</w:t>
+      </w:r>
+    </w:p>
+    <w:p>
+      <w:r>
+        <w:t>SELECT consultation_mode, COUNT(consultation_id) AS Total_Consultations</w:t>
+      </w:r>
     </w:p>
     <w:p>
       <w:r>
@@ -1191,15 +777,7 @@
     </w:p>
     <w:p>
       <w:r>
-        <w:t xml:space="preserve">GROUP BY </w:t>
-      </w:r>
-      <w:proofErr w:type="spellStart"/>
-      <w:r>
-        <w:t>consultation_mode</w:t>
-      </w:r>
-      <w:proofErr w:type="spellEnd"/>
-      <w:r>
-        <w:t>;</w:t>
+        <w:t>GROUP BY consultation_mode;</w:t>
       </w:r>
     </w:p>
     <w:p>
@@ -1251,32 +829,21 @@
           <w:b/>
           <w:bCs/>
         </w:rPr>
-        <w:t>9. How many consultations are there for each consultation status?</w:t>
+        <w:t>7</w:t>
+      </w:r>
+      <w:r>
+        <w:rPr>
+          <w:b/>
+          <w:bCs/>
+        </w:rPr>
+        <w:t>. How many consultations are there for each consultation status?</w:t>
       </w:r>
     </w:p>
     <w:p>
       <w:r>
         <w:lastRenderedPageBreak/>
-        <w:t xml:space="preserve">SELECT status, </w:t>
-      </w:r>
-      <w:proofErr w:type="gramStart"/>
-      <w:r>
-        <w:t>COUNT(</w:t>
-      </w:r>
-      <w:proofErr w:type="spellStart"/>
-      <w:proofErr w:type="gramEnd"/>
-      <w:r>
-        <w:t>consultation_id</w:t>
-      </w:r>
-      <w:proofErr w:type="spellEnd"/>
-      <w:r>
-        <w:t xml:space="preserve">) AS </w:t>
-      </w:r>
-      <w:proofErr w:type="spellStart"/>
-      <w:r>
-        <w:t>Total_Consultations</w:t>
-      </w:r>
-      <w:proofErr w:type="spellEnd"/>
+        <w:t>SELECT status, COUNT(consultation_id) AS Total_Consultations</w:t>
+      </w:r>
     </w:p>
     <w:p>
       <w:r>
@@ -1337,41 +904,20 @@
           <w:b/>
           <w:bCs/>
         </w:rPr>
-        <w:t>10. Which specializations have more than 100 consultations?</w:t>
-      </w:r>
-    </w:p>
-    <w:p>
-      <w:r>
-        <w:t xml:space="preserve">SELECT </w:t>
-      </w:r>
-      <w:proofErr w:type="spellStart"/>
-      <w:proofErr w:type="gramStart"/>
-      <w:r>
-        <w:t>s.specialization</w:t>
-      </w:r>
-      <w:proofErr w:type="spellEnd"/>
-      <w:proofErr w:type="gramEnd"/>
-      <w:r>
-        <w:t>, COUNT(</w:t>
-      </w:r>
-      <w:proofErr w:type="spellStart"/>
-      <w:proofErr w:type="gramStart"/>
-      <w:r>
-        <w:t>c.consultation</w:t>
-      </w:r>
-      <w:proofErr w:type="gramEnd"/>
-      <w:r>
-        <w:t>_id</w:t>
-      </w:r>
-      <w:proofErr w:type="spellEnd"/>
-      <w:r>
-        <w:t xml:space="preserve">) AS </w:t>
-      </w:r>
-      <w:proofErr w:type="spellStart"/>
-      <w:r>
-        <w:t>Total_Consultations</w:t>
-      </w:r>
-      <w:proofErr w:type="spellEnd"/>
+        <w:t>8</w:t>
+      </w:r>
+      <w:r>
+        <w:rPr>
+          <w:b/>
+          <w:bCs/>
+        </w:rPr>
+        <w:t>. Which specializations have more than 100 consultations?</w:t>
+      </w:r>
+    </w:p>
+    <w:p>
+      <w:r>
+        <w:t>SELECT s.specialization, COUNT(c.consultation_id) AS Total_Consultations</w:t>
+      </w:r>
     </w:p>
     <w:p>
       <w:r>
@@ -1385,73 +931,22 @@
     </w:p>
     <w:p>
       <w:r>
-        <w:t xml:space="preserve">    ON </w:t>
-      </w:r>
-      <w:proofErr w:type="spellStart"/>
-      <w:proofErr w:type="gramStart"/>
-      <w:r>
-        <w:t>s.specialist</w:t>
-      </w:r>
-      <w:proofErr w:type="gramEnd"/>
-      <w:r>
-        <w:t>_id</w:t>
-      </w:r>
-      <w:proofErr w:type="spellEnd"/>
-      <w:r>
-        <w:t xml:space="preserve"> = </w:t>
-      </w:r>
-      <w:proofErr w:type="spellStart"/>
-      <w:proofErr w:type="gramStart"/>
-      <w:r>
-        <w:t>c.specialist</w:t>
-      </w:r>
-      <w:proofErr w:type="gramEnd"/>
-      <w:r>
-        <w:t>_id</w:t>
-      </w:r>
-      <w:proofErr w:type="spellEnd"/>
-    </w:p>
-    <w:p>
-      <w:r>
-        <w:t xml:space="preserve">GROUP BY </w:t>
-      </w:r>
-      <w:proofErr w:type="spellStart"/>
-      <w:proofErr w:type="gramStart"/>
-      <w:r>
-        <w:t>s.specialization</w:t>
-      </w:r>
-      <w:proofErr w:type="spellEnd"/>
-      <w:proofErr w:type="gramEnd"/>
-    </w:p>
-    <w:p>
-      <w:r>
-        <w:t>HAVING COUNT(</w:t>
-      </w:r>
-      <w:proofErr w:type="spellStart"/>
-      <w:proofErr w:type="gramStart"/>
-      <w:r>
-        <w:t>c.consultation</w:t>
-      </w:r>
-      <w:proofErr w:type="gramEnd"/>
-      <w:r>
-        <w:t>_id</w:t>
-      </w:r>
-      <w:proofErr w:type="spellEnd"/>
-      <w:r>
-        <w:t>) &gt; 100</w:t>
-      </w:r>
-    </w:p>
-    <w:p>
-      <w:r>
-        <w:t xml:space="preserve">ORDER BY </w:t>
-      </w:r>
-      <w:proofErr w:type="spellStart"/>
-      <w:r>
-        <w:t>Total_Consultations</w:t>
-      </w:r>
-      <w:proofErr w:type="spellEnd"/>
-      <w:r>
-        <w:t xml:space="preserve"> DESC;</w:t>
+        <w:t xml:space="preserve">    ON s.specialist_id = c.specialist_id</w:t>
+      </w:r>
+    </w:p>
+    <w:p>
+      <w:r>
+        <w:t>GROUP BY s.specialization</w:t>
+      </w:r>
+    </w:p>
+    <w:p>
+      <w:r>
+        <w:t>HAVING COUNT(c.consultation_id) &gt; 100</w:t>
+      </w:r>
+    </w:p>
+    <w:p>
+      <w:r>
+        <w:t>ORDER BY Total_Consultations DESC;</w:t>
       </w:r>
     </w:p>
     <w:p>
@@ -1503,44 +998,20 @@
           <w:b/>
           <w:bCs/>
         </w:rPr>
-        <w:t>11. Which are the top 5 clinics based on the number of consultations?</w:t>
-      </w:r>
-    </w:p>
-    <w:p>
-      <w:r>
-        <w:t xml:space="preserve">SELECT </w:t>
-      </w:r>
-      <w:proofErr w:type="spellStart"/>
-      <w:proofErr w:type="gramStart"/>
-      <w:r>
-        <w:t>cl.clinic</w:t>
-      </w:r>
-      <w:proofErr w:type="gramEnd"/>
-      <w:r>
-        <w:t>_name</w:t>
-      </w:r>
-      <w:proofErr w:type="spellEnd"/>
-      <w:r>
-        <w:t>, COUNT(</w:t>
-      </w:r>
-      <w:proofErr w:type="spellStart"/>
-      <w:proofErr w:type="gramStart"/>
-      <w:r>
-        <w:t>c.consultation</w:t>
-      </w:r>
-      <w:proofErr w:type="gramEnd"/>
-      <w:r>
-        <w:t>_id</w:t>
-      </w:r>
-      <w:proofErr w:type="spellEnd"/>
-      <w:r>
-        <w:t xml:space="preserve">) AS </w:t>
-      </w:r>
-      <w:proofErr w:type="spellStart"/>
-      <w:r>
-        <w:t>Total_Consultations</w:t>
-      </w:r>
-      <w:proofErr w:type="spellEnd"/>
+        <w:t>9</w:t>
+      </w:r>
+      <w:r>
+        <w:rPr>
+          <w:b/>
+          <w:bCs/>
+        </w:rPr>
+        <w:t>. Which are the top 5 clinics based on the number of consultations?</w:t>
+      </w:r>
+    </w:p>
+    <w:p>
+      <w:r>
+        <w:t>SELECT cl.clinic_name, COUNT(c.consultation_id) AS Total_Consultations</w:t>
+      </w:r>
     </w:p>
     <w:p>
       <w:r>
@@ -1554,59 +1025,18 @@
     </w:p>
     <w:p>
       <w:r>
-        <w:t xml:space="preserve">    ON </w:t>
-      </w:r>
-      <w:proofErr w:type="spellStart"/>
-      <w:proofErr w:type="gramStart"/>
-      <w:r>
-        <w:t>cl.clinic</w:t>
-      </w:r>
-      <w:proofErr w:type="gramEnd"/>
-      <w:r>
-        <w:t>_id</w:t>
-      </w:r>
-      <w:proofErr w:type="spellEnd"/>
-      <w:r>
-        <w:t xml:space="preserve"> = </w:t>
-      </w:r>
-      <w:proofErr w:type="spellStart"/>
-      <w:proofErr w:type="gramStart"/>
-      <w:r>
-        <w:t>c.clinic</w:t>
-      </w:r>
-      <w:proofErr w:type="gramEnd"/>
-      <w:r>
-        <w:t>_id</w:t>
-      </w:r>
-      <w:proofErr w:type="spellEnd"/>
-    </w:p>
-    <w:p>
-      <w:r>
-        <w:t xml:space="preserve">GROUP BY </w:t>
-      </w:r>
-      <w:proofErr w:type="spellStart"/>
-      <w:proofErr w:type="gramStart"/>
-      <w:r>
-        <w:t>cl.clinic</w:t>
-      </w:r>
-      <w:proofErr w:type="gramEnd"/>
-      <w:r>
-        <w:t>_name</w:t>
-      </w:r>
-      <w:proofErr w:type="spellEnd"/>
+        <w:t xml:space="preserve">    ON cl.clinic_id = c.clinic_id</w:t>
+      </w:r>
+    </w:p>
+    <w:p>
+      <w:r>
+        <w:t>GROUP BY cl.clinic_name</w:t>
+      </w:r>
     </w:p>
     <w:p>
       <w:r>
         <w:lastRenderedPageBreak/>
-        <w:t xml:space="preserve">ORDER BY </w:t>
-      </w:r>
-      <w:proofErr w:type="spellStart"/>
-      <w:r>
-        <w:t>Total_Consultations</w:t>
-      </w:r>
-      <w:proofErr w:type="spellEnd"/>
-      <w:r>
-        <w:t xml:space="preserve"> DESC</w:t>
+        <w:t>ORDER BY Total_Consultations DESC</w:t>
       </w:r>
     </w:p>
     <w:p>
@@ -1663,73 +1093,42 @@
           <w:b/>
           <w:bCs/>
         </w:rPr>
-        <w:t>12. Rank specialists based on consultation fee from highest to lowest.</w:t>
-      </w:r>
-    </w:p>
-    <w:p>
-      <w:r>
-        <w:t xml:space="preserve">SELECT </w:t>
-      </w:r>
-      <w:proofErr w:type="spellStart"/>
-      <w:r>
-        <w:t>first_name</w:t>
-      </w:r>
-      <w:proofErr w:type="spellEnd"/>
-      <w:r>
-        <w:t xml:space="preserve">, </w:t>
-      </w:r>
-      <w:proofErr w:type="spellStart"/>
-      <w:r>
-        <w:t>last_name</w:t>
-      </w:r>
-      <w:proofErr w:type="spellEnd"/>
-      <w:r>
-        <w:t xml:space="preserve">, specialization, </w:t>
-      </w:r>
-      <w:proofErr w:type="spellStart"/>
-      <w:r>
-        <w:t>consultation_fee</w:t>
-      </w:r>
-      <w:proofErr w:type="spellEnd"/>
-      <w:r>
-        <w:t>,</w:t>
-      </w:r>
-    </w:p>
-    <w:p>
-      <w:r>
-        <w:t xml:space="preserve">       ROW_</w:t>
-      </w:r>
-      <w:proofErr w:type="gramStart"/>
-      <w:r>
-        <w:t>NUMBER(</w:t>
-      </w:r>
-      <w:proofErr w:type="gramEnd"/>
-      <w:r>
-        <w:t>) OVER (</w:t>
-      </w:r>
-    </w:p>
-    <w:p>
-      <w:r>
-        <w:t xml:space="preserve">           ORDER BY </w:t>
-      </w:r>
-      <w:proofErr w:type="spellStart"/>
-      <w:r>
-        <w:t>consultation_fee</w:t>
-      </w:r>
-      <w:proofErr w:type="spellEnd"/>
-      <w:r>
-        <w:t xml:space="preserve"> DESC</w:t>
-      </w:r>
-    </w:p>
-    <w:p>
-      <w:r>
-        <w:t xml:space="preserve">       ) AS </w:t>
-      </w:r>
-      <w:proofErr w:type="spellStart"/>
-      <w:r>
-        <w:t>rnk</w:t>
-      </w:r>
-      <w:proofErr w:type="spellEnd"/>
+        <w:t>1</w:t>
+      </w:r>
+      <w:r>
+        <w:rPr>
+          <w:b/>
+          <w:bCs/>
+        </w:rPr>
+        <w:t>0</w:t>
+      </w:r>
+      <w:r>
+        <w:rPr>
+          <w:b/>
+          <w:bCs/>
+        </w:rPr>
+        <w:t>. Rank specialists based on consultation fee from highest to lowest.</w:t>
+      </w:r>
+    </w:p>
+    <w:p>
+      <w:r>
+        <w:t>SELECT first_name, last_name, specialization, consultation_fee,</w:t>
+      </w:r>
+    </w:p>
+    <w:p>
+      <w:r>
+        <w:t xml:space="preserve">       ROW_NUMBER() OVER (</w:t>
+      </w:r>
+    </w:p>
+    <w:p>
+      <w:r>
+        <w:t xml:space="preserve">           ORDER BY consultation_fee DESC</w:t>
+      </w:r>
+    </w:p>
+    <w:p>
+      <w:r>
+        <w:t xml:space="preserve">       ) AS rnk</w:t>
+      </w:r>
     </w:p>
     <w:p>
       <w:r>
@@ -1785,49 +1184,31 @@
           <w:b/>
           <w:bCs/>
         </w:rPr>
-        <w:t>13. Rank specialists based on consultation fee within each specialization.</w:t>
-      </w:r>
-    </w:p>
-    <w:p>
-      <w:r>
-        <w:t xml:space="preserve">SELECT </w:t>
-      </w:r>
-      <w:proofErr w:type="spellStart"/>
-      <w:r>
-        <w:t>first_name</w:t>
-      </w:r>
-      <w:proofErr w:type="spellEnd"/>
-      <w:r>
-        <w:t xml:space="preserve">, </w:t>
-      </w:r>
-      <w:proofErr w:type="spellStart"/>
-      <w:r>
-        <w:t>last_name</w:t>
-      </w:r>
-      <w:proofErr w:type="spellEnd"/>
-      <w:r>
-        <w:t xml:space="preserve">, specialization, </w:t>
-      </w:r>
-      <w:proofErr w:type="spellStart"/>
-      <w:r>
-        <w:t>consultation_fee</w:t>
-      </w:r>
-      <w:proofErr w:type="spellEnd"/>
-      <w:r>
-        <w:t>,</w:t>
-      </w:r>
-    </w:p>
-    <w:p>
-      <w:r>
-        <w:t xml:space="preserve">       ROW_</w:t>
-      </w:r>
-      <w:proofErr w:type="gramStart"/>
-      <w:r>
-        <w:t>NUMBER(</w:t>
-      </w:r>
-      <w:proofErr w:type="gramEnd"/>
-      <w:r>
-        <w:t>) OVER (</w:t>
+        <w:t>1</w:t>
+      </w:r>
+      <w:r>
+        <w:rPr>
+          <w:b/>
+          <w:bCs/>
+        </w:rPr>
+        <w:t>1</w:t>
+      </w:r>
+      <w:r>
+        <w:rPr>
+          <w:b/>
+          <w:bCs/>
+        </w:rPr>
+        <w:t>. Rank specialists based on consultation fee within each specialization.</w:t>
+      </w:r>
+    </w:p>
+    <w:p>
+      <w:r>
+        <w:t>SELECT first_name, last_name, specialization, consultation_fee,</w:t>
+      </w:r>
+    </w:p>
+    <w:p>
+      <w:r>
+        <w:t xml:space="preserve">       ROW_NUMBER() OVER (</w:t>
       </w:r>
     </w:p>
     <w:p>
@@ -1837,26 +1218,13 @@
     </w:p>
     <w:p>
       <w:r>
-        <w:t xml:space="preserve">           ORDER BY </w:t>
-      </w:r>
-      <w:proofErr w:type="spellStart"/>
-      <w:r>
-        <w:t>consultation_fee</w:t>
-      </w:r>
-      <w:proofErr w:type="spellEnd"/>
-      <w:r>
-        <w:t xml:space="preserve"> DESC</w:t>
-      </w:r>
-    </w:p>
-    <w:p>
-      <w:r>
-        <w:t xml:space="preserve">       ) AS </w:t>
-      </w:r>
-      <w:proofErr w:type="spellStart"/>
-      <w:r>
-        <w:t>rnk</w:t>
-      </w:r>
-      <w:proofErr w:type="spellEnd"/>
+        <w:t xml:space="preserve">           ORDER BY consultation_fee DESC</w:t>
+      </w:r>
+    </w:p>
+    <w:p>
+      <w:r>
+        <w:t xml:space="preserve">       ) AS rnk</w:t>
+      </w:r>
     </w:p>
     <w:p>
       <w:r>
@@ -1913,67 +1281,36 @@
           <w:b/>
           <w:bCs/>
         </w:rPr>
-        <w:t>14. Display the previous consultation fee for each specialist.</w:t>
-      </w:r>
-    </w:p>
-    <w:p>
-      <w:r>
-        <w:t xml:space="preserve">SELECT </w:t>
-      </w:r>
-      <w:proofErr w:type="spellStart"/>
-      <w:r>
-        <w:t>first_name</w:t>
-      </w:r>
-      <w:proofErr w:type="spellEnd"/>
-      <w:r>
-        <w:t xml:space="preserve">, </w:t>
-      </w:r>
-      <w:proofErr w:type="spellStart"/>
-      <w:r>
-        <w:t>last_name</w:t>
-      </w:r>
-      <w:proofErr w:type="spellEnd"/>
-      <w:r>
-        <w:t xml:space="preserve">, specialization, </w:t>
-      </w:r>
-      <w:proofErr w:type="spellStart"/>
-      <w:r>
-        <w:t>consultation_fee</w:t>
-      </w:r>
-      <w:proofErr w:type="spellEnd"/>
-      <w:r>
-        <w:t>,</w:t>
-      </w:r>
-    </w:p>
-    <w:p>
-      <w:r>
-        <w:t xml:space="preserve">       </w:t>
-      </w:r>
-      <w:proofErr w:type="gramStart"/>
-      <w:r>
-        <w:t>LAG(</w:t>
-      </w:r>
-      <w:proofErr w:type="spellStart"/>
-      <w:proofErr w:type="gramEnd"/>
-      <w:r>
-        <w:t>consultation_fee</w:t>
-      </w:r>
-      <w:proofErr w:type="spellEnd"/>
-      <w:r>
-        <w:t>) OVER (</w:t>
-      </w:r>
-    </w:p>
-    <w:p>
-      <w:r>
-        <w:t xml:space="preserve">           ORDER BY </w:t>
-      </w:r>
-      <w:proofErr w:type="spellStart"/>
-      <w:r>
-        <w:t>consultation_fee</w:t>
-      </w:r>
-      <w:proofErr w:type="spellEnd"/>
-      <w:r>
-        <w:t xml:space="preserve"> DESC</w:t>
+        <w:t>1</w:t>
+      </w:r>
+      <w:r>
+        <w:rPr>
+          <w:b/>
+          <w:bCs/>
+        </w:rPr>
+        <w:t>2</w:t>
+      </w:r>
+      <w:r>
+        <w:rPr>
+          <w:b/>
+          <w:bCs/>
+        </w:rPr>
+        <w:t>. Display the previous consultation fee for each specialist.</w:t>
+      </w:r>
+    </w:p>
+    <w:p>
+      <w:r>
+        <w:t>SELECT first_name, last_name, specialization, consultation_fee,</w:t>
+      </w:r>
+    </w:p>
+    <w:p>
+      <w:r>
+        <w:t xml:space="preserve">       LAG(consultation_fee) OVER (</w:t>
+      </w:r>
+    </w:p>
+    <w:p>
+      <w:r>
+        <w:t xml:space="preserve">           ORDER BY consultation_fee DESC</w:t>
       </w:r>
     </w:p>
     <w:p>
@@ -2035,67 +1372,36 @@
           <w:b/>
           <w:bCs/>
         </w:rPr>
-        <w:t>15. Display the next consultation fee for each specialist.</w:t>
-      </w:r>
-    </w:p>
-    <w:p>
-      <w:r>
-        <w:t xml:space="preserve">SELECT </w:t>
-      </w:r>
-      <w:proofErr w:type="spellStart"/>
-      <w:r>
-        <w:t>first_name</w:t>
-      </w:r>
-      <w:proofErr w:type="spellEnd"/>
-      <w:r>
-        <w:t xml:space="preserve">, </w:t>
-      </w:r>
-      <w:proofErr w:type="spellStart"/>
-      <w:r>
-        <w:t>last_name</w:t>
-      </w:r>
-      <w:proofErr w:type="spellEnd"/>
-      <w:r>
-        <w:t xml:space="preserve">, specialization, </w:t>
-      </w:r>
-      <w:proofErr w:type="spellStart"/>
-      <w:r>
-        <w:t>consultation_fee</w:t>
-      </w:r>
-      <w:proofErr w:type="spellEnd"/>
-      <w:r>
-        <w:t>,</w:t>
-      </w:r>
-    </w:p>
-    <w:p>
-      <w:r>
-        <w:t xml:space="preserve">       </w:t>
-      </w:r>
-      <w:proofErr w:type="gramStart"/>
-      <w:r>
-        <w:t>LEAD(</w:t>
-      </w:r>
-      <w:proofErr w:type="spellStart"/>
-      <w:proofErr w:type="gramEnd"/>
-      <w:r>
-        <w:t>consultation_fee</w:t>
-      </w:r>
-      <w:proofErr w:type="spellEnd"/>
-      <w:r>
-        <w:t>) OVER (</w:t>
-      </w:r>
-    </w:p>
-    <w:p>
-      <w:r>
-        <w:t xml:space="preserve">           ORDER BY </w:t>
-      </w:r>
-      <w:proofErr w:type="spellStart"/>
-      <w:r>
-        <w:t>consultation_fee</w:t>
-      </w:r>
-      <w:proofErr w:type="spellEnd"/>
-      <w:r>
-        <w:t xml:space="preserve"> DESC</w:t>
+        <w:t>1</w:t>
+      </w:r>
+      <w:r>
+        <w:rPr>
+          <w:b/>
+          <w:bCs/>
+        </w:rPr>
+        <w:t>3</w:t>
+      </w:r>
+      <w:r>
+        <w:rPr>
+          <w:b/>
+          <w:bCs/>
+        </w:rPr>
+        <w:t>. Display the next consultation fee for each specialist.</w:t>
+      </w:r>
+    </w:p>
+    <w:p>
+      <w:r>
+        <w:t>SELECT first_name, last_name, specialization, consultation_fee,</w:t>
+      </w:r>
+    </w:p>
+    <w:p>
+      <w:r>
+        <w:t xml:space="preserve">       LEAD(consultation_fee) OVER (</w:t>
+      </w:r>
+    </w:p>
+    <w:p>
+      <w:r>
+        <w:t xml:space="preserve">           ORDER BY consultation_fee DESC</w:t>
       </w:r>
     </w:p>
     <w:p>
@@ -2157,11 +1463,1619 @@
         <w:rPr>
           <w:b/>
           <w:bCs/>
+        </w:rPr>
+      </w:pPr>
+      <w:r>
+        <w:rPr>
+          <w:b/>
+          <w:bCs/>
+        </w:rPr>
+        <w:t>1</w:t>
+      </w:r>
+      <w:r>
+        <w:rPr>
+          <w:b/>
+          <w:bCs/>
+        </w:rPr>
+        <w:t>4</w:t>
+      </w:r>
+      <w:r>
+        <w:rPr>
+          <w:b/>
+          <w:bCs/>
+        </w:rPr>
+        <w:t xml:space="preserve">. </w:t>
+      </w:r>
+      <w:r>
+        <w:rPr>
+          <w:b/>
+          <w:bCs/>
+        </w:rPr>
+        <w:t>How many consultations does each member have on average?</w:t>
+      </w:r>
+    </w:p>
+    <w:p>
+      <w:pPr>
+        <w:spacing w:after="0"/>
+      </w:pPr>
+      <w:r>
+        <w:t xml:space="preserve">SELECT </w:t>
+      </w:r>
+    </w:p>
+    <w:p>
+      <w:pPr>
+        <w:spacing w:after="0"/>
+      </w:pPr>
+      <w:r>
+        <w:t xml:space="preserve">    ROUND(COUNT(c.consultation_id) / COUNT(DISTINCT m.member_id), 2)</w:t>
+      </w:r>
+    </w:p>
+    <w:p>
+      <w:pPr>
+        <w:spacing w:after="0"/>
+      </w:pPr>
+      <w:r>
+        <w:t xml:space="preserve">        AS avg_consultations_per_member</w:t>
+      </w:r>
+    </w:p>
+    <w:p>
+      <w:pPr>
+        <w:spacing w:after="0"/>
+      </w:pPr>
+      <w:r>
+        <w:t>FROM Members m</w:t>
+      </w:r>
+    </w:p>
+    <w:p>
+      <w:pPr>
+        <w:spacing w:after="0"/>
+      </w:pPr>
+      <w:r>
+        <w:t>LEFT JOIN Consultations c</w:t>
+      </w:r>
+    </w:p>
+    <w:p>
+      <w:pPr>
+        <w:spacing w:after="0"/>
+      </w:pPr>
+      <w:r>
+        <w:t xml:space="preserve">    ON m.member_id = c.member_id;</w:t>
+      </w:r>
+    </w:p>
+    <w:p>
+      <w:r>
+        <w:drawing>
+          <wp:inline distT="0" distB="0" distL="0" distR="0" wp14:anchorId="5D13A961" wp14:editId="5655E36D">
+            <wp:extent cx="1848108" cy="543001"/>
+            <wp:effectExtent l="0" t="0" r="0" b="9525"/>
+            <wp:docPr id="11848973" name="Picture 1"/>
+            <wp:cNvGraphicFramePr>
+              <a:graphicFrameLocks xmlns:a="http://schemas.openxmlformats.org/drawingml/2006/main" noChangeAspect="1"/>
+            </wp:cNvGraphicFramePr>
+            <a:graphic xmlns:a="http://schemas.openxmlformats.org/drawingml/2006/main">
+              <a:graphicData uri="http://schemas.openxmlformats.org/drawingml/2006/picture">
+                <pic:pic xmlns:pic="http://schemas.openxmlformats.org/drawingml/2006/picture">
+                  <pic:nvPicPr>
+                    <pic:cNvPr id="11848973" name=""/>
+                    <pic:cNvPicPr/>
+                  </pic:nvPicPr>
+                  <pic:blipFill>
+                    <a:blip r:embed="rId18"/>
+                    <a:stretch>
+                      <a:fillRect/>
+                    </a:stretch>
+                  </pic:blipFill>
+                  <pic:spPr>
+                    <a:xfrm>
+                      <a:off x="0" y="0"/>
+                      <a:ext cx="1848108" cy="543001"/>
+                    </a:xfrm>
+                    <a:prstGeom prst="rect">
+                      <a:avLst/>
+                    </a:prstGeom>
+                  </pic:spPr>
+                </pic:pic>
+              </a:graphicData>
+            </a:graphic>
+          </wp:inline>
+        </w:drawing>
+      </w:r>
+    </w:p>
+    <w:p>
+      <w:pPr>
+        <w:rPr>
+          <w:b/>
+          <w:bCs/>
+        </w:rPr>
+      </w:pPr>
+      <w:r>
+        <w:rPr>
+          <w:b/>
+          <w:bCs/>
+        </w:rPr>
+        <w:t>1</w:t>
+      </w:r>
+      <w:r>
+        <w:rPr>
+          <w:b/>
+          <w:bCs/>
+        </w:rPr>
+        <w:t>5</w:t>
+      </w:r>
+      <w:r>
+        <w:rPr>
+          <w:b/>
+          <w:bCs/>
+        </w:rPr>
+        <w:t xml:space="preserve">. </w:t>
+      </w:r>
+      <w:r>
+        <w:rPr>
+          <w:b/>
+          <w:bCs/>
+        </w:rPr>
+        <w:t>Which reasons for visit are most common?</w:t>
+      </w:r>
+    </w:p>
+    <w:p>
+      <w:pPr>
+        <w:spacing w:after="0"/>
+      </w:pPr>
+      <w:r>
+        <w:t xml:space="preserve">SELECT </w:t>
+      </w:r>
+    </w:p>
+    <w:p>
+      <w:pPr>
+        <w:spacing w:after="0"/>
+      </w:pPr>
+      <w:r>
+        <w:t xml:space="preserve">    reason_for_visit,</w:t>
+      </w:r>
+    </w:p>
+    <w:p>
+      <w:pPr>
+        <w:spacing w:after="0"/>
+      </w:pPr>
+      <w:r>
+        <w:t xml:space="preserve">    COUNT(*) AS consultation_count</w:t>
+      </w:r>
+    </w:p>
+    <w:p>
+      <w:pPr>
+        <w:spacing w:after="0"/>
+      </w:pPr>
+      <w:r>
+        <w:t>FROM Consultations</w:t>
+      </w:r>
+    </w:p>
+    <w:p>
+      <w:pPr>
+        <w:spacing w:after="0"/>
+      </w:pPr>
+      <w:r>
+        <w:t>GROUP BY reason_for_visit</w:t>
+      </w:r>
+    </w:p>
+    <w:p>
+      <w:pPr>
+        <w:spacing w:after="0"/>
+      </w:pPr>
+      <w:r>
+        <w:t>ORDER BY consultation_count DESC;</w:t>
+      </w:r>
+    </w:p>
+    <w:p>
+      <w:pPr>
+        <w:spacing w:after="0"/>
+      </w:pPr>
+      <w:r>
+        <w:drawing>
+          <wp:inline distT="0" distB="0" distL="0" distR="0" wp14:anchorId="762E8B64" wp14:editId="72A678AE">
+            <wp:extent cx="2724530" cy="1095528"/>
+            <wp:effectExtent l="0" t="0" r="0" b="9525"/>
+            <wp:docPr id="1078937980" name="Picture 1"/>
+            <wp:cNvGraphicFramePr>
+              <a:graphicFrameLocks xmlns:a="http://schemas.openxmlformats.org/drawingml/2006/main" noChangeAspect="1"/>
+            </wp:cNvGraphicFramePr>
+            <a:graphic xmlns:a="http://schemas.openxmlformats.org/drawingml/2006/main">
+              <a:graphicData uri="http://schemas.openxmlformats.org/drawingml/2006/picture">
+                <pic:pic xmlns:pic="http://schemas.openxmlformats.org/drawingml/2006/picture">
+                  <pic:nvPicPr>
+                    <pic:cNvPr id="1078937980" name=""/>
+                    <pic:cNvPicPr/>
+                  </pic:nvPicPr>
+                  <pic:blipFill>
+                    <a:blip r:embed="rId19"/>
+                    <a:stretch>
+                      <a:fillRect/>
+                    </a:stretch>
+                  </pic:blipFill>
+                  <pic:spPr>
+                    <a:xfrm>
+                      <a:off x="0" y="0"/>
+                      <a:ext cx="2724530" cy="1095528"/>
+                    </a:xfrm>
+                    <a:prstGeom prst="rect">
+                      <a:avLst/>
+                    </a:prstGeom>
+                  </pic:spPr>
+                </pic:pic>
+              </a:graphicData>
+            </a:graphic>
+          </wp:inline>
+        </w:drawing>
+      </w:r>
+    </w:p>
+    <w:p>
+      <w:pPr>
+        <w:spacing w:after="0"/>
+      </w:pPr>
+    </w:p>
+    <w:p>
+      <w:pPr>
+        <w:spacing w:after="0"/>
+        <w:rPr>
+          <w:b/>
+          <w:bCs/>
+        </w:rPr>
+      </w:pPr>
+      <w:r>
+        <w:rPr>
+          <w:b/>
+          <w:bCs/>
+        </w:rPr>
+        <w:t>1</w:t>
+      </w:r>
+      <w:r>
+        <w:rPr>
+          <w:b/>
+          <w:bCs/>
+        </w:rPr>
+        <w:t>6</w:t>
+      </w:r>
+      <w:r>
+        <w:rPr>
+          <w:b/>
+          <w:bCs/>
+        </w:rPr>
+        <w:t xml:space="preserve">. </w:t>
+      </w:r>
+      <w:r>
+        <w:rPr>
+          <w:b/>
+          <w:bCs/>
+        </w:rPr>
+        <w:t>How many consultations have associated telemedicine sessions?</w:t>
+      </w:r>
+    </w:p>
+    <w:p>
+      <w:pPr>
+        <w:spacing w:after="0"/>
+      </w:pPr>
+      <w:r>
+        <w:t xml:space="preserve">SELECT </w:t>
+      </w:r>
+    </w:p>
+    <w:p>
+      <w:pPr>
+        <w:spacing w:after="0"/>
+      </w:pPr>
+      <w:r>
+        <w:t xml:space="preserve">    COUNT(DISTINCT t.consultation_id) AS consultations_with_telemedicine</w:t>
+      </w:r>
+    </w:p>
+    <w:p>
+      <w:pPr>
+        <w:spacing w:after="0"/>
+      </w:pPr>
+      <w:r>
+        <w:t>FROM Telemedicine_Sessions t;</w:t>
+      </w:r>
+    </w:p>
+    <w:p>
+      <w:pPr>
+        <w:spacing w:after="0"/>
+      </w:pPr>
+      <w:r>
+        <w:drawing>
+          <wp:inline distT="0" distB="0" distL="0" distR="0" wp14:anchorId="191DA92A" wp14:editId="21EF695B">
+            <wp:extent cx="2057687" cy="523948"/>
+            <wp:effectExtent l="0" t="0" r="0" b="9525"/>
+            <wp:docPr id="2005681814" name="Picture 1"/>
+            <wp:cNvGraphicFramePr>
+              <a:graphicFrameLocks xmlns:a="http://schemas.openxmlformats.org/drawingml/2006/main" noChangeAspect="1"/>
+            </wp:cNvGraphicFramePr>
+            <a:graphic xmlns:a="http://schemas.openxmlformats.org/drawingml/2006/main">
+              <a:graphicData uri="http://schemas.openxmlformats.org/drawingml/2006/picture">
+                <pic:pic xmlns:pic="http://schemas.openxmlformats.org/drawingml/2006/picture">
+                  <pic:nvPicPr>
+                    <pic:cNvPr id="2005681814" name=""/>
+                    <pic:cNvPicPr/>
+                  </pic:nvPicPr>
+                  <pic:blipFill>
+                    <a:blip r:embed="rId20"/>
+                    <a:stretch>
+                      <a:fillRect/>
+                    </a:stretch>
+                  </pic:blipFill>
+                  <pic:spPr>
+                    <a:xfrm>
+                      <a:off x="0" y="0"/>
+                      <a:ext cx="2057687" cy="523948"/>
+                    </a:xfrm>
+                    <a:prstGeom prst="rect">
+                      <a:avLst/>
+                    </a:prstGeom>
+                  </pic:spPr>
+                </pic:pic>
+              </a:graphicData>
+            </a:graphic>
+          </wp:inline>
+        </w:drawing>
+      </w:r>
+    </w:p>
+    <w:p>
+      <w:pPr>
+        <w:spacing w:after="0"/>
+      </w:pPr>
+    </w:p>
+    <w:p>
+      <w:pPr>
+        <w:spacing w:after="0"/>
+        <w:rPr>
+          <w:b/>
+          <w:bCs/>
+        </w:rPr>
+      </w:pPr>
+      <w:r>
+        <w:rPr>
+          <w:b/>
+          <w:bCs/>
+        </w:rPr>
+        <w:lastRenderedPageBreak/>
+        <w:t>1</w:t>
+      </w:r>
+      <w:r>
+        <w:rPr>
+          <w:b/>
+          <w:bCs/>
+        </w:rPr>
+        <w:t>7</w:t>
+      </w:r>
+      <w:r>
+        <w:rPr>
+          <w:b/>
+          <w:bCs/>
+        </w:rPr>
+        <w:t xml:space="preserve">. </w:t>
+      </w:r>
+      <w:r>
+        <w:rPr>
+          <w:b/>
+          <w:bCs/>
+        </w:rPr>
+        <w:t>Which chronic conditions have the highest enrollment?</w:t>
+      </w:r>
+    </w:p>
+    <w:p>
+      <w:pPr>
+        <w:spacing w:after="0"/>
+      </w:pPr>
+      <w:r>
+        <w:t xml:space="preserve">SELECT </w:t>
+      </w:r>
+    </w:p>
+    <w:p>
+      <w:pPr>
+        <w:spacing w:after="0"/>
+      </w:pPr>
+      <w:r>
+        <w:t xml:space="preserve">    condition_name,</w:t>
+      </w:r>
+    </w:p>
+    <w:p>
+      <w:pPr>
+        <w:spacing w:after="0"/>
+      </w:pPr>
+      <w:r>
+        <w:t xml:space="preserve">    COUNT(*) AS program_count</w:t>
+      </w:r>
+    </w:p>
+    <w:p>
+      <w:pPr>
+        <w:spacing w:after="0"/>
+      </w:pPr>
+      <w:r>
+        <w:t>FROM Chronic_Care_Programs</w:t>
+      </w:r>
+    </w:p>
+    <w:p>
+      <w:pPr>
+        <w:spacing w:after="0"/>
+      </w:pPr>
+      <w:r>
+        <w:t>GROUP BY condition_name</w:t>
+      </w:r>
+    </w:p>
+    <w:p>
+      <w:pPr>
+        <w:spacing w:after="0"/>
+      </w:pPr>
+      <w:r>
+        <w:t>ORDER BY program_count DESC;</w:t>
+      </w:r>
+    </w:p>
+    <w:p>
+      <w:pPr>
+        <w:spacing w:after="0"/>
+      </w:pPr>
+      <w:r>
+        <w:drawing>
+          <wp:inline distT="0" distB="0" distL="0" distR="0" wp14:anchorId="58E2472A" wp14:editId="7BD104EC">
+            <wp:extent cx="2524477" cy="1105054"/>
+            <wp:effectExtent l="0" t="0" r="9525" b="0"/>
+            <wp:docPr id="1396525500" name="Picture 1"/>
+            <wp:cNvGraphicFramePr>
+              <a:graphicFrameLocks xmlns:a="http://schemas.openxmlformats.org/drawingml/2006/main" noChangeAspect="1"/>
+            </wp:cNvGraphicFramePr>
+            <a:graphic xmlns:a="http://schemas.openxmlformats.org/drawingml/2006/main">
+              <a:graphicData uri="http://schemas.openxmlformats.org/drawingml/2006/picture">
+                <pic:pic xmlns:pic="http://schemas.openxmlformats.org/drawingml/2006/picture">
+                  <pic:nvPicPr>
+                    <pic:cNvPr id="1396525500" name=""/>
+                    <pic:cNvPicPr/>
+                  </pic:nvPicPr>
+                  <pic:blipFill>
+                    <a:blip r:embed="rId21"/>
+                    <a:stretch>
+                      <a:fillRect/>
+                    </a:stretch>
+                  </pic:blipFill>
+                  <pic:spPr>
+                    <a:xfrm>
+                      <a:off x="0" y="0"/>
+                      <a:ext cx="2524477" cy="1105054"/>
+                    </a:xfrm>
+                    <a:prstGeom prst="rect">
+                      <a:avLst/>
+                    </a:prstGeom>
+                  </pic:spPr>
+                </pic:pic>
+              </a:graphicData>
+            </a:graphic>
+          </wp:inline>
+        </w:drawing>
+      </w:r>
+    </w:p>
+    <w:p>
+      <w:pPr>
+        <w:spacing w:after="0"/>
+        <w:rPr>
+          <w:b/>
+          <w:bCs/>
+        </w:rPr>
+      </w:pPr>
+    </w:p>
+    <w:p>
+      <w:pPr>
+        <w:spacing w:after="0"/>
+        <w:rPr>
+          <w:b/>
+          <w:bCs/>
+        </w:rPr>
+      </w:pPr>
+      <w:r>
+        <w:rPr>
+          <w:b/>
+          <w:bCs/>
+        </w:rPr>
+        <w:t>18</w:t>
+      </w:r>
+      <w:r>
+        <w:rPr>
+          <w:b/>
+          <w:bCs/>
+        </w:rPr>
+        <w:t xml:space="preserve">. </w:t>
+      </w:r>
+      <w:r>
+        <w:rPr>
+          <w:b/>
+          <w:bCs/>
+        </w:rPr>
+        <w:t>What is the payment-status distribution of package subscriptions?</w:t>
+      </w:r>
+    </w:p>
+    <w:p>
+      <w:pPr>
+        <w:spacing w:after="0"/>
+      </w:pPr>
+      <w:r>
+        <w:t xml:space="preserve">SELECT </w:t>
+      </w:r>
+    </w:p>
+    <w:p>
+      <w:pPr>
+        <w:spacing w:after="0"/>
+      </w:pPr>
+      <w:r>
+        <w:t xml:space="preserve">    payment_status,</w:t>
+      </w:r>
+    </w:p>
+    <w:p>
+      <w:pPr>
+        <w:spacing w:after="0"/>
+      </w:pPr>
+      <w:r>
+        <w:t xml:space="preserve">    COUNT(*) AS subscription_count</w:t>
+      </w:r>
+    </w:p>
+    <w:p>
+      <w:pPr>
+        <w:spacing w:after="0"/>
+      </w:pPr>
+      <w:r>
+        <w:t>FROM Package_Subscriptions</w:t>
+      </w:r>
+    </w:p>
+    <w:p>
+      <w:pPr>
+        <w:spacing w:after="0"/>
+      </w:pPr>
+      <w:r>
+        <w:t>GROUP BY payment_status</w:t>
+      </w:r>
+    </w:p>
+    <w:p>
+      <w:pPr>
+        <w:spacing w:after="0"/>
+      </w:pPr>
+      <w:r>
+        <w:t>ORDER BY subscription_count DESC;</w:t>
+      </w:r>
+    </w:p>
+    <w:p>
+      <w:pPr>
+        <w:spacing w:after="0"/>
+      </w:pPr>
+      <w:r>
+        <w:drawing>
+          <wp:inline distT="0" distB="0" distL="0" distR="0" wp14:anchorId="68C9F48C" wp14:editId="26B788F6">
+            <wp:extent cx="2381582" cy="762106"/>
+            <wp:effectExtent l="0" t="0" r="0" b="0"/>
+            <wp:docPr id="1505244230" name="Picture 1"/>
+            <wp:cNvGraphicFramePr>
+              <a:graphicFrameLocks xmlns:a="http://schemas.openxmlformats.org/drawingml/2006/main" noChangeAspect="1"/>
+            </wp:cNvGraphicFramePr>
+            <a:graphic xmlns:a="http://schemas.openxmlformats.org/drawingml/2006/main">
+              <a:graphicData uri="http://schemas.openxmlformats.org/drawingml/2006/picture">
+                <pic:pic xmlns:pic="http://schemas.openxmlformats.org/drawingml/2006/picture">
+                  <pic:nvPicPr>
+                    <pic:cNvPr id="1505244230" name=""/>
+                    <pic:cNvPicPr/>
+                  </pic:nvPicPr>
+                  <pic:blipFill>
+                    <a:blip r:embed="rId22"/>
+                    <a:stretch>
+                      <a:fillRect/>
+                    </a:stretch>
+                  </pic:blipFill>
+                  <pic:spPr>
+                    <a:xfrm>
+                      <a:off x="0" y="0"/>
+                      <a:ext cx="2381582" cy="762106"/>
+                    </a:xfrm>
+                    <a:prstGeom prst="rect">
+                      <a:avLst/>
+                    </a:prstGeom>
+                  </pic:spPr>
+                </pic:pic>
+              </a:graphicData>
+            </a:graphic>
+          </wp:inline>
+        </w:drawing>
+      </w:r>
+    </w:p>
+    <w:p>
+      <w:pPr>
+        <w:spacing w:after="0"/>
+      </w:pPr>
+    </w:p>
+    <w:p>
+      <w:pPr>
+        <w:spacing w:after="0"/>
+        <w:rPr>
+          <w:b/>
+          <w:bCs/>
+        </w:rPr>
+      </w:pPr>
+      <w:r>
+        <w:rPr>
+          <w:b/>
+          <w:bCs/>
+        </w:rPr>
+        <w:t>19</w:t>
+      </w:r>
+      <w:r>
+        <w:rPr>
+          <w:b/>
+          <w:bCs/>
+        </w:rPr>
+        <w:t xml:space="preserve">. </w:t>
+      </w:r>
+      <w:r>
+        <w:rPr>
+          <w:b/>
+          <w:bCs/>
+        </w:rPr>
+        <w:t>Which industries have the greatest corporate participation?</w:t>
+      </w:r>
+    </w:p>
+    <w:p>
+      <w:pPr>
+        <w:spacing w:after="0"/>
+      </w:pPr>
+      <w:r>
+        <w:t xml:space="preserve">SELECT </w:t>
+      </w:r>
+    </w:p>
+    <w:p>
+      <w:pPr>
+        <w:spacing w:after="0"/>
+      </w:pPr>
+      <w:r>
+        <w:t xml:space="preserve">    co.industry,</w:t>
+      </w:r>
+    </w:p>
+    <w:p>
+      <w:pPr>
+        <w:spacing w:after="0"/>
+      </w:pPr>
+      <w:r>
+        <w:t xml:space="preserve">    COUNT(DISTINCT co.corporate_id) AS corporate_count,</w:t>
+      </w:r>
+    </w:p>
+    <w:p>
+      <w:pPr>
+        <w:spacing w:after="0"/>
+      </w:pPr>
+      <w:r>
+        <w:t xml:space="preserve">    COUNT(cm.member_id) AS enrolled_members</w:t>
+      </w:r>
+    </w:p>
+    <w:p>
+      <w:pPr>
+        <w:spacing w:after="0"/>
+      </w:pPr>
+      <w:r>
+        <w:t>FROM Corporates co</w:t>
+      </w:r>
+    </w:p>
+    <w:p>
+      <w:pPr>
+        <w:spacing w:after="0"/>
+      </w:pPr>
+      <w:r>
+        <w:t>LEFT JOIN Corporate_Members cm</w:t>
+      </w:r>
+    </w:p>
+    <w:p>
+      <w:pPr>
+        <w:spacing w:after="0"/>
+      </w:pPr>
+      <w:r>
+        <w:t xml:space="preserve">    ON co.corporate_id = cm.corporate_id</w:t>
+      </w:r>
+    </w:p>
+    <w:p>
+      <w:pPr>
+        <w:spacing w:after="0"/>
+      </w:pPr>
+      <w:r>
+        <w:t>GROUP BY co.industry</w:t>
+      </w:r>
+    </w:p>
+    <w:p>
+      <w:pPr>
+        <w:spacing w:after="0"/>
+      </w:pPr>
+      <w:r>
+        <w:t>ORDER BY enrolled_members DESC;</w:t>
+      </w:r>
+    </w:p>
+    <w:p>
+      <w:pPr>
+        <w:spacing w:after="0"/>
+      </w:pPr>
+      <w:r>
+        <w:drawing>
+          <wp:inline distT="0" distB="0" distL="0" distR="0" wp14:anchorId="27D674E0" wp14:editId="694E8672">
+            <wp:extent cx="3943900" cy="1228896"/>
+            <wp:effectExtent l="0" t="0" r="0" b="9525"/>
+            <wp:docPr id="1953571964" name="Picture 1"/>
+            <wp:cNvGraphicFramePr>
+              <a:graphicFrameLocks xmlns:a="http://schemas.openxmlformats.org/drawingml/2006/main" noChangeAspect="1"/>
+            </wp:cNvGraphicFramePr>
+            <a:graphic xmlns:a="http://schemas.openxmlformats.org/drawingml/2006/main">
+              <a:graphicData uri="http://schemas.openxmlformats.org/drawingml/2006/picture">
+                <pic:pic xmlns:pic="http://schemas.openxmlformats.org/drawingml/2006/picture">
+                  <pic:nvPicPr>
+                    <pic:cNvPr id="1953571964" name=""/>
+                    <pic:cNvPicPr/>
+                  </pic:nvPicPr>
+                  <pic:blipFill>
+                    <a:blip r:embed="rId23"/>
+                    <a:stretch>
+                      <a:fillRect/>
+                    </a:stretch>
+                  </pic:blipFill>
+                  <pic:spPr>
+                    <a:xfrm>
+                      <a:off x="0" y="0"/>
+                      <a:ext cx="3943900" cy="1228896"/>
+                    </a:xfrm>
+                    <a:prstGeom prst="rect">
+                      <a:avLst/>
+                    </a:prstGeom>
+                  </pic:spPr>
+                </pic:pic>
+              </a:graphicData>
+            </a:graphic>
+          </wp:inline>
+        </w:drawing>
+      </w:r>
+    </w:p>
+    <w:p>
+      <w:pPr>
+        <w:spacing w:after="0"/>
+        <w:rPr>
+          <w:b/>
+          <w:bCs/>
+        </w:rPr>
+      </w:pPr>
+      <w:r>
+        <w:rPr>
+          <w:b/>
+          <w:bCs/>
+        </w:rPr>
+        <w:lastRenderedPageBreak/>
+        <w:t>2</w:t>
+      </w:r>
+      <w:r>
+        <w:rPr>
+          <w:b/>
+          <w:bCs/>
+        </w:rPr>
+        <w:t>0</w:t>
+      </w:r>
+      <w:r>
+        <w:rPr>
+          <w:b/>
+          <w:bCs/>
+        </w:rPr>
+        <w:t xml:space="preserve">. </w:t>
+      </w:r>
+      <w:r>
+        <w:rPr>
+          <w:b/>
+          <w:bCs/>
+        </w:rPr>
+        <w:t>Which medicines are prescribed most frequently?</w:t>
+      </w:r>
+    </w:p>
+    <w:p>
+      <w:pPr>
+        <w:spacing w:after="0"/>
+      </w:pPr>
+      <w:r>
+        <w:t xml:space="preserve">SELECT </w:t>
+      </w:r>
+    </w:p>
+    <w:p>
+      <w:pPr>
+        <w:spacing w:after="0"/>
+      </w:pPr>
+      <w:r>
+        <w:t xml:space="preserve">    medicine_name,</w:t>
+      </w:r>
+    </w:p>
+    <w:p>
+      <w:pPr>
+        <w:spacing w:after="0"/>
+      </w:pPr>
+      <w:r>
+        <w:t xml:space="preserve">    COUNT(*) AS prescription_count</w:t>
+      </w:r>
+    </w:p>
+    <w:p>
+      <w:pPr>
+        <w:spacing w:after="0"/>
+      </w:pPr>
+      <w:r>
+        <w:t>FROM Prescriptions</w:t>
+      </w:r>
+    </w:p>
+    <w:p>
+      <w:pPr>
+        <w:spacing w:after="0"/>
+      </w:pPr>
+      <w:r>
+        <w:t>GROUP BY medicine_name</w:t>
+      </w:r>
+    </w:p>
+    <w:p>
+      <w:pPr>
+        <w:spacing w:after="0"/>
+      </w:pPr>
+      <w:r>
+        <w:t>ORDER BY prescription_count DESC</w:t>
+      </w:r>
+    </w:p>
+    <w:p>
+      <w:pPr>
+        <w:spacing w:after="0"/>
+      </w:pPr>
+      <w:r>
+        <w:t>LIMIT 10;</w:t>
+      </w:r>
+    </w:p>
+    <w:p>
+      <w:pPr>
+        <w:spacing w:after="0"/>
+      </w:pPr>
+      <w:r>
+        <w:drawing>
+          <wp:inline distT="0" distB="0" distL="0" distR="0" wp14:anchorId="070F5B9E" wp14:editId="733A7EDB">
+            <wp:extent cx="2372056" cy="1009791"/>
+            <wp:effectExtent l="0" t="0" r="9525" b="0"/>
+            <wp:docPr id="1567765329" name="Picture 1"/>
+            <wp:cNvGraphicFramePr>
+              <a:graphicFrameLocks xmlns:a="http://schemas.openxmlformats.org/drawingml/2006/main" noChangeAspect="1"/>
+            </wp:cNvGraphicFramePr>
+            <a:graphic xmlns:a="http://schemas.openxmlformats.org/drawingml/2006/main">
+              <a:graphicData uri="http://schemas.openxmlformats.org/drawingml/2006/picture">
+                <pic:pic xmlns:pic="http://schemas.openxmlformats.org/drawingml/2006/picture">
+                  <pic:nvPicPr>
+                    <pic:cNvPr id="1567765329" name=""/>
+                    <pic:cNvPicPr/>
+                  </pic:nvPicPr>
+                  <pic:blipFill>
+                    <a:blip r:embed="rId24"/>
+                    <a:stretch>
+                      <a:fillRect/>
+                    </a:stretch>
+                  </pic:blipFill>
+                  <pic:spPr>
+                    <a:xfrm>
+                      <a:off x="0" y="0"/>
+                      <a:ext cx="2372056" cy="1009791"/>
+                    </a:xfrm>
+                    <a:prstGeom prst="rect">
+                      <a:avLst/>
+                    </a:prstGeom>
+                  </pic:spPr>
+                </pic:pic>
+              </a:graphicData>
+            </a:graphic>
+          </wp:inline>
+        </w:drawing>
+      </w:r>
+    </w:p>
+    <w:p>
+      <w:pPr>
+        <w:spacing w:after="0"/>
+      </w:pPr>
+    </w:p>
+    <w:p>
+      <w:pPr>
+        <w:spacing w:after="0"/>
+        <w:rPr>
+          <w:b/>
+          <w:bCs/>
+        </w:rPr>
+      </w:pPr>
+      <w:r>
+        <w:rPr>
+          <w:b/>
+          <w:bCs/>
+        </w:rPr>
+        <w:t>2</w:t>
+      </w:r>
+      <w:r>
+        <w:rPr>
+          <w:b/>
+          <w:bCs/>
+        </w:rPr>
+        <w:t>1</w:t>
+      </w:r>
+      <w:r>
+        <w:rPr>
+          <w:b/>
+          <w:bCs/>
+        </w:rPr>
+        <w:t xml:space="preserve">. </w:t>
+      </w:r>
+      <w:r>
+        <w:rPr>
+          <w:b/>
+          <w:bCs/>
+        </w:rPr>
+        <w:t>Which lab tests generate the highest total cost?</w:t>
+      </w:r>
+    </w:p>
+    <w:p>
+      <w:pPr>
+        <w:spacing w:after="0"/>
+      </w:pPr>
+      <w:r>
+        <w:t xml:space="preserve">SELECT </w:t>
+      </w:r>
+    </w:p>
+    <w:p>
+      <w:pPr>
+        <w:spacing w:after="0"/>
+      </w:pPr>
+      <w:r>
+        <w:t xml:space="preserve">    test_name,</w:t>
+      </w:r>
+    </w:p>
+    <w:p>
+      <w:pPr>
+        <w:spacing w:after="0"/>
+      </w:pPr>
+      <w:r>
+        <w:t xml:space="preserve">    COUNT(*) AS test_count,</w:t>
+      </w:r>
+    </w:p>
+    <w:p>
+      <w:pPr>
+        <w:spacing w:after="0"/>
+      </w:pPr>
+      <w:r>
+        <w:t xml:space="preserve">    ROUND(SUM(test_cost), 2) AS total_test_cost</w:t>
+      </w:r>
+    </w:p>
+    <w:p>
+      <w:pPr>
+        <w:spacing w:after="0"/>
+      </w:pPr>
+      <w:r>
+        <w:t>FROM Lab_Tests</w:t>
+      </w:r>
+    </w:p>
+    <w:p>
+      <w:pPr>
+        <w:spacing w:after="0"/>
+      </w:pPr>
+      <w:r>
+        <w:t>GROUP BY test_name</w:t>
+      </w:r>
+    </w:p>
+    <w:p>
+      <w:pPr>
+        <w:spacing w:after="0"/>
+      </w:pPr>
+      <w:r>
+        <w:t>ORDER BY total_test_cost DESC;</w:t>
+      </w:r>
+    </w:p>
+    <w:p>
+      <w:pPr>
+        <w:spacing w:after="0"/>
+      </w:pPr>
+      <w:r>
+        <w:drawing>
+          <wp:inline distT="0" distB="0" distL="0" distR="0" wp14:anchorId="073E68DD" wp14:editId="0049AC6C">
+            <wp:extent cx="3086531" cy="1057423"/>
+            <wp:effectExtent l="0" t="0" r="0" b="9525"/>
+            <wp:docPr id="906547763" name="Picture 1"/>
+            <wp:cNvGraphicFramePr>
+              <a:graphicFrameLocks xmlns:a="http://schemas.openxmlformats.org/drawingml/2006/main" noChangeAspect="1"/>
+            </wp:cNvGraphicFramePr>
+            <a:graphic xmlns:a="http://schemas.openxmlformats.org/drawingml/2006/main">
+              <a:graphicData uri="http://schemas.openxmlformats.org/drawingml/2006/picture">
+                <pic:pic xmlns:pic="http://schemas.openxmlformats.org/drawingml/2006/picture">
+                  <pic:nvPicPr>
+                    <pic:cNvPr id="906547763" name=""/>
+                    <pic:cNvPicPr/>
+                  </pic:nvPicPr>
+                  <pic:blipFill>
+                    <a:blip r:embed="rId25"/>
+                    <a:stretch>
+                      <a:fillRect/>
+                    </a:stretch>
+                  </pic:blipFill>
+                  <pic:spPr>
+                    <a:xfrm>
+                      <a:off x="0" y="0"/>
+                      <a:ext cx="3086531" cy="1057423"/>
+                    </a:xfrm>
+                    <a:prstGeom prst="rect">
+                      <a:avLst/>
+                    </a:prstGeom>
+                  </pic:spPr>
+                </pic:pic>
+              </a:graphicData>
+            </a:graphic>
+          </wp:inline>
+        </w:drawing>
+      </w:r>
+    </w:p>
+    <w:p>
+      <w:pPr>
+        <w:spacing w:after="0"/>
+      </w:pPr>
+    </w:p>
+    <w:p>
+      <w:pPr>
+        <w:spacing w:after="0"/>
+        <w:rPr>
+          <w:b/>
+          <w:bCs/>
+        </w:rPr>
+      </w:pPr>
+      <w:r>
+        <w:rPr>
+          <w:b/>
+          <w:bCs/>
+        </w:rPr>
+        <w:t>2</w:t>
+      </w:r>
+      <w:r>
+        <w:rPr>
+          <w:b/>
+          <w:bCs/>
+        </w:rPr>
+        <w:t>2</w:t>
+      </w:r>
+      <w:r>
+        <w:rPr>
+          <w:b/>
+          <w:bCs/>
+        </w:rPr>
+        <w:t xml:space="preserve">. </w:t>
+      </w:r>
+      <w:r>
+        <w:rPr>
+          <w:b/>
+          <w:bCs/>
+        </w:rPr>
+        <w:t>What is the total and average claim amount?</w:t>
+      </w:r>
+    </w:p>
+    <w:p>
+      <w:pPr>
+        <w:spacing w:after="0"/>
+      </w:pPr>
+      <w:r>
+        <w:t>SELECT</w:t>
+      </w:r>
+    </w:p>
+    <w:p>
+      <w:pPr>
+        <w:spacing w:after="0"/>
+      </w:pPr>
+      <w:r>
+        <w:t xml:space="preserve">    COUNT(*) AS total_claims,</w:t>
+      </w:r>
+    </w:p>
+    <w:p>
+      <w:pPr>
+        <w:spacing w:after="0"/>
+      </w:pPr>
+      <w:r>
+        <w:t xml:space="preserve">    ROUND(SUM(claim_amount), 2) AS total_claim_amount,</w:t>
+      </w:r>
+    </w:p>
+    <w:p>
+      <w:pPr>
+        <w:spacing w:after="0"/>
+      </w:pPr>
+      <w:r>
+        <w:t xml:space="preserve">    ROUND(AVG(claim_amount), 2) AS average_claim_amount</w:t>
+      </w:r>
+    </w:p>
+    <w:p>
+      <w:pPr>
+        <w:spacing w:after="0"/>
+      </w:pPr>
+      <w:r>
+        <w:t>FROM Claims;</w:t>
+      </w:r>
+    </w:p>
+    <w:p>
+      <w:pPr>
+        <w:spacing w:after="0"/>
+      </w:pPr>
+      <w:r>
+        <w:drawing>
+          <wp:inline distT="0" distB="0" distL="0" distR="0" wp14:anchorId="2F720A04" wp14:editId="44F71943">
+            <wp:extent cx="3391373" cy="495369"/>
+            <wp:effectExtent l="0" t="0" r="0" b="0"/>
+            <wp:docPr id="515769026" name="Picture 1"/>
+            <wp:cNvGraphicFramePr>
+              <a:graphicFrameLocks xmlns:a="http://schemas.openxmlformats.org/drawingml/2006/main" noChangeAspect="1"/>
+            </wp:cNvGraphicFramePr>
+            <a:graphic xmlns:a="http://schemas.openxmlformats.org/drawingml/2006/main">
+              <a:graphicData uri="http://schemas.openxmlformats.org/drawingml/2006/picture">
+                <pic:pic xmlns:pic="http://schemas.openxmlformats.org/drawingml/2006/picture">
+                  <pic:nvPicPr>
+                    <pic:cNvPr id="515769026" name=""/>
+                    <pic:cNvPicPr/>
+                  </pic:nvPicPr>
+                  <pic:blipFill>
+                    <a:blip r:embed="rId26"/>
+                    <a:stretch>
+                      <a:fillRect/>
+                    </a:stretch>
+                  </pic:blipFill>
+                  <pic:spPr>
+                    <a:xfrm>
+                      <a:off x="0" y="0"/>
+                      <a:ext cx="3391373" cy="495369"/>
+                    </a:xfrm>
+                    <a:prstGeom prst="rect">
+                      <a:avLst/>
+                    </a:prstGeom>
+                  </pic:spPr>
+                </pic:pic>
+              </a:graphicData>
+            </a:graphic>
+          </wp:inline>
+        </w:drawing>
+      </w:r>
+    </w:p>
+    <w:p>
+      <w:pPr>
+        <w:spacing w:after="0"/>
+        <w:rPr>
+          <w:b/>
+          <w:bCs/>
+        </w:rPr>
+      </w:pPr>
+    </w:p>
+    <w:p>
+      <w:pPr>
+        <w:spacing w:after="0"/>
+        <w:rPr>
+          <w:b/>
+          <w:bCs/>
+        </w:rPr>
+      </w:pPr>
+      <w:r>
+        <w:rPr>
+          <w:b/>
+          <w:bCs/>
+        </w:rPr>
+        <w:t>2</w:t>
+      </w:r>
+      <w:r>
+        <w:rPr>
+          <w:b/>
+          <w:bCs/>
+        </w:rPr>
+        <w:t>3</w:t>
+      </w:r>
+      <w:r>
+        <w:rPr>
+          <w:b/>
+          <w:bCs/>
+        </w:rPr>
+        <w:t xml:space="preserve">. </w:t>
+      </w:r>
+      <w:r>
+        <w:rPr>
+          <w:b/>
+          <w:bCs/>
+        </w:rPr>
+        <w:t>What is the total payment amount by payment status?</w:t>
+      </w:r>
+    </w:p>
+    <w:p>
+      <w:pPr>
+        <w:spacing w:after="0"/>
+      </w:pPr>
+      <w:r>
+        <w:t xml:space="preserve">SELECT </w:t>
+      </w:r>
+    </w:p>
+    <w:p>
+      <w:pPr>
+        <w:spacing w:after="0"/>
+      </w:pPr>
+      <w:r>
+        <w:t xml:space="preserve">    payment_status,</w:t>
+      </w:r>
+    </w:p>
+    <w:p>
+      <w:pPr>
+        <w:spacing w:after="0"/>
+      </w:pPr>
+      <w:r>
+        <w:lastRenderedPageBreak/>
+        <w:t xml:space="preserve">    COUNT(*) AS payment_count,</w:t>
+      </w:r>
+    </w:p>
+    <w:p>
+      <w:pPr>
+        <w:spacing w:after="0"/>
+      </w:pPr>
+      <w:r>
+        <w:t xml:space="preserve">    ROUND(SUM(payment_amount), 2) AS total_payment_amount</w:t>
+      </w:r>
+    </w:p>
+    <w:p>
+      <w:pPr>
+        <w:spacing w:after="0"/>
+      </w:pPr>
+      <w:r>
+        <w:t>FROM Payments</w:t>
+      </w:r>
+    </w:p>
+    <w:p>
+      <w:pPr>
+        <w:spacing w:after="0"/>
+      </w:pPr>
+      <w:r>
+        <w:t>GROUP BY payment_status</w:t>
+      </w:r>
+    </w:p>
+    <w:p>
+      <w:pPr>
+        <w:spacing w:after="0"/>
+      </w:pPr>
+      <w:r>
+        <w:t>ORDER BY total_payment_amount DESC;</w:t>
+      </w:r>
+    </w:p>
+    <w:p>
+      <w:pPr>
+        <w:spacing w:after="0"/>
+      </w:pPr>
+      <w:r>
+        <w:drawing>
+          <wp:inline distT="0" distB="0" distL="0" distR="0" wp14:anchorId="0AC0FA5B" wp14:editId="285120F8">
+            <wp:extent cx="3486637" cy="819264"/>
+            <wp:effectExtent l="0" t="0" r="0" b="0"/>
+            <wp:docPr id="443874836" name="Picture 1"/>
+            <wp:cNvGraphicFramePr>
+              <a:graphicFrameLocks xmlns:a="http://schemas.openxmlformats.org/drawingml/2006/main" noChangeAspect="1"/>
+            </wp:cNvGraphicFramePr>
+            <a:graphic xmlns:a="http://schemas.openxmlformats.org/drawingml/2006/main">
+              <a:graphicData uri="http://schemas.openxmlformats.org/drawingml/2006/picture">
+                <pic:pic xmlns:pic="http://schemas.openxmlformats.org/drawingml/2006/picture">
+                  <pic:nvPicPr>
+                    <pic:cNvPr id="443874836" name=""/>
+                    <pic:cNvPicPr/>
+                  </pic:nvPicPr>
+                  <pic:blipFill>
+                    <a:blip r:embed="rId27"/>
+                    <a:stretch>
+                      <a:fillRect/>
+                    </a:stretch>
+                  </pic:blipFill>
+                  <pic:spPr>
+                    <a:xfrm>
+                      <a:off x="0" y="0"/>
+                      <a:ext cx="3486637" cy="819264"/>
+                    </a:xfrm>
+                    <a:prstGeom prst="rect">
+                      <a:avLst/>
+                    </a:prstGeom>
+                  </pic:spPr>
+                </pic:pic>
+              </a:graphicData>
+            </a:graphic>
+          </wp:inline>
+        </w:drawing>
+      </w:r>
+    </w:p>
+    <w:p>
+      <w:pPr>
+        <w:spacing w:after="0"/>
+      </w:pPr>
+    </w:p>
+    <w:p>
+      <w:pPr>
+        <w:spacing w:after="0"/>
+        <w:rPr>
+          <w:b/>
+          <w:bCs/>
+        </w:rPr>
+      </w:pPr>
+      <w:r>
+        <w:rPr>
+          <w:b/>
+          <w:bCs/>
+        </w:rPr>
+        <w:t>2</w:t>
+      </w:r>
+      <w:r>
+        <w:rPr>
+          <w:b/>
+          <w:bCs/>
+        </w:rPr>
+        <w:t>4</w:t>
+      </w:r>
+      <w:r>
+        <w:rPr>
+          <w:b/>
+          <w:bCs/>
+        </w:rPr>
+        <w:t xml:space="preserve">. </w:t>
+      </w:r>
+      <w:r>
+        <w:rPr>
+          <w:b/>
+          <w:bCs/>
+        </w:rPr>
+        <w:t>What is the average consultation rating?</w:t>
+      </w:r>
+    </w:p>
+    <w:p>
+      <w:pPr>
+        <w:spacing w:after="0"/>
+      </w:pPr>
+      <w:r>
+        <w:t xml:space="preserve">SELECT </w:t>
+      </w:r>
+    </w:p>
+    <w:p>
+      <w:pPr>
+        <w:spacing w:after="0"/>
+      </w:pPr>
+      <w:r>
+        <w:t xml:space="preserve">    ROUND(AVG(rating), 2) AS average_rating</w:t>
+      </w:r>
+    </w:p>
+    <w:p>
+      <w:pPr>
+        <w:spacing w:after="0"/>
+      </w:pPr>
+      <w:r>
+        <w:t>FROM Feedback;</w:t>
+      </w:r>
+    </w:p>
+    <w:p>
+      <w:pPr>
+        <w:spacing w:after="0"/>
+      </w:pPr>
+      <w:r>
+        <w:drawing>
+          <wp:inline distT="0" distB="0" distL="0" distR="0" wp14:anchorId="573E6CE8" wp14:editId="10E4E669">
+            <wp:extent cx="1600423" cy="638264"/>
+            <wp:effectExtent l="0" t="0" r="0" b="9525"/>
+            <wp:docPr id="1305968312" name="Picture 1"/>
+            <wp:cNvGraphicFramePr>
+              <a:graphicFrameLocks xmlns:a="http://schemas.openxmlformats.org/drawingml/2006/main" noChangeAspect="1"/>
+            </wp:cNvGraphicFramePr>
+            <a:graphic xmlns:a="http://schemas.openxmlformats.org/drawingml/2006/main">
+              <a:graphicData uri="http://schemas.openxmlformats.org/drawingml/2006/picture">
+                <pic:pic xmlns:pic="http://schemas.openxmlformats.org/drawingml/2006/picture">
+                  <pic:nvPicPr>
+                    <pic:cNvPr id="1305968312" name=""/>
+                    <pic:cNvPicPr/>
+                  </pic:nvPicPr>
+                  <pic:blipFill>
+                    <a:blip r:embed="rId28"/>
+                    <a:stretch>
+                      <a:fillRect/>
+                    </a:stretch>
+                  </pic:blipFill>
+                  <pic:spPr>
+                    <a:xfrm>
+                      <a:off x="0" y="0"/>
+                      <a:ext cx="1600423" cy="638264"/>
+                    </a:xfrm>
+                    <a:prstGeom prst="rect">
+                      <a:avLst/>
+                    </a:prstGeom>
+                  </pic:spPr>
+                </pic:pic>
+              </a:graphicData>
+            </a:graphic>
+          </wp:inline>
+        </w:drawing>
+      </w:r>
+    </w:p>
+    <w:p>
+      <w:pPr>
+        <w:spacing w:after="0"/>
+      </w:pPr>
+    </w:p>
+    <w:p>
+      <w:pPr>
+        <w:spacing w:after="0"/>
+        <w:rPr>
+          <w:b/>
+          <w:bCs/>
+        </w:rPr>
+      </w:pPr>
+      <w:r>
+        <w:rPr>
+          <w:b/>
+          <w:bCs/>
+        </w:rPr>
+        <w:t>2</w:t>
+      </w:r>
+      <w:r>
+        <w:rPr>
+          <w:b/>
+          <w:bCs/>
+        </w:rPr>
+        <w:t>5</w:t>
+      </w:r>
+      <w:r>
+        <w:rPr>
+          <w:b/>
+          <w:bCs/>
+        </w:rPr>
+        <w:t xml:space="preserve">. </w:t>
+      </w:r>
+      <w:r>
+        <w:rPr>
+          <w:b/>
+          <w:bCs/>
+        </w:rPr>
+        <w:t>How many staff members work in each clinic?</w:t>
+      </w:r>
+    </w:p>
+    <w:p>
+      <w:pPr>
+        <w:spacing w:after="0"/>
+      </w:pPr>
+      <w:r>
+        <w:t xml:space="preserve">SELECT </w:t>
+      </w:r>
+    </w:p>
+    <w:p>
+      <w:pPr>
+        <w:spacing w:after="0"/>
+      </w:pPr>
+      <w:r>
+        <w:t xml:space="preserve">    cl.clinic_name,</w:t>
+      </w:r>
+    </w:p>
+    <w:p>
+      <w:pPr>
+        <w:spacing w:after="0"/>
+      </w:pPr>
+      <w:r>
+        <w:t xml:space="preserve">    COUNT(s.staff_id) AS staff_count</w:t>
+      </w:r>
+    </w:p>
+    <w:p>
+      <w:pPr>
+        <w:spacing w:after="0"/>
+      </w:pPr>
+      <w:r>
+        <w:t>FROM Clinics cl</w:t>
+      </w:r>
+    </w:p>
+    <w:p>
+      <w:pPr>
+        <w:spacing w:after="0"/>
+      </w:pPr>
+      <w:r>
+        <w:t>LEFT JOIN Staff s</w:t>
+      </w:r>
+    </w:p>
+    <w:p>
+      <w:pPr>
+        <w:spacing w:after="0"/>
+      </w:pPr>
+      <w:r>
+        <w:t xml:space="preserve">    ON cl.clinic_id = s.clinic_id</w:t>
+      </w:r>
+    </w:p>
+    <w:p>
+      <w:pPr>
+        <w:spacing w:after="0"/>
+      </w:pPr>
+      <w:r>
+        <w:t>GROUP BY cl.clinic_name</w:t>
+      </w:r>
+    </w:p>
+    <w:p>
+      <w:pPr>
+        <w:spacing w:after="0"/>
+      </w:pPr>
+      <w:r>
+        <w:t>ORDER BY staff_count DESC;</w:t>
+      </w:r>
+    </w:p>
+    <w:p>
+      <w:pPr>
+        <w:spacing w:after="0"/>
+      </w:pPr>
+      <w:r>
+        <w:drawing>
+          <wp:inline distT="0" distB="0" distL="0" distR="0" wp14:anchorId="3100BA41" wp14:editId="03F61719">
+            <wp:extent cx="3305636" cy="1057423"/>
+            <wp:effectExtent l="0" t="0" r="0" b="9525"/>
+            <wp:docPr id="469889071" name="Picture 1"/>
+            <wp:cNvGraphicFramePr>
+              <a:graphicFrameLocks xmlns:a="http://schemas.openxmlformats.org/drawingml/2006/main" noChangeAspect="1"/>
+            </wp:cNvGraphicFramePr>
+            <a:graphic xmlns:a="http://schemas.openxmlformats.org/drawingml/2006/main">
+              <a:graphicData uri="http://schemas.openxmlformats.org/drawingml/2006/picture">
+                <pic:pic xmlns:pic="http://schemas.openxmlformats.org/drawingml/2006/picture">
+                  <pic:nvPicPr>
+                    <pic:cNvPr id="469889071" name=""/>
+                    <pic:cNvPicPr/>
+                  </pic:nvPicPr>
+                  <pic:blipFill>
+                    <a:blip r:embed="rId29"/>
+                    <a:stretch>
+                      <a:fillRect/>
+                    </a:stretch>
+                  </pic:blipFill>
+                  <pic:spPr>
+                    <a:xfrm>
+                      <a:off x="0" y="0"/>
+                      <a:ext cx="3305636" cy="1057423"/>
+                    </a:xfrm>
+                    <a:prstGeom prst="rect">
+                      <a:avLst/>
+                    </a:prstGeom>
+                  </pic:spPr>
+                </pic:pic>
+              </a:graphicData>
+            </a:graphic>
+          </wp:inline>
+        </w:drawing>
+      </w:r>
+    </w:p>
+    <w:p>
+      <w:pPr>
+        <w:spacing w:after="0"/>
+      </w:pPr>
+    </w:p>
+    <w:p>
+      <w:pPr>
+        <w:spacing w:after="0"/>
+      </w:pPr>
+    </w:p>
+    <w:p>
+      <w:pPr>
+        <w:spacing w:after="0"/>
+      </w:pPr>
+    </w:p>
+    <w:p>
+      <w:pPr>
+        <w:spacing w:after="0"/>
+      </w:pPr>
+    </w:p>
+    <w:p>
+      <w:pPr>
+        <w:spacing w:after="0"/>
+      </w:pPr>
+    </w:p>
+    <w:p>
+      <w:pPr>
+        <w:spacing w:after="0"/>
+      </w:pPr>
+    </w:p>
+    <w:p>
+      <w:pPr>
+        <w:spacing w:after="0"/>
+      </w:pPr>
+    </w:p>
+    <w:p>
+      <w:pPr>
+        <w:spacing w:after="0"/>
+      </w:pPr>
+    </w:p>
+    <w:p>
+      <w:pPr>
+        <w:rPr>
+          <w:b/>
+          <w:bCs/>
           <w:sz w:val="28"/>
           <w:szCs w:val="28"/>
         </w:rPr>
       </w:pPr>
-      <w:proofErr w:type="gramStart"/>
       <w:r>
         <w:rPr>
           <w:b/>
@@ -2169,6 +3083,7 @@
           <w:sz w:val="28"/>
           <w:szCs w:val="28"/>
         </w:rPr>
+        <w:lastRenderedPageBreak/>
         <w:t>KPI</w:t>
       </w:r>
       <w:r>
@@ -2180,7 +3095,6 @@
         </w:rPr>
         <w:t xml:space="preserve"> :</w:t>
       </w:r>
-      <w:proofErr w:type="gramEnd"/>
     </w:p>
     <w:p>
       <w:pPr>
@@ -2200,26 +3114,8 @@
     </w:p>
     <w:p>
       <w:r>
-        <w:t xml:space="preserve">SELECT </w:t>
-      </w:r>
-      <w:proofErr w:type="gramStart"/>
-      <w:r>
-        <w:t>SUM(</w:t>
-      </w:r>
-      <w:proofErr w:type="spellStart"/>
-      <w:proofErr w:type="gramEnd"/>
-      <w:r>
-        <w:t>total_amount</w:t>
-      </w:r>
-      <w:proofErr w:type="spellEnd"/>
-      <w:r>
-        <w:t xml:space="preserve">) AS </w:t>
-      </w:r>
-      <w:proofErr w:type="spellStart"/>
-      <w:r>
-        <w:t>Total_Revenue</w:t>
-      </w:r>
-      <w:proofErr w:type="spellEnd"/>
+        <w:t>SELECT SUM(total_amount) AS Total_Revenue</w:t>
+      </w:r>
     </w:p>
     <w:p>
       <w:r>
@@ -2247,7 +3143,7 @@
                     <pic:cNvPicPr/>
                   </pic:nvPicPr>
                   <pic:blipFill>
-                    <a:blip r:embed="rId18"/>
+                    <a:blip r:embed="rId30"/>
                     <a:stretch>
                       <a:fillRect/>
                     </a:stretch>
@@ -2287,21 +3183,8 @@
     </w:p>
     <w:p>
       <w:r>
-        <w:t xml:space="preserve">SELECT </w:t>
-      </w:r>
-      <w:proofErr w:type="gramStart"/>
-      <w:r>
-        <w:t>COUNT(</w:t>
-      </w:r>
-      <w:proofErr w:type="gramEnd"/>
-      <w:r>
-        <w:t xml:space="preserve">*) AS </w:t>
-      </w:r>
-      <w:proofErr w:type="spellStart"/>
-      <w:r>
-        <w:t>Total_no_of_Specialists</w:t>
-      </w:r>
-      <w:proofErr w:type="spellEnd"/>
+        <w:t>SELECT COUNT(*) AS Total_no_of_Specialists</w:t>
+      </w:r>
     </w:p>
     <w:p>
       <w:r>
@@ -2329,7 +3212,7 @@
                     <pic:cNvPicPr/>
                   </pic:nvPicPr>
                   <pic:blipFill>
-                    <a:blip r:embed="rId19"/>
+                    <a:blip r:embed="rId31"/>
                     <a:stretch>
                       <a:fillRect/>
                     </a:stretch>
@@ -2350,18 +3233,263 @@
         </w:drawing>
       </w:r>
     </w:p>
-    <w:p/>
-    <w:p/>
-    <w:p/>
-    <w:p>
-      <w:pPr>
-        <w:rPr>
-          <w:b/>
-          <w:bCs/>
-          <w:sz w:val="28"/>
-          <w:szCs w:val="28"/>
-        </w:rPr>
-      </w:pPr>
+    <w:p>
+      <w:pPr>
+        <w:pStyle w:val="ListParagraph"/>
+        <w:numPr>
+          <w:ilvl w:val="0"/>
+          <w:numId w:val="2"/>
+        </w:numPr>
+        <w:rPr>
+          <w:b/>
+          <w:bCs/>
+        </w:rPr>
+      </w:pPr>
+      <w:r>
+        <w:rPr>
+          <w:b/>
+          <w:bCs/>
+        </w:rPr>
+        <w:t>What is the total number of members</w:t>
+      </w:r>
+      <w:r>
+        <w:rPr>
+          <w:b/>
+          <w:bCs/>
+        </w:rPr>
+        <w:t>?</w:t>
+      </w:r>
+    </w:p>
+    <w:p>
+      <w:pPr>
+        <w:pStyle w:val="ListParagraph"/>
+      </w:pPr>
+      <w:r>
+        <w:t>SELECT COUNT(*) AS Total_Members</w:t>
+      </w:r>
+    </w:p>
+    <w:p>
+      <w:pPr>
+        <w:pStyle w:val="ListParagraph"/>
+      </w:pPr>
+      <w:r>
+        <w:t>FROM Members;</w:t>
+      </w:r>
+    </w:p>
+    <w:p>
+      <w:pPr>
+        <w:pStyle w:val="ListParagraph"/>
+      </w:pPr>
+      <w:r>
+        <w:drawing>
+          <wp:inline distT="0" distB="0" distL="0" distR="0" wp14:anchorId="00D7C38C" wp14:editId="70757DEA">
+            <wp:extent cx="1657581" cy="543001"/>
+            <wp:effectExtent l="0" t="0" r="0" b="9525"/>
+            <wp:docPr id="1368330277" name="Picture 1"/>
+            <wp:cNvGraphicFramePr>
+              <a:graphicFrameLocks xmlns:a="http://schemas.openxmlformats.org/drawingml/2006/main" noChangeAspect="1"/>
+            </wp:cNvGraphicFramePr>
+            <a:graphic xmlns:a="http://schemas.openxmlformats.org/drawingml/2006/main">
+              <a:graphicData uri="http://schemas.openxmlformats.org/drawingml/2006/picture">
+                <pic:pic xmlns:pic="http://schemas.openxmlformats.org/drawingml/2006/picture">
+                  <pic:nvPicPr>
+                    <pic:cNvPr id="1368330277" name=""/>
+                    <pic:cNvPicPr/>
+                  </pic:nvPicPr>
+                  <pic:blipFill>
+                    <a:blip r:embed="rId32"/>
+                    <a:stretch>
+                      <a:fillRect/>
+                    </a:stretch>
+                  </pic:blipFill>
+                  <pic:spPr>
+                    <a:xfrm>
+                      <a:off x="0" y="0"/>
+                      <a:ext cx="1657581" cy="543001"/>
+                    </a:xfrm>
+                    <a:prstGeom prst="rect">
+                      <a:avLst/>
+                    </a:prstGeom>
+                  </pic:spPr>
+                </pic:pic>
+              </a:graphicData>
+            </a:graphic>
+          </wp:inline>
+        </w:drawing>
+      </w:r>
+    </w:p>
+    <w:p>
+      <w:pPr>
+        <w:pStyle w:val="ListParagraph"/>
+      </w:pPr>
+    </w:p>
+    <w:p>
+      <w:pPr>
+        <w:pStyle w:val="ListParagraph"/>
+        <w:numPr>
+          <w:ilvl w:val="0"/>
+          <w:numId w:val="2"/>
+        </w:numPr>
+        <w:rPr>
+          <w:b/>
+          <w:bCs/>
+        </w:rPr>
+      </w:pPr>
+      <w:r>
+        <w:rPr>
+          <w:b/>
+          <w:bCs/>
+        </w:rPr>
+        <w:t>What is the average bill value</w:t>
+      </w:r>
+      <w:r>
+        <w:rPr>
+          <w:b/>
+          <w:bCs/>
+        </w:rPr>
+        <w:t>?</w:t>
+      </w:r>
+    </w:p>
+    <w:p>
+      <w:pPr>
+        <w:pStyle w:val="ListParagraph"/>
+      </w:pPr>
+      <w:r>
+        <w:t>SELECT ROUND(AVG(total_amount), 2) AS Average_Bill_Value</w:t>
+      </w:r>
+    </w:p>
+    <w:p>
+      <w:pPr>
+        <w:pStyle w:val="ListParagraph"/>
+      </w:pPr>
+      <w:r>
+        <w:t>FROM Billing;</w:t>
+      </w:r>
+    </w:p>
+    <w:p>
+      <w:pPr>
+        <w:pStyle w:val="ListParagraph"/>
+      </w:pPr>
+      <w:r>
+        <w:drawing>
+          <wp:inline distT="0" distB="0" distL="0" distR="0" wp14:anchorId="6D04DEBD" wp14:editId="6EE1EC92">
+            <wp:extent cx="1419423" cy="581106"/>
+            <wp:effectExtent l="0" t="0" r="9525" b="9525"/>
+            <wp:docPr id="1993203852" name="Picture 1"/>
+            <wp:cNvGraphicFramePr>
+              <a:graphicFrameLocks xmlns:a="http://schemas.openxmlformats.org/drawingml/2006/main" noChangeAspect="1"/>
+            </wp:cNvGraphicFramePr>
+            <a:graphic xmlns:a="http://schemas.openxmlformats.org/drawingml/2006/main">
+              <a:graphicData uri="http://schemas.openxmlformats.org/drawingml/2006/picture">
+                <pic:pic xmlns:pic="http://schemas.openxmlformats.org/drawingml/2006/picture">
+                  <pic:nvPicPr>
+                    <pic:cNvPr id="1993203852" name=""/>
+                    <pic:cNvPicPr/>
+                  </pic:nvPicPr>
+                  <pic:blipFill>
+                    <a:blip r:embed="rId33"/>
+                    <a:stretch>
+                      <a:fillRect/>
+                    </a:stretch>
+                  </pic:blipFill>
+                  <pic:spPr>
+                    <a:xfrm>
+                      <a:off x="0" y="0"/>
+                      <a:ext cx="1419423" cy="581106"/>
+                    </a:xfrm>
+                    <a:prstGeom prst="rect">
+                      <a:avLst/>
+                    </a:prstGeom>
+                  </pic:spPr>
+                </pic:pic>
+              </a:graphicData>
+            </a:graphic>
+          </wp:inline>
+        </w:drawing>
+      </w:r>
+    </w:p>
+    <w:p>
+      <w:pPr>
+        <w:pStyle w:val="ListParagraph"/>
+      </w:pPr>
+    </w:p>
+    <w:p>
+      <w:pPr>
+        <w:pStyle w:val="ListParagraph"/>
+        <w:numPr>
+          <w:ilvl w:val="0"/>
+          <w:numId w:val="2"/>
+        </w:numPr>
+        <w:rPr>
+          <w:b/>
+          <w:bCs/>
+        </w:rPr>
+      </w:pPr>
+      <w:r>
+        <w:rPr>
+          <w:b/>
+          <w:bCs/>
+        </w:rPr>
+        <w:t>How many consultations are there?</w:t>
+      </w:r>
+    </w:p>
+    <w:p>
+      <w:pPr>
+        <w:pStyle w:val="ListParagraph"/>
+      </w:pPr>
+      <w:r>
+        <w:t>SELECT COUNT(*) AS Total_Consultations</w:t>
+      </w:r>
+    </w:p>
+    <w:p>
+      <w:pPr>
+        <w:pStyle w:val="ListParagraph"/>
+      </w:pPr>
+      <w:r>
+        <w:t>FROM Consultations;</w:t>
+      </w:r>
+    </w:p>
+    <w:p>
+      <w:pPr>
+        <w:pStyle w:val="ListParagraph"/>
+      </w:pPr>
+      <w:r>
+        <w:drawing>
+          <wp:inline distT="0" distB="0" distL="0" distR="0" wp14:anchorId="519637AE" wp14:editId="0AE2F431">
+            <wp:extent cx="1400370" cy="409632"/>
+            <wp:effectExtent l="0" t="0" r="9525" b="9525"/>
+            <wp:docPr id="1150413530" name="Picture 1"/>
+            <wp:cNvGraphicFramePr>
+              <a:graphicFrameLocks xmlns:a="http://schemas.openxmlformats.org/drawingml/2006/main" noChangeAspect="1"/>
+            </wp:cNvGraphicFramePr>
+            <a:graphic xmlns:a="http://schemas.openxmlformats.org/drawingml/2006/main">
+              <a:graphicData uri="http://schemas.openxmlformats.org/drawingml/2006/picture">
+                <pic:pic xmlns:pic="http://schemas.openxmlformats.org/drawingml/2006/picture">
+                  <pic:nvPicPr>
+                    <pic:cNvPr id="1150413530" name=""/>
+                    <pic:cNvPicPr/>
+                  </pic:nvPicPr>
+                  <pic:blipFill>
+                    <a:blip r:embed="rId34"/>
+                    <a:stretch>
+                      <a:fillRect/>
+                    </a:stretch>
+                  </pic:blipFill>
+                  <pic:spPr>
+                    <a:xfrm>
+                      <a:off x="0" y="0"/>
+                      <a:ext cx="1400370" cy="409632"/>
+                    </a:xfrm>
+                    <a:prstGeom prst="rect">
+                      <a:avLst/>
+                    </a:prstGeom>
+                  </pic:spPr>
+                </pic:pic>
+              </a:graphicData>
+            </a:graphic>
+          </wp:inline>
+        </w:drawing>
+      </w:r>
     </w:p>
     <w:sectPr>
       <w:pgSz w:w="11906" w:h="16838"/>
@@ -3018,7 +4146,6 @@
     <w:next w:val="Normal"/>
     <w:link w:val="Heading3Char"/>
     <w:uiPriority w:val="9"/>
-    <w:semiHidden/>
     <w:unhideWhenUsed/>
     <w:qFormat/>
     <w:rsid w:val="007E088F"/>
@@ -3170,7 +4297,6 @@
   <w:style w:type="character" w:default="1" w:styleId="DefaultParagraphFont">
     <w:name w:val="Default Paragraph Font"/>
     <w:uiPriority w:val="1"/>
-    <w:semiHidden/>
     <w:unhideWhenUsed/>
   </w:style>
   <w:style w:type="table" w:default="1" w:styleId="TableNormal">
@@ -3226,7 +4352,6 @@
     <w:basedOn w:val="DefaultParagraphFont"/>
     <w:link w:val="Heading3"/>
     <w:uiPriority w:val="9"/>
-    <w:semiHidden/>
     <w:rsid w:val="007E088F"/>
     <w:rPr>
       <w:rFonts w:eastAsiaTheme="majorEastAsia" w:cstheme="majorBidi"/>

</xml_diff>